<commit_message>
backup: save current project state before multi-node ganache work
</commit_message>
<xml_diff>
--- a/docs/核心智能合约代码与接口说明.docx
+++ b/docs/核心智能合约代码与接口说明.docx
@@ -4939,2230 +4939,2151 @@
         </w:rPr>
         <w:t>----------------------------------------</w:t>
       </w:r>
+    </w:p>
+    <w:p>
+      <w:pPr>
+        <w:rPr>
+          <w:rFonts w:hint="eastAsia" w:ascii="微软雅黑" w:hAnsi="微软雅黑" w:eastAsia="微软雅黑" w:cs="微软雅黑"/>
+          <w:color w:val="auto"/>
+          <w:sz w:val="24"/>
+          <w:szCs w:val="24"/>
+        </w:rPr>
+      </w:pPr>
+    </w:p>
+    <w:p>
+      <w:pPr>
+        <w:pStyle w:val="4"/>
+        <w:rPr>
+          <w:rFonts w:hint="eastAsia" w:ascii="微软雅黑" w:hAnsi="微软雅黑" w:eastAsia="微软雅黑" w:cs="微软雅黑"/>
+          <w:color w:val="auto"/>
+          <w:sz w:val="24"/>
+          <w:szCs w:val="24"/>
+        </w:rPr>
+      </w:pPr>
+      <w:r>
+        <w:rPr>
+          <w:rFonts w:hint="eastAsia" w:ascii="微软雅黑" w:hAnsi="微软雅黑" w:eastAsia="微软雅黑" w:cs="微软雅黑"/>
+          <w:color w:val="auto"/>
+          <w:sz w:val="24"/>
+          <w:szCs w:val="24"/>
+        </w:rPr>
+        <w:t>7. 业务接口映射</w:t>
+      </w:r>
+    </w:p>
+    <w:p>
+      <w:pPr>
+        <w:rPr>
+          <w:rFonts w:hint="eastAsia" w:ascii="微软雅黑" w:hAnsi="微软雅黑" w:eastAsia="微软雅黑" w:cs="微软雅黑"/>
+          <w:color w:val="auto"/>
+          <w:sz w:val="24"/>
+          <w:szCs w:val="24"/>
+        </w:rPr>
+      </w:pPr>
+    </w:p>
+    <w:p>
+      <w:pPr>
+        <w:pStyle w:val="5"/>
+        <w:rPr>
+          <w:rFonts w:hint="eastAsia" w:ascii="微软雅黑" w:hAnsi="微软雅黑" w:eastAsia="微软雅黑" w:cs="微软雅黑"/>
+          <w:color w:val="auto"/>
+          <w:sz w:val="24"/>
+          <w:szCs w:val="24"/>
+        </w:rPr>
+      </w:pPr>
+      <w:r>
+        <w:rPr>
+          <w:rFonts w:hint="eastAsia" w:ascii="微软雅黑" w:hAnsi="微软雅黑" w:eastAsia="微软雅黑" w:cs="微软雅黑"/>
+          <w:color w:val="auto"/>
+          <w:sz w:val="24"/>
+          <w:szCs w:val="24"/>
+        </w:rPr>
+        <w:t>7.1 创建健康记录</w:t>
+      </w:r>
+    </w:p>
+    <w:p>
+      <w:pPr>
+        <w:rPr>
+          <w:rFonts w:hint="eastAsia" w:ascii="微软雅黑" w:hAnsi="微软雅黑" w:eastAsia="微软雅黑" w:cs="微软雅黑"/>
+          <w:color w:val="auto"/>
+          <w:sz w:val="24"/>
+          <w:szCs w:val="24"/>
+        </w:rPr>
+      </w:pPr>
+      <w:r>
+        <w:rPr>
+          <w:rFonts w:hint="eastAsia" w:ascii="微软雅黑" w:hAnsi="微软雅黑" w:eastAsia="微软雅黑" w:cs="微软雅黑"/>
+          <w:color w:val="auto"/>
+          <w:sz w:val="24"/>
+          <w:szCs w:val="24"/>
+        </w:rPr>
+        <w:t>业务接口：</w:t>
+      </w:r>
+    </w:p>
+    <w:p>
+      <w:pPr>
+        <w:rPr>
+          <w:rFonts w:hint="eastAsia" w:ascii="微软雅黑" w:hAnsi="微软雅黑" w:eastAsia="微软雅黑" w:cs="微软雅黑"/>
+          <w:color w:val="auto"/>
+          <w:sz w:val="24"/>
+          <w:szCs w:val="24"/>
+        </w:rPr>
+      </w:pPr>
+    </w:p>
+    <w:p>
+      <w:pPr>
+        <w:rPr>
+          <w:rFonts w:hint="eastAsia" w:ascii="微软雅黑" w:hAnsi="微软雅黑" w:eastAsia="微软雅黑" w:cs="微软雅黑"/>
+          <w:color w:val="auto"/>
+          <w:sz w:val="24"/>
+          <w:szCs w:val="24"/>
+        </w:rPr>
+      </w:pPr>
+      <w:r>
+        <w:rPr>
+          <w:rFonts w:hint="eastAsia" w:ascii="微软雅黑" w:hAnsi="微软雅黑" w:eastAsia="微软雅黑" w:cs="微软雅黑"/>
+          <w:color w:val="auto"/>
+          <w:sz w:val="24"/>
+          <w:szCs w:val="24"/>
+        </w:rPr>
+        <w:t>`POST /api/health/records`</w:t>
+      </w:r>
+    </w:p>
+    <w:p>
+      <w:pPr>
+        <w:rPr>
+          <w:rFonts w:hint="eastAsia" w:ascii="微软雅黑" w:hAnsi="微软雅黑" w:eastAsia="微软雅黑" w:cs="微软雅黑"/>
+          <w:color w:val="auto"/>
+          <w:sz w:val="24"/>
+          <w:szCs w:val="24"/>
+        </w:rPr>
+      </w:pPr>
+    </w:p>
+    <w:p>
+      <w:pPr>
+        <w:rPr>
+          <w:rFonts w:hint="eastAsia" w:ascii="微软雅黑" w:hAnsi="微软雅黑" w:eastAsia="微软雅黑" w:cs="微软雅黑"/>
+          <w:color w:val="auto"/>
+          <w:sz w:val="24"/>
+          <w:szCs w:val="24"/>
+        </w:rPr>
+      </w:pPr>
+      <w:r>
+        <w:rPr>
+          <w:rFonts w:hint="eastAsia" w:ascii="微软雅黑" w:hAnsi="微软雅黑" w:eastAsia="微软雅黑" w:cs="微软雅黑"/>
+          <w:color w:val="auto"/>
+          <w:sz w:val="24"/>
+          <w:szCs w:val="24"/>
+        </w:rPr>
+        <w:t>链上动作：</w:t>
+      </w:r>
+    </w:p>
+    <w:p>
+      <w:pPr>
+        <w:pStyle w:val="16"/>
+        <w:rPr>
+          <w:rFonts w:hint="eastAsia" w:ascii="微软雅黑" w:hAnsi="微软雅黑" w:eastAsia="微软雅黑" w:cs="微软雅黑"/>
+          <w:color w:val="auto"/>
+          <w:sz w:val="24"/>
+          <w:szCs w:val="24"/>
+        </w:rPr>
+      </w:pPr>
+      <w:r>
+        <w:rPr>
+          <w:rFonts w:hint="eastAsia" w:ascii="微软雅黑" w:hAnsi="微软雅黑" w:eastAsia="微软雅黑" w:cs="微软雅黑"/>
+          <w:color w:val="auto"/>
+          <w:sz w:val="24"/>
+          <w:szCs w:val="24"/>
+        </w:rPr>
+        <w:t>计算当前记录摘要；</w:t>
+      </w:r>
+    </w:p>
+    <w:p>
+      <w:pPr>
+        <w:pStyle w:val="16"/>
+        <w:rPr>
+          <w:rFonts w:hint="eastAsia" w:ascii="微软雅黑" w:hAnsi="微软雅黑" w:eastAsia="微软雅黑" w:cs="微软雅黑"/>
+          <w:color w:val="auto"/>
+          <w:sz w:val="24"/>
+          <w:szCs w:val="24"/>
+        </w:rPr>
+      </w:pPr>
+      <w:r>
+        <w:rPr>
+          <w:rFonts w:hint="eastAsia" w:ascii="微软雅黑" w:hAnsi="微软雅黑" w:eastAsia="微软雅黑" w:cs="微软雅黑"/>
+          <w:color w:val="auto"/>
+          <w:sz w:val="24"/>
+          <w:szCs w:val="24"/>
+        </w:rPr>
+        <w:t>若区块链服务可用，则调用 `storeHealthData`；</w:t>
+      </w:r>
+    </w:p>
+    <w:p>
+      <w:pPr>
+        <w:pStyle w:val="16"/>
+        <w:rPr>
+          <w:rFonts w:hint="eastAsia" w:ascii="微软雅黑" w:hAnsi="微软雅黑" w:eastAsia="微软雅黑" w:cs="微软雅黑"/>
+          <w:color w:val="auto"/>
+          <w:sz w:val="24"/>
+          <w:szCs w:val="24"/>
+        </w:rPr>
+      </w:pPr>
+      <w:r>
+        <w:rPr>
+          <w:rFonts w:hint="eastAsia" w:ascii="微软雅黑" w:hAnsi="微软雅黑" w:eastAsia="微软雅黑" w:cs="微软雅黑"/>
+          <w:color w:val="auto"/>
+          <w:sz w:val="24"/>
+          <w:szCs w:val="24"/>
+        </w:rPr>
+        <w:t>若区块链服务不可用，则允许上传成功，并返回上链告警。</w:t>
+      </w:r>
+    </w:p>
+    <w:p>
+      <w:pPr>
+        <w:rPr>
+          <w:rFonts w:hint="eastAsia" w:ascii="微软雅黑" w:hAnsi="微软雅黑" w:eastAsia="微软雅黑" w:cs="微软雅黑"/>
+          <w:color w:val="auto"/>
+          <w:sz w:val="24"/>
+          <w:szCs w:val="24"/>
+        </w:rPr>
+      </w:pPr>
+    </w:p>
+    <w:p>
+      <w:pPr>
+        <w:rPr>
+          <w:rFonts w:hint="eastAsia" w:ascii="微软雅黑" w:hAnsi="微软雅黑" w:eastAsia="微软雅黑" w:cs="微软雅黑"/>
+          <w:color w:val="auto"/>
+          <w:sz w:val="24"/>
+          <w:szCs w:val="24"/>
+        </w:rPr>
+      </w:pPr>
+      <w:r>
+        <w:rPr>
+          <w:rFonts w:hint="eastAsia" w:ascii="微软雅黑" w:hAnsi="微软雅黑" w:eastAsia="微软雅黑" w:cs="微软雅黑"/>
+          <w:color w:val="auto"/>
+          <w:sz w:val="24"/>
+          <w:szCs w:val="24"/>
+        </w:rPr>
+        <w:t>关键返回字段：</w:t>
+      </w:r>
+    </w:p>
+    <w:p>
+      <w:pPr>
+        <w:pStyle w:val="16"/>
+        <w:rPr>
+          <w:rFonts w:hint="eastAsia" w:ascii="微软雅黑" w:hAnsi="微软雅黑" w:eastAsia="微软雅黑" w:cs="微软雅黑"/>
+          <w:color w:val="auto"/>
+          <w:sz w:val="24"/>
+          <w:szCs w:val="24"/>
+        </w:rPr>
+      </w:pPr>
+      <w:r>
+        <w:rPr>
+          <w:rFonts w:hint="eastAsia" w:ascii="微软雅黑" w:hAnsi="微软雅黑" w:eastAsia="微软雅黑" w:cs="微软雅黑"/>
+          <w:color w:val="auto"/>
+          <w:sz w:val="24"/>
+          <w:szCs w:val="24"/>
+        </w:rPr>
+        <w:t>`onchain_data_id`</w:t>
+      </w:r>
+    </w:p>
+    <w:p>
+      <w:pPr>
+        <w:pStyle w:val="16"/>
+        <w:rPr>
+          <w:rFonts w:hint="eastAsia" w:ascii="微软雅黑" w:hAnsi="微软雅黑" w:eastAsia="微软雅黑" w:cs="微软雅黑"/>
+          <w:color w:val="auto"/>
+          <w:sz w:val="24"/>
+          <w:szCs w:val="24"/>
+        </w:rPr>
+      </w:pPr>
+      <w:r>
+        <w:rPr>
+          <w:rFonts w:hint="eastAsia" w:ascii="微软雅黑" w:hAnsi="微软雅黑" w:eastAsia="微软雅黑" w:cs="微软雅黑"/>
+          <w:color w:val="auto"/>
+          <w:sz w:val="24"/>
+          <w:szCs w:val="24"/>
+        </w:rPr>
+        <w:t>`onchain_tx_hash`</w:t>
+      </w:r>
+    </w:p>
+    <w:p>
+      <w:pPr>
+        <w:pStyle w:val="16"/>
+        <w:rPr>
+          <w:rFonts w:hint="eastAsia" w:ascii="微软雅黑" w:hAnsi="微软雅黑" w:eastAsia="微软雅黑" w:cs="微软雅黑"/>
+          <w:color w:val="auto"/>
+          <w:sz w:val="24"/>
+          <w:szCs w:val="24"/>
+        </w:rPr>
+      </w:pPr>
+      <w:r>
+        <w:rPr>
+          <w:rFonts w:hint="eastAsia" w:ascii="微软雅黑" w:hAnsi="微软雅黑" w:eastAsia="微软雅黑" w:cs="微软雅黑"/>
+          <w:color w:val="auto"/>
+          <w:sz w:val="24"/>
+          <w:szCs w:val="24"/>
+        </w:rPr>
+        <w:t>`onchain_warning`</w:t>
+      </w:r>
+    </w:p>
+    <w:p>
+      <w:pPr>
+        <w:pStyle w:val="16"/>
+        <w:rPr>
+          <w:rFonts w:hint="eastAsia" w:ascii="微软雅黑" w:hAnsi="微软雅黑" w:eastAsia="微软雅黑" w:cs="微软雅黑"/>
+          <w:color w:val="auto"/>
+          <w:sz w:val="24"/>
+          <w:szCs w:val="24"/>
+        </w:rPr>
+      </w:pPr>
+      <w:r>
+        <w:rPr>
+          <w:rFonts w:hint="eastAsia" w:ascii="微软雅黑" w:hAnsi="微软雅黑" w:eastAsia="微软雅黑" w:cs="微软雅黑"/>
+          <w:color w:val="auto"/>
+          <w:sz w:val="24"/>
+          <w:szCs w:val="24"/>
+        </w:rPr>
+        <w:t>`onchain_verification_status`</w:t>
+      </w:r>
+    </w:p>
+    <w:p>
+      <w:pPr>
+        <w:pStyle w:val="16"/>
+        <w:rPr>
+          <w:rFonts w:hint="eastAsia" w:ascii="微软雅黑" w:hAnsi="微软雅黑" w:eastAsia="微软雅黑" w:cs="微软雅黑"/>
+          <w:color w:val="auto"/>
+          <w:sz w:val="24"/>
+          <w:szCs w:val="24"/>
+        </w:rPr>
+      </w:pPr>
+      <w:r>
+        <w:rPr>
+          <w:rFonts w:hint="eastAsia" w:ascii="微软雅黑" w:hAnsi="微软雅黑" w:eastAsia="微软雅黑" w:cs="微软雅黑"/>
+          <w:color w:val="auto"/>
+          <w:sz w:val="24"/>
+          <w:szCs w:val="24"/>
+        </w:rPr>
+        <w:t>`onchain_verification_message`</w:t>
+      </w:r>
+    </w:p>
+    <w:p>
+      <w:pPr>
+        <w:rPr>
+          <w:rFonts w:hint="eastAsia" w:ascii="微软雅黑" w:hAnsi="微软雅黑" w:eastAsia="微软雅黑" w:cs="微软雅黑"/>
+          <w:color w:val="auto"/>
+          <w:sz w:val="24"/>
+          <w:szCs w:val="24"/>
+        </w:rPr>
+      </w:pPr>
+    </w:p>
+    <w:p>
+      <w:pPr>
+        <w:pStyle w:val="5"/>
+        <w:rPr>
+          <w:rFonts w:hint="eastAsia" w:ascii="微软雅黑" w:hAnsi="微软雅黑" w:eastAsia="微软雅黑" w:cs="微软雅黑"/>
+          <w:color w:val="auto"/>
+          <w:sz w:val="24"/>
+          <w:szCs w:val="24"/>
+        </w:rPr>
+      </w:pPr>
+      <w:r>
+        <w:rPr>
+          <w:rFonts w:hint="eastAsia" w:ascii="微软雅黑" w:hAnsi="微软雅黑" w:eastAsia="微软雅黑" w:cs="微软雅黑"/>
+          <w:color w:val="auto"/>
+          <w:sz w:val="24"/>
+          <w:szCs w:val="24"/>
+        </w:rPr>
+        <w:t>7.2 更新健康记录</w:t>
+      </w:r>
+    </w:p>
+    <w:p>
+      <w:pPr>
+        <w:rPr>
+          <w:rFonts w:hint="eastAsia" w:ascii="微软雅黑" w:hAnsi="微软雅黑" w:eastAsia="微软雅黑" w:cs="微软雅黑"/>
+          <w:color w:val="auto"/>
+          <w:sz w:val="24"/>
+          <w:szCs w:val="24"/>
+        </w:rPr>
+      </w:pPr>
+      <w:r>
+        <w:rPr>
+          <w:rFonts w:hint="eastAsia" w:ascii="微软雅黑" w:hAnsi="微软雅黑" w:eastAsia="微软雅黑" w:cs="微软雅黑"/>
+          <w:color w:val="auto"/>
+          <w:sz w:val="24"/>
+          <w:szCs w:val="24"/>
+        </w:rPr>
+        <w:t>业务接口：</w:t>
+      </w:r>
+    </w:p>
+    <w:p>
+      <w:pPr>
+        <w:rPr>
+          <w:rFonts w:hint="eastAsia" w:ascii="微软雅黑" w:hAnsi="微软雅黑" w:eastAsia="微软雅黑" w:cs="微软雅黑"/>
+          <w:color w:val="auto"/>
+          <w:sz w:val="24"/>
+          <w:szCs w:val="24"/>
+        </w:rPr>
+      </w:pPr>
+    </w:p>
+    <w:p>
+      <w:pPr>
+        <w:rPr>
+          <w:rFonts w:hint="eastAsia" w:ascii="微软雅黑" w:hAnsi="微软雅黑" w:eastAsia="微软雅黑" w:cs="微软雅黑"/>
+          <w:color w:val="auto"/>
+          <w:sz w:val="24"/>
+          <w:szCs w:val="24"/>
+        </w:rPr>
+      </w:pPr>
+      <w:r>
+        <w:rPr>
+          <w:rFonts w:hint="eastAsia" w:ascii="微软雅黑" w:hAnsi="微软雅黑" w:eastAsia="微软雅黑" w:cs="微软雅黑"/>
+          <w:color w:val="auto"/>
+          <w:sz w:val="24"/>
+          <w:szCs w:val="24"/>
+        </w:rPr>
+        <w:t>`PUT /api/health/records/{record_id}`</w:t>
+      </w:r>
+    </w:p>
+    <w:p>
+      <w:pPr>
+        <w:rPr>
+          <w:rFonts w:hint="eastAsia" w:ascii="微软雅黑" w:hAnsi="微软雅黑" w:eastAsia="微软雅黑" w:cs="微软雅黑"/>
+          <w:color w:val="auto"/>
+          <w:sz w:val="24"/>
+          <w:szCs w:val="24"/>
+        </w:rPr>
+      </w:pPr>
+    </w:p>
+    <w:p>
+      <w:pPr>
+        <w:rPr>
+          <w:rFonts w:hint="eastAsia" w:ascii="微软雅黑" w:hAnsi="微软雅黑" w:eastAsia="微软雅黑" w:cs="微软雅黑"/>
+          <w:color w:val="auto"/>
+          <w:sz w:val="24"/>
+          <w:szCs w:val="24"/>
+        </w:rPr>
+      </w:pPr>
+      <w:r>
+        <w:rPr>
+          <w:rFonts w:hint="eastAsia" w:ascii="微软雅黑" w:hAnsi="微软雅黑" w:eastAsia="微软雅黑" w:cs="微软雅黑"/>
+          <w:color w:val="auto"/>
+          <w:sz w:val="24"/>
+          <w:szCs w:val="24"/>
+        </w:rPr>
+        <w:t>链上动作：</w:t>
+      </w:r>
+    </w:p>
+    <w:p>
+      <w:pPr>
+        <w:pStyle w:val="16"/>
+        <w:rPr>
+          <w:rFonts w:hint="eastAsia" w:ascii="微软雅黑" w:hAnsi="微软雅黑" w:eastAsia="微软雅黑" w:cs="微软雅黑"/>
+          <w:color w:val="auto"/>
+          <w:sz w:val="24"/>
+          <w:szCs w:val="24"/>
+        </w:rPr>
+      </w:pPr>
+      <w:r>
+        <w:rPr>
+          <w:rFonts w:hint="eastAsia" w:ascii="微软雅黑" w:hAnsi="微软雅黑" w:eastAsia="微软雅黑" w:cs="微软雅黑"/>
+          <w:color w:val="auto"/>
+          <w:sz w:val="24"/>
+          <w:szCs w:val="24"/>
+        </w:rPr>
+        <w:t>若已有 `onchain_data_id`，则调用 `updateHealthData`；</w:t>
+      </w:r>
+    </w:p>
+    <w:p>
+      <w:pPr>
+        <w:pStyle w:val="16"/>
+        <w:rPr>
+          <w:rFonts w:hint="eastAsia" w:ascii="微软雅黑" w:hAnsi="微软雅黑" w:eastAsia="微软雅黑" w:cs="微软雅黑"/>
+          <w:color w:val="auto"/>
+          <w:sz w:val="24"/>
+          <w:szCs w:val="24"/>
+        </w:rPr>
+      </w:pPr>
+      <w:r>
+        <w:rPr>
+          <w:rFonts w:hint="eastAsia" w:ascii="微软雅黑" w:hAnsi="微软雅黑" w:eastAsia="微软雅黑" w:cs="微软雅黑"/>
+          <w:color w:val="auto"/>
+          <w:sz w:val="24"/>
+          <w:szCs w:val="24"/>
+        </w:rPr>
+        <w:t>若没有 `onchain_data_id`，则在链服务可用时尝试新建存证；</w:t>
+      </w:r>
+    </w:p>
+    <w:p>
+      <w:pPr>
+        <w:pStyle w:val="16"/>
+        <w:rPr>
+          <w:rFonts w:hint="eastAsia" w:ascii="微软雅黑" w:hAnsi="微软雅黑" w:eastAsia="微软雅黑" w:cs="微软雅黑"/>
+          <w:color w:val="auto"/>
+          <w:sz w:val="24"/>
+          <w:szCs w:val="24"/>
+        </w:rPr>
+      </w:pPr>
+      <w:r>
+        <w:rPr>
+          <w:rFonts w:hint="eastAsia" w:ascii="微软雅黑" w:hAnsi="微软雅黑" w:eastAsia="微软雅黑" w:cs="微软雅黑"/>
+          <w:color w:val="auto"/>
+          <w:sz w:val="24"/>
+          <w:szCs w:val="24"/>
+        </w:rPr>
+        <w:t>链服务不可用时不阻断业务更新。</w:t>
+      </w:r>
+    </w:p>
+    <w:p>
+      <w:pPr>
+        <w:rPr>
+          <w:rFonts w:hint="eastAsia" w:ascii="微软雅黑" w:hAnsi="微软雅黑" w:eastAsia="微软雅黑" w:cs="微软雅黑"/>
+          <w:color w:val="auto"/>
+          <w:sz w:val="24"/>
+          <w:szCs w:val="24"/>
+        </w:rPr>
+      </w:pPr>
+    </w:p>
+    <w:p>
+      <w:pPr>
+        <w:pStyle w:val="5"/>
+        <w:rPr>
+          <w:rFonts w:hint="eastAsia" w:ascii="微软雅黑" w:hAnsi="微软雅黑" w:eastAsia="微软雅黑" w:cs="微软雅黑"/>
+          <w:color w:val="auto"/>
+          <w:sz w:val="24"/>
+          <w:szCs w:val="24"/>
+        </w:rPr>
+      </w:pPr>
+      <w:r>
+        <w:rPr>
+          <w:rFonts w:hint="eastAsia" w:ascii="微软雅黑" w:hAnsi="微软雅黑" w:eastAsia="微软雅黑" w:cs="微软雅黑"/>
+          <w:color w:val="auto"/>
+          <w:sz w:val="24"/>
+          <w:szCs w:val="24"/>
+        </w:rPr>
+        <w:t>7.3 查询与验真</w:t>
+      </w:r>
+    </w:p>
+    <w:p>
+      <w:pPr>
+        <w:rPr>
+          <w:rFonts w:hint="eastAsia" w:ascii="微软雅黑" w:hAnsi="微软雅黑" w:eastAsia="微软雅黑" w:cs="微软雅黑"/>
+          <w:color w:val="auto"/>
+          <w:sz w:val="24"/>
+          <w:szCs w:val="24"/>
+        </w:rPr>
+      </w:pPr>
+      <w:r>
+        <w:rPr>
+          <w:rFonts w:hint="eastAsia" w:ascii="微软雅黑" w:hAnsi="微软雅黑" w:eastAsia="微软雅黑" w:cs="微软雅黑"/>
+          <w:color w:val="auto"/>
+          <w:sz w:val="24"/>
+          <w:szCs w:val="24"/>
+        </w:rPr>
+        <w:t>业务接口：</w:t>
+      </w:r>
+    </w:p>
+    <w:p>
+      <w:pPr>
+        <w:rPr>
+          <w:rFonts w:hint="eastAsia" w:ascii="微软雅黑" w:hAnsi="微软雅黑" w:eastAsia="微软雅黑" w:cs="微软雅黑"/>
+          <w:color w:val="auto"/>
+          <w:sz w:val="24"/>
+          <w:szCs w:val="24"/>
+        </w:rPr>
+      </w:pPr>
+    </w:p>
+    <w:p>
+      <w:pPr>
+        <w:rPr>
+          <w:rFonts w:hint="eastAsia" w:ascii="微软雅黑" w:hAnsi="微软雅黑" w:eastAsia="微软雅黑" w:cs="微软雅黑"/>
+          <w:color w:val="auto"/>
+          <w:sz w:val="24"/>
+          <w:szCs w:val="24"/>
+        </w:rPr>
+      </w:pPr>
+      <w:r>
+        <w:rPr>
+          <w:rFonts w:hint="eastAsia" w:ascii="微软雅黑" w:hAnsi="微软雅黑" w:eastAsia="微软雅黑" w:cs="微软雅黑"/>
+          <w:color w:val="auto"/>
+          <w:sz w:val="24"/>
+          <w:szCs w:val="24"/>
+        </w:rPr>
+        <w:t>`GET /api/health/records`</w:t>
+      </w:r>
+    </w:p>
+    <w:p>
+      <w:pPr>
+        <w:rPr>
+          <w:rFonts w:hint="eastAsia" w:ascii="微软雅黑" w:hAnsi="微软雅黑" w:eastAsia="微软雅黑" w:cs="微软雅黑"/>
+          <w:color w:val="auto"/>
+          <w:sz w:val="24"/>
+          <w:szCs w:val="24"/>
+        </w:rPr>
+      </w:pPr>
+    </w:p>
+    <w:p>
+      <w:pPr>
+        <w:rPr>
+          <w:rFonts w:hint="eastAsia" w:ascii="微软雅黑" w:hAnsi="微软雅黑" w:eastAsia="微软雅黑" w:cs="微软雅黑"/>
+          <w:color w:val="auto"/>
+          <w:sz w:val="24"/>
+          <w:szCs w:val="24"/>
+        </w:rPr>
+      </w:pPr>
+      <w:r>
+        <w:rPr>
+          <w:rFonts w:hint="eastAsia" w:ascii="微软雅黑" w:hAnsi="微软雅黑" w:eastAsia="微软雅黑" w:cs="微软雅黑"/>
+          <w:color w:val="auto"/>
+          <w:sz w:val="24"/>
+          <w:szCs w:val="24"/>
+        </w:rPr>
+        <w:t>`GET /api/health/records/{record_id}`</w:t>
+      </w:r>
+    </w:p>
+    <w:p>
+      <w:pPr>
+        <w:rPr>
+          <w:rFonts w:hint="eastAsia" w:ascii="微软雅黑" w:hAnsi="微软雅黑" w:eastAsia="微软雅黑" w:cs="微软雅黑"/>
+          <w:color w:val="auto"/>
+          <w:sz w:val="24"/>
+          <w:szCs w:val="24"/>
+        </w:rPr>
+      </w:pPr>
+    </w:p>
+    <w:p>
+      <w:pPr>
+        <w:rPr>
+          <w:rFonts w:hint="eastAsia" w:ascii="微软雅黑" w:hAnsi="微软雅黑" w:eastAsia="微软雅黑" w:cs="微软雅黑"/>
+          <w:color w:val="auto"/>
+          <w:sz w:val="24"/>
+          <w:szCs w:val="24"/>
+        </w:rPr>
+      </w:pPr>
+      <w:r>
+        <w:rPr>
+          <w:rFonts w:hint="eastAsia" w:ascii="微软雅黑" w:hAnsi="微软雅黑" w:eastAsia="微软雅黑" w:cs="微软雅黑"/>
+          <w:color w:val="auto"/>
+          <w:sz w:val="24"/>
+          <w:szCs w:val="24"/>
+        </w:rPr>
+        <w:t>链上动作：</w:t>
+      </w:r>
+    </w:p>
+    <w:p>
+      <w:pPr>
+        <w:pStyle w:val="16"/>
+        <w:rPr>
+          <w:rFonts w:hint="eastAsia" w:ascii="微软雅黑" w:hAnsi="微软雅黑" w:eastAsia="微软雅黑" w:cs="微软雅黑"/>
+          <w:color w:val="auto"/>
+          <w:sz w:val="24"/>
+          <w:szCs w:val="24"/>
+        </w:rPr>
+      </w:pPr>
+      <w:r>
+        <w:rPr>
+          <w:rFonts w:hint="eastAsia" w:ascii="微软雅黑" w:hAnsi="微软雅黑" w:eastAsia="微软雅黑" w:cs="微软雅黑"/>
+          <w:color w:val="auto"/>
+          <w:sz w:val="24"/>
+          <w:szCs w:val="24"/>
+        </w:rPr>
+        <w:t>若链服务可用且记录存在 `onchain_data_id`，查询链上记录；</w:t>
+      </w:r>
+    </w:p>
+    <w:p>
+      <w:pPr>
+        <w:pStyle w:val="16"/>
+        <w:rPr>
+          <w:rFonts w:hint="eastAsia" w:ascii="微软雅黑" w:hAnsi="微软雅黑" w:eastAsia="微软雅黑" w:cs="微软雅黑"/>
+          <w:color w:val="auto"/>
+          <w:sz w:val="24"/>
+          <w:szCs w:val="24"/>
+        </w:rPr>
+      </w:pPr>
+      <w:r>
+        <w:rPr>
+          <w:rFonts w:hint="eastAsia" w:ascii="微软雅黑" w:hAnsi="微软雅黑" w:eastAsia="微软雅黑" w:cs="微软雅黑"/>
+          <w:color w:val="auto"/>
+          <w:sz w:val="24"/>
+          <w:szCs w:val="24"/>
+        </w:rPr>
+        <w:t>重新计算当前数据摘要；</w:t>
+      </w:r>
+    </w:p>
+    <w:p>
+      <w:pPr>
+        <w:pStyle w:val="16"/>
+        <w:rPr>
+          <w:rFonts w:hint="eastAsia" w:ascii="微软雅黑" w:hAnsi="微软雅黑" w:eastAsia="微软雅黑" w:cs="微软雅黑"/>
+          <w:color w:val="auto"/>
+          <w:sz w:val="24"/>
+          <w:szCs w:val="24"/>
+        </w:rPr>
+      </w:pPr>
+      <w:r>
+        <w:rPr>
+          <w:rFonts w:hint="eastAsia" w:ascii="微软雅黑" w:hAnsi="微软雅黑" w:eastAsia="微软雅黑" w:cs="微软雅黑"/>
+          <w:color w:val="auto"/>
+          <w:sz w:val="24"/>
+          <w:szCs w:val="24"/>
+        </w:rPr>
+        <w:t>对比链上哈希与当前摘要；</w:t>
+      </w:r>
+    </w:p>
+    <w:p>
+      <w:pPr>
+        <w:pStyle w:val="16"/>
+        <w:rPr>
+          <w:rFonts w:hint="eastAsia" w:ascii="微软雅黑" w:hAnsi="微软雅黑" w:eastAsia="微软雅黑" w:cs="微软雅黑"/>
+          <w:color w:val="auto"/>
+          <w:sz w:val="24"/>
+          <w:szCs w:val="24"/>
+        </w:rPr>
+      </w:pPr>
+      <w:r>
+        <w:rPr>
+          <w:rFonts w:hint="eastAsia" w:ascii="微软雅黑" w:hAnsi="微软雅黑" w:eastAsia="微软雅黑" w:cs="微软雅黑"/>
+          <w:color w:val="auto"/>
+          <w:sz w:val="24"/>
+          <w:szCs w:val="24"/>
+        </w:rPr>
+        <w:t>返回验真状态。</w:t>
+      </w:r>
+    </w:p>
+    <w:p>
+      <w:pPr>
+        <w:rPr>
+          <w:rFonts w:hint="eastAsia" w:ascii="微软雅黑" w:hAnsi="微软雅黑" w:eastAsia="微软雅黑" w:cs="微软雅黑"/>
+          <w:color w:val="auto"/>
+          <w:sz w:val="24"/>
+          <w:szCs w:val="24"/>
+        </w:rPr>
+      </w:pPr>
+    </w:p>
+    <w:p>
+      <w:pPr>
+        <w:rPr>
+          <w:rFonts w:hint="eastAsia" w:ascii="微软雅黑" w:hAnsi="微软雅黑" w:eastAsia="微软雅黑" w:cs="微软雅黑"/>
+          <w:color w:val="auto"/>
+          <w:sz w:val="24"/>
+          <w:szCs w:val="24"/>
+        </w:rPr>
+      </w:pPr>
+      <w:r>
+        <w:rPr>
+          <w:rFonts w:hint="eastAsia" w:ascii="微软雅黑" w:hAnsi="微软雅黑" w:eastAsia="微软雅黑" w:cs="微软雅黑"/>
+          <w:color w:val="auto"/>
+          <w:sz w:val="24"/>
+          <w:szCs w:val="24"/>
+        </w:rPr>
+        <w:t>----------------------------------------</w:t>
+      </w:r>
+    </w:p>
+    <w:p>
+      <w:pPr>
+        <w:rPr>
+          <w:rFonts w:hint="eastAsia" w:ascii="微软雅黑" w:hAnsi="微软雅黑" w:eastAsia="微软雅黑" w:cs="微软雅黑"/>
+          <w:color w:val="auto"/>
+          <w:sz w:val="24"/>
+          <w:szCs w:val="24"/>
+        </w:rPr>
+      </w:pPr>
+    </w:p>
+    <w:p>
+      <w:pPr>
+        <w:pStyle w:val="4"/>
+        <w:rPr>
+          <w:rFonts w:hint="eastAsia" w:ascii="微软雅黑" w:hAnsi="微软雅黑" w:eastAsia="微软雅黑" w:cs="微软雅黑"/>
+          <w:color w:val="auto"/>
+          <w:sz w:val="24"/>
+          <w:szCs w:val="24"/>
+        </w:rPr>
+      </w:pPr>
+      <w:r>
+        <w:rPr>
+          <w:rFonts w:hint="eastAsia" w:ascii="微软雅黑" w:hAnsi="微软雅黑" w:eastAsia="微软雅黑" w:cs="微软雅黑"/>
+          <w:color w:val="auto"/>
+          <w:sz w:val="24"/>
+          <w:szCs w:val="24"/>
+        </w:rPr>
+        <w:t>8. 验真状态说明</w:t>
+      </w:r>
+    </w:p>
+    <w:p>
+      <w:pPr>
+        <w:rPr>
+          <w:rFonts w:hint="eastAsia" w:ascii="微软雅黑" w:hAnsi="微软雅黑" w:eastAsia="微软雅黑" w:cs="微软雅黑"/>
+          <w:color w:val="auto"/>
+          <w:sz w:val="24"/>
+          <w:szCs w:val="24"/>
+        </w:rPr>
+      </w:pPr>
+    </w:p>
+    <w:p>
+      <w:pPr>
+        <w:pStyle w:val="5"/>
+        <w:rPr>
+          <w:rFonts w:hint="eastAsia" w:ascii="微软雅黑" w:hAnsi="微软雅黑" w:eastAsia="微软雅黑" w:cs="微软雅黑"/>
+          <w:color w:val="auto"/>
+          <w:sz w:val="24"/>
+          <w:szCs w:val="24"/>
+        </w:rPr>
+      </w:pPr>
+      <w:r>
+        <w:rPr>
+          <w:rFonts w:hint="eastAsia" w:ascii="微软雅黑" w:hAnsi="微软雅黑" w:eastAsia="微软雅黑" w:cs="微软雅黑"/>
+          <w:color w:val="auto"/>
+          <w:sz w:val="24"/>
+          <w:szCs w:val="24"/>
+        </w:rPr>
+        <w:t>8.1 verified</w:t>
+      </w:r>
+    </w:p>
+    <w:p>
+      <w:pPr>
+        <w:rPr>
+          <w:rFonts w:hint="eastAsia" w:ascii="微软雅黑" w:hAnsi="微软雅黑" w:eastAsia="微软雅黑" w:cs="微软雅黑"/>
+          <w:color w:val="auto"/>
+          <w:sz w:val="24"/>
+          <w:szCs w:val="24"/>
+        </w:rPr>
+      </w:pPr>
+      <w:r>
+        <w:rPr>
+          <w:rFonts w:hint="eastAsia" w:ascii="微软雅黑" w:hAnsi="微软雅黑" w:eastAsia="微软雅黑" w:cs="微软雅黑"/>
+          <w:color w:val="auto"/>
+          <w:sz w:val="24"/>
+          <w:szCs w:val="24"/>
+        </w:rPr>
+        <w:t>含义：</w:t>
+      </w:r>
+    </w:p>
+    <w:p>
+      <w:pPr>
+        <w:pStyle w:val="16"/>
+        <w:rPr>
+          <w:rFonts w:hint="eastAsia" w:ascii="微软雅黑" w:hAnsi="微软雅黑" w:eastAsia="微软雅黑" w:cs="微软雅黑"/>
+          <w:color w:val="auto"/>
+          <w:sz w:val="24"/>
+          <w:szCs w:val="24"/>
+        </w:rPr>
+      </w:pPr>
+      <w:r>
+        <w:rPr>
+          <w:rFonts w:hint="eastAsia" w:ascii="微软雅黑" w:hAnsi="微软雅黑" w:eastAsia="微软雅黑" w:cs="微软雅黑"/>
+          <w:color w:val="auto"/>
+          <w:sz w:val="24"/>
+          <w:szCs w:val="24"/>
+        </w:rPr>
+        <w:t>链上哈希与当前业务数据摘要一致；</w:t>
+      </w:r>
+    </w:p>
+    <w:p>
+      <w:pPr>
+        <w:pStyle w:val="16"/>
+        <w:rPr>
+          <w:rFonts w:hint="eastAsia" w:ascii="微软雅黑" w:hAnsi="微软雅黑" w:eastAsia="微软雅黑" w:cs="微软雅黑"/>
+          <w:color w:val="auto"/>
+          <w:sz w:val="24"/>
+          <w:szCs w:val="24"/>
+        </w:rPr>
+      </w:pPr>
+      <w:r>
+        <w:rPr>
+          <w:rFonts w:hint="eastAsia" w:ascii="微软雅黑" w:hAnsi="微软雅黑" w:eastAsia="微软雅黑" w:cs="微软雅黑"/>
+          <w:color w:val="auto"/>
+          <w:sz w:val="24"/>
+          <w:szCs w:val="24"/>
+        </w:rPr>
+        <w:t>说明当前记录与链上存证匹配。</w:t>
+      </w:r>
+    </w:p>
+    <w:p>
+      <w:pPr>
+        <w:rPr>
+          <w:rFonts w:hint="eastAsia" w:ascii="微软雅黑" w:hAnsi="微软雅黑" w:eastAsia="微软雅黑" w:cs="微软雅黑"/>
+          <w:color w:val="auto"/>
+          <w:sz w:val="24"/>
+          <w:szCs w:val="24"/>
+        </w:rPr>
+      </w:pPr>
+    </w:p>
+    <w:p>
+      <w:pPr>
+        <w:pStyle w:val="5"/>
+        <w:rPr>
+          <w:rFonts w:hint="eastAsia" w:ascii="微软雅黑" w:hAnsi="微软雅黑" w:eastAsia="微软雅黑" w:cs="微软雅黑"/>
+          <w:color w:val="auto"/>
+          <w:sz w:val="24"/>
+          <w:szCs w:val="24"/>
+        </w:rPr>
+      </w:pPr>
+      <w:r>
+        <w:rPr>
+          <w:rFonts w:hint="eastAsia" w:ascii="微软雅黑" w:hAnsi="微软雅黑" w:eastAsia="微软雅黑" w:cs="微软雅黑"/>
+          <w:color w:val="auto"/>
+          <w:sz w:val="24"/>
+          <w:szCs w:val="24"/>
+        </w:rPr>
+        <w:t>8.2 mismatch</w:t>
+      </w:r>
+    </w:p>
+    <w:p>
+      <w:pPr>
+        <w:rPr>
+          <w:rFonts w:hint="eastAsia" w:ascii="微软雅黑" w:hAnsi="微软雅黑" w:eastAsia="微软雅黑" w:cs="微软雅黑"/>
+          <w:color w:val="auto"/>
+          <w:sz w:val="24"/>
+          <w:szCs w:val="24"/>
+        </w:rPr>
+      </w:pPr>
+      <w:r>
+        <w:rPr>
+          <w:rFonts w:hint="eastAsia" w:ascii="微软雅黑" w:hAnsi="微软雅黑" w:eastAsia="微软雅黑" w:cs="微软雅黑"/>
+          <w:color w:val="auto"/>
+          <w:sz w:val="24"/>
+          <w:szCs w:val="24"/>
+        </w:rPr>
+        <w:t>含义：</w:t>
+      </w:r>
+    </w:p>
+    <w:p>
+      <w:pPr>
+        <w:pStyle w:val="16"/>
+        <w:rPr>
+          <w:rFonts w:hint="eastAsia" w:ascii="微软雅黑" w:hAnsi="微软雅黑" w:eastAsia="微软雅黑" w:cs="微软雅黑"/>
+          <w:color w:val="auto"/>
+          <w:sz w:val="24"/>
+          <w:szCs w:val="24"/>
+        </w:rPr>
+      </w:pPr>
+      <w:r>
+        <w:rPr>
+          <w:rFonts w:hint="eastAsia" w:ascii="微软雅黑" w:hAnsi="微软雅黑" w:eastAsia="微软雅黑" w:cs="微软雅黑"/>
+          <w:color w:val="auto"/>
+          <w:sz w:val="24"/>
+          <w:szCs w:val="24"/>
+        </w:rPr>
+        <w:t>链上哈希与当前业务数据摘要不一致；</w:t>
+      </w:r>
+    </w:p>
+    <w:p>
+      <w:pPr>
+        <w:pStyle w:val="16"/>
+        <w:rPr>
+          <w:rFonts w:hint="eastAsia" w:ascii="微软雅黑" w:hAnsi="微软雅黑" w:eastAsia="微软雅黑" w:cs="微软雅黑"/>
+          <w:color w:val="auto"/>
+          <w:sz w:val="24"/>
+          <w:szCs w:val="24"/>
+        </w:rPr>
+      </w:pPr>
+      <w:r>
+        <w:rPr>
+          <w:rFonts w:hint="eastAsia" w:ascii="微软雅黑" w:hAnsi="微软雅黑" w:eastAsia="微软雅黑" w:cs="微软雅黑"/>
+          <w:color w:val="auto"/>
+          <w:sz w:val="24"/>
+          <w:szCs w:val="24"/>
+        </w:rPr>
+        <w:t>可能是数据被修改、链上记录未同步或测试环境合约状态变化。</w:t>
+      </w:r>
+    </w:p>
+    <w:p>
+      <w:pPr>
+        <w:rPr>
+          <w:rFonts w:hint="eastAsia" w:ascii="微软雅黑" w:hAnsi="微软雅黑" w:eastAsia="微软雅黑" w:cs="微软雅黑"/>
+          <w:color w:val="auto"/>
+          <w:sz w:val="24"/>
+          <w:szCs w:val="24"/>
+        </w:rPr>
+      </w:pPr>
+    </w:p>
+    <w:p>
+      <w:pPr>
+        <w:pStyle w:val="5"/>
+        <w:rPr>
+          <w:rFonts w:hint="eastAsia" w:ascii="微软雅黑" w:hAnsi="微软雅黑" w:eastAsia="微软雅黑" w:cs="微软雅黑"/>
+          <w:color w:val="auto"/>
+          <w:sz w:val="24"/>
+          <w:szCs w:val="24"/>
+        </w:rPr>
+      </w:pPr>
+      <w:r>
+        <w:rPr>
+          <w:rFonts w:hint="eastAsia" w:ascii="微软雅黑" w:hAnsi="微软雅黑" w:eastAsia="微软雅黑" w:cs="微软雅黑"/>
+          <w:color w:val="auto"/>
+          <w:sz w:val="24"/>
+          <w:szCs w:val="24"/>
+        </w:rPr>
+        <w:t>8.3 no_proof</w:t>
+      </w:r>
+    </w:p>
+    <w:p>
+      <w:pPr>
+        <w:rPr>
+          <w:rFonts w:hint="eastAsia" w:ascii="微软雅黑" w:hAnsi="微软雅黑" w:eastAsia="微软雅黑" w:cs="微软雅黑"/>
+          <w:color w:val="auto"/>
+          <w:sz w:val="24"/>
+          <w:szCs w:val="24"/>
+        </w:rPr>
+      </w:pPr>
+      <w:r>
+        <w:rPr>
+          <w:rFonts w:hint="eastAsia" w:ascii="微软雅黑" w:hAnsi="微软雅黑" w:eastAsia="微软雅黑" w:cs="微软雅黑"/>
+          <w:color w:val="auto"/>
+          <w:sz w:val="24"/>
+          <w:szCs w:val="24"/>
+        </w:rPr>
+        <w:t>含义：</w:t>
+      </w:r>
+    </w:p>
+    <w:p>
+      <w:pPr>
+        <w:pStyle w:val="16"/>
+        <w:rPr>
+          <w:rFonts w:hint="eastAsia" w:ascii="微软雅黑" w:hAnsi="微软雅黑" w:eastAsia="微软雅黑" w:cs="微软雅黑"/>
+          <w:color w:val="auto"/>
+          <w:sz w:val="24"/>
+          <w:szCs w:val="24"/>
+        </w:rPr>
+      </w:pPr>
+      <w:r>
+        <w:rPr>
+          <w:rFonts w:hint="eastAsia" w:ascii="微软雅黑" w:hAnsi="微软雅黑" w:eastAsia="微软雅黑" w:cs="微软雅黑"/>
+          <w:color w:val="auto"/>
+          <w:sz w:val="24"/>
+          <w:szCs w:val="24"/>
+        </w:rPr>
+        <w:t>当前记录没有链上 `dataId`；</w:t>
+      </w:r>
+    </w:p>
+    <w:p>
+      <w:pPr>
+        <w:pStyle w:val="16"/>
+        <w:rPr>
+          <w:rFonts w:hint="eastAsia" w:ascii="微软雅黑" w:hAnsi="微软雅黑" w:eastAsia="微软雅黑" w:cs="微软雅黑"/>
+          <w:color w:val="auto"/>
+          <w:sz w:val="24"/>
+          <w:szCs w:val="24"/>
+        </w:rPr>
+      </w:pPr>
+      <w:r>
+        <w:rPr>
+          <w:rFonts w:hint="eastAsia" w:ascii="微软雅黑" w:hAnsi="微软雅黑" w:eastAsia="微软雅黑" w:cs="微软雅黑"/>
+          <w:color w:val="auto"/>
+          <w:sz w:val="24"/>
+          <w:szCs w:val="24"/>
+        </w:rPr>
+        <w:t>通常发生在链服务关闭时上传的记录，或上链未成功的记录。</w:t>
+      </w:r>
+    </w:p>
+    <w:p>
+      <w:pPr>
+        <w:rPr>
+          <w:rFonts w:hint="eastAsia" w:ascii="微软雅黑" w:hAnsi="微软雅黑" w:eastAsia="微软雅黑" w:cs="微软雅黑"/>
+          <w:color w:val="auto"/>
+          <w:sz w:val="24"/>
+          <w:szCs w:val="24"/>
+        </w:rPr>
+      </w:pPr>
+    </w:p>
+    <w:p>
+      <w:pPr>
+        <w:pStyle w:val="5"/>
+        <w:rPr>
+          <w:rFonts w:hint="eastAsia" w:ascii="微软雅黑" w:hAnsi="微软雅黑" w:eastAsia="微软雅黑" w:cs="微软雅黑"/>
+          <w:color w:val="auto"/>
+          <w:sz w:val="24"/>
+          <w:szCs w:val="24"/>
+        </w:rPr>
+      </w:pPr>
+      <w:r>
+        <w:rPr>
+          <w:rFonts w:hint="eastAsia" w:ascii="微软雅黑" w:hAnsi="微软雅黑" w:eastAsia="微软雅黑" w:cs="微软雅黑"/>
+          <w:color w:val="auto"/>
+          <w:sz w:val="24"/>
+          <w:szCs w:val="24"/>
+        </w:rPr>
+        <w:t>8.4 service_unavailable</w:t>
+      </w:r>
+    </w:p>
+    <w:p>
+      <w:pPr>
+        <w:rPr>
+          <w:rFonts w:hint="eastAsia" w:ascii="微软雅黑" w:hAnsi="微软雅黑" w:eastAsia="微软雅黑" w:cs="微软雅黑"/>
+          <w:color w:val="auto"/>
+          <w:sz w:val="24"/>
+          <w:szCs w:val="24"/>
+        </w:rPr>
+      </w:pPr>
+      <w:r>
+        <w:rPr>
+          <w:rFonts w:hint="eastAsia" w:ascii="微软雅黑" w:hAnsi="微软雅黑" w:eastAsia="微软雅黑" w:cs="微软雅黑"/>
+          <w:color w:val="auto"/>
+          <w:sz w:val="24"/>
+          <w:szCs w:val="24"/>
+        </w:rPr>
+        <w:t>含义：</w:t>
+      </w:r>
+    </w:p>
+    <w:p>
+      <w:pPr>
+        <w:pStyle w:val="16"/>
+        <w:rPr>
+          <w:rFonts w:hint="eastAsia" w:ascii="微软雅黑" w:hAnsi="微软雅黑" w:eastAsia="微软雅黑" w:cs="微软雅黑"/>
+          <w:color w:val="auto"/>
+          <w:sz w:val="24"/>
+          <w:szCs w:val="24"/>
+        </w:rPr>
+      </w:pPr>
+      <w:r>
+        <w:rPr>
+          <w:rFonts w:hint="eastAsia" w:ascii="微软雅黑" w:hAnsi="微软雅黑" w:eastAsia="微软雅黑" w:cs="微软雅黑"/>
+          <w:color w:val="auto"/>
+          <w:sz w:val="24"/>
+          <w:szCs w:val="24"/>
+        </w:rPr>
+        <w:t>区块链服务未启用或 Ganache 未连接；</w:t>
+      </w:r>
+    </w:p>
+    <w:p>
+      <w:pPr>
+        <w:pStyle w:val="16"/>
+        <w:rPr>
+          <w:rFonts w:hint="eastAsia" w:ascii="微软雅黑" w:hAnsi="微软雅黑" w:eastAsia="微软雅黑" w:cs="微软雅黑"/>
+          <w:color w:val="auto"/>
+          <w:sz w:val="24"/>
+          <w:szCs w:val="24"/>
+        </w:rPr>
+      </w:pPr>
+      <w:r>
+        <w:rPr>
+          <w:rFonts w:hint="eastAsia" w:ascii="微软雅黑" w:hAnsi="微软雅黑" w:eastAsia="微软雅黑" w:cs="微软雅黑"/>
+          <w:color w:val="auto"/>
+          <w:sz w:val="24"/>
+          <w:szCs w:val="24"/>
+        </w:rPr>
+        <w:t>当前记录未执行链上验真。</w:t>
+      </w:r>
+    </w:p>
+    <w:p>
+      <w:pPr>
+        <w:rPr>
+          <w:rFonts w:hint="eastAsia" w:ascii="微软雅黑" w:hAnsi="微软雅黑" w:eastAsia="微软雅黑" w:cs="微软雅黑"/>
+          <w:color w:val="auto"/>
+          <w:sz w:val="24"/>
+          <w:szCs w:val="24"/>
+        </w:rPr>
+      </w:pPr>
+    </w:p>
+    <w:p>
+      <w:pPr>
+        <w:pStyle w:val="5"/>
+        <w:rPr>
+          <w:rFonts w:hint="eastAsia" w:ascii="微软雅黑" w:hAnsi="微软雅黑" w:eastAsia="微软雅黑" w:cs="微软雅黑"/>
+          <w:color w:val="auto"/>
+          <w:sz w:val="24"/>
+          <w:szCs w:val="24"/>
+        </w:rPr>
+      </w:pPr>
+      <w:r>
+        <w:rPr>
+          <w:rFonts w:hint="eastAsia" w:ascii="微软雅黑" w:hAnsi="微软雅黑" w:eastAsia="微软雅黑" w:cs="微软雅黑"/>
+          <w:color w:val="auto"/>
+          <w:sz w:val="24"/>
+          <w:szCs w:val="24"/>
+        </w:rPr>
+        <w:t>8.5 record_missing</w:t>
+      </w:r>
+    </w:p>
+    <w:p>
+      <w:pPr>
+        <w:rPr>
+          <w:rFonts w:hint="eastAsia" w:ascii="微软雅黑" w:hAnsi="微软雅黑" w:eastAsia="微软雅黑" w:cs="微软雅黑"/>
+          <w:color w:val="auto"/>
+          <w:sz w:val="24"/>
+          <w:szCs w:val="24"/>
+        </w:rPr>
+      </w:pPr>
+      <w:r>
+        <w:rPr>
+          <w:rFonts w:hint="eastAsia" w:ascii="微软雅黑" w:hAnsi="微软雅黑" w:eastAsia="微软雅黑" w:cs="微软雅黑"/>
+          <w:color w:val="auto"/>
+          <w:sz w:val="24"/>
+          <w:szCs w:val="24"/>
+        </w:rPr>
+        <w:t>含义：</w:t>
+      </w:r>
+    </w:p>
+    <w:p>
+      <w:pPr>
+        <w:pStyle w:val="16"/>
+        <w:rPr>
+          <w:rFonts w:hint="eastAsia" w:ascii="微软雅黑" w:hAnsi="微软雅黑" w:eastAsia="微软雅黑" w:cs="微软雅黑"/>
+          <w:color w:val="auto"/>
+          <w:sz w:val="24"/>
+          <w:szCs w:val="24"/>
+        </w:rPr>
+      </w:pPr>
+      <w:r>
+        <w:rPr>
+          <w:rFonts w:hint="eastAsia" w:ascii="微软雅黑" w:hAnsi="微软雅黑" w:eastAsia="微软雅黑" w:cs="微软雅黑"/>
+          <w:color w:val="auto"/>
+          <w:sz w:val="24"/>
+          <w:szCs w:val="24"/>
+        </w:rPr>
+        <w:t>业务库保存了 `onchain_data_id`，但链上找不到对应记录；</w:t>
+      </w:r>
+    </w:p>
+    <w:p>
+      <w:pPr>
+        <w:pStyle w:val="16"/>
+        <w:rPr>
+          <w:rFonts w:hint="eastAsia" w:ascii="微软雅黑" w:hAnsi="微软雅黑" w:eastAsia="微软雅黑" w:cs="微软雅黑"/>
+          <w:color w:val="auto"/>
+          <w:sz w:val="24"/>
+          <w:szCs w:val="24"/>
+        </w:rPr>
+      </w:pPr>
+      <w:r>
+        <w:rPr>
+          <w:rFonts w:hint="eastAsia" w:ascii="微软雅黑" w:hAnsi="微软雅黑" w:eastAsia="微软雅黑" w:cs="微软雅黑"/>
+          <w:color w:val="auto"/>
+          <w:sz w:val="24"/>
+          <w:szCs w:val="24"/>
+        </w:rPr>
+        <w:t>可能是 Ganache 重置、合约重新部署或链数据丢失。</w:t>
+      </w:r>
+    </w:p>
+    <w:p>
+      <w:pPr>
+        <w:rPr>
+          <w:rFonts w:hint="eastAsia" w:ascii="微软雅黑" w:hAnsi="微软雅黑" w:eastAsia="微软雅黑" w:cs="微软雅黑"/>
+          <w:color w:val="auto"/>
+          <w:sz w:val="24"/>
+          <w:szCs w:val="24"/>
+        </w:rPr>
+      </w:pPr>
+    </w:p>
+    <w:p>
+      <w:pPr>
+        <w:pStyle w:val="5"/>
+        <w:rPr>
+          <w:rFonts w:hint="eastAsia" w:ascii="微软雅黑" w:hAnsi="微软雅黑" w:eastAsia="微软雅黑" w:cs="微软雅黑"/>
+          <w:color w:val="auto"/>
+          <w:sz w:val="24"/>
+          <w:szCs w:val="24"/>
+        </w:rPr>
+      </w:pPr>
+      <w:r>
+        <w:rPr>
+          <w:rFonts w:hint="eastAsia" w:ascii="微软雅黑" w:hAnsi="微软雅黑" w:eastAsia="微软雅黑" w:cs="微软雅黑"/>
+          <w:color w:val="auto"/>
+          <w:sz w:val="24"/>
+          <w:szCs w:val="24"/>
+        </w:rPr>
+        <w:t>8.6 locked</w:t>
+      </w:r>
+    </w:p>
+    <w:p>
+      <w:pPr>
+        <w:rPr>
+          <w:rFonts w:hint="eastAsia" w:ascii="微软雅黑" w:hAnsi="微软雅黑" w:eastAsia="微软雅黑" w:cs="微软雅黑"/>
+          <w:color w:val="auto"/>
+          <w:sz w:val="24"/>
+          <w:szCs w:val="24"/>
+        </w:rPr>
+      </w:pPr>
+      <w:r>
+        <w:rPr>
+          <w:rFonts w:hint="eastAsia" w:ascii="微软雅黑" w:hAnsi="微软雅黑" w:eastAsia="微软雅黑" w:cs="微软雅黑"/>
+          <w:color w:val="auto"/>
+          <w:sz w:val="24"/>
+          <w:szCs w:val="24"/>
+        </w:rPr>
+        <w:t>含义：</w:t>
+      </w:r>
+    </w:p>
+    <w:p>
+      <w:pPr>
+        <w:pStyle w:val="16"/>
+        <w:rPr>
+          <w:rFonts w:hint="eastAsia" w:ascii="微软雅黑" w:hAnsi="微软雅黑" w:eastAsia="微软雅黑" w:cs="微软雅黑"/>
+          <w:color w:val="auto"/>
+          <w:sz w:val="24"/>
+          <w:szCs w:val="24"/>
+        </w:rPr>
+      </w:pPr>
+      <w:r>
+        <w:rPr>
+          <w:rFonts w:hint="eastAsia" w:ascii="微软雅黑" w:hAnsi="微软雅黑" w:eastAsia="微软雅黑" w:cs="微软雅黑"/>
+          <w:color w:val="auto"/>
+          <w:sz w:val="24"/>
+          <w:szCs w:val="24"/>
+        </w:rPr>
+        <w:t>私密数据未解锁；</w:t>
+      </w:r>
+    </w:p>
+    <w:p>
+      <w:pPr>
+        <w:pStyle w:val="16"/>
+        <w:rPr>
+          <w:rFonts w:hint="eastAsia" w:ascii="微软雅黑" w:hAnsi="微软雅黑" w:eastAsia="微软雅黑" w:cs="微软雅黑"/>
+          <w:color w:val="auto"/>
+          <w:sz w:val="24"/>
+          <w:szCs w:val="24"/>
+        </w:rPr>
+      </w:pPr>
+      <w:r>
+        <w:rPr>
+          <w:rFonts w:hint="eastAsia" w:ascii="微软雅黑" w:hAnsi="微软雅黑" w:eastAsia="微软雅黑" w:cs="微软雅黑"/>
+          <w:color w:val="auto"/>
+          <w:sz w:val="24"/>
+          <w:szCs w:val="24"/>
+        </w:rPr>
+        <w:t>后端无法得到原文或文件内容，因此无法计算可比对摘要。</w:t>
+      </w:r>
+    </w:p>
+    <w:p>
+      <w:pPr>
+        <w:rPr>
+          <w:rFonts w:hint="eastAsia" w:ascii="微软雅黑" w:hAnsi="微软雅黑" w:eastAsia="微软雅黑" w:cs="微软雅黑"/>
+          <w:color w:val="auto"/>
+          <w:sz w:val="24"/>
+          <w:szCs w:val="24"/>
+        </w:rPr>
+      </w:pPr>
+    </w:p>
+    <w:p>
+      <w:pPr>
+        <w:rPr>
+          <w:rFonts w:hint="eastAsia" w:ascii="微软雅黑" w:hAnsi="微软雅黑" w:eastAsia="微软雅黑" w:cs="微软雅黑"/>
+          <w:color w:val="auto"/>
+          <w:sz w:val="24"/>
+          <w:szCs w:val="24"/>
+        </w:rPr>
+      </w:pPr>
+      <w:r>
+        <w:rPr>
+          <w:rFonts w:hint="eastAsia" w:ascii="微软雅黑" w:hAnsi="微软雅黑" w:eastAsia="微软雅黑" w:cs="微软雅黑"/>
+          <w:color w:val="auto"/>
+          <w:sz w:val="24"/>
+          <w:szCs w:val="24"/>
+        </w:rPr>
+        <w:t>----------------------------------------</w:t>
+      </w:r>
+    </w:p>
+    <w:p>
+      <w:pPr>
+        <w:rPr>
+          <w:rFonts w:hint="eastAsia" w:ascii="微软雅黑" w:hAnsi="微软雅黑" w:eastAsia="微软雅黑" w:cs="微软雅黑"/>
+          <w:color w:val="auto"/>
+          <w:sz w:val="24"/>
+          <w:szCs w:val="24"/>
+        </w:rPr>
+      </w:pPr>
+    </w:p>
+    <w:p>
+      <w:pPr>
+        <w:pStyle w:val="4"/>
+        <w:rPr>
+          <w:rFonts w:hint="eastAsia" w:ascii="微软雅黑" w:hAnsi="微软雅黑" w:eastAsia="微软雅黑" w:cs="微软雅黑"/>
+          <w:color w:val="auto"/>
+          <w:sz w:val="24"/>
+          <w:szCs w:val="24"/>
+        </w:rPr>
+      </w:pPr>
+      <w:r>
+        <w:rPr>
+          <w:rFonts w:hint="eastAsia" w:ascii="微软雅黑" w:hAnsi="微软雅黑" w:eastAsia="微软雅黑" w:cs="微软雅黑"/>
+          <w:color w:val="auto"/>
+          <w:sz w:val="24"/>
+          <w:szCs w:val="24"/>
+        </w:rPr>
+        <w:t>9. Ganache 启停与降级策略</w:t>
+      </w:r>
+    </w:p>
+    <w:p>
+      <w:pPr>
+        <w:rPr>
+          <w:rFonts w:hint="eastAsia" w:ascii="微软雅黑" w:hAnsi="微软雅黑" w:eastAsia="微软雅黑" w:cs="微软雅黑"/>
+          <w:color w:val="auto"/>
+          <w:sz w:val="24"/>
+          <w:szCs w:val="24"/>
+        </w:rPr>
+      </w:pPr>
+    </w:p>
+    <w:p>
+      <w:pPr>
+        <w:pStyle w:val="5"/>
+        <w:rPr>
+          <w:rFonts w:hint="eastAsia" w:ascii="微软雅黑" w:hAnsi="微软雅黑" w:eastAsia="微软雅黑" w:cs="微软雅黑"/>
+          <w:color w:val="auto"/>
+          <w:sz w:val="24"/>
+          <w:szCs w:val="24"/>
+        </w:rPr>
+      </w:pPr>
+      <w:r>
+        <w:rPr>
+          <w:rFonts w:hint="eastAsia" w:ascii="微软雅黑" w:hAnsi="微软雅黑" w:eastAsia="微软雅黑" w:cs="微软雅黑"/>
+          <w:color w:val="auto"/>
+          <w:sz w:val="24"/>
+          <w:szCs w:val="24"/>
+        </w:rPr>
+        <w:t>9.1 Ganache 未启动</w:t>
+      </w:r>
+    </w:p>
+    <w:p>
+      <w:pPr>
+        <w:rPr>
+          <w:rFonts w:hint="eastAsia" w:ascii="微软雅黑" w:hAnsi="微软雅黑" w:eastAsia="微软雅黑" w:cs="微软雅黑"/>
+          <w:color w:val="auto"/>
+          <w:sz w:val="24"/>
+          <w:szCs w:val="24"/>
+        </w:rPr>
+      </w:pPr>
+      <w:r>
+        <w:rPr>
+          <w:rFonts w:hint="eastAsia" w:ascii="微软雅黑" w:hAnsi="微软雅黑" w:eastAsia="微软雅黑" w:cs="微软雅黑"/>
+          <w:color w:val="auto"/>
+          <w:sz w:val="24"/>
+          <w:szCs w:val="24"/>
+        </w:rPr>
+        <w:t>系统行为：</w:t>
+      </w:r>
+    </w:p>
+    <w:p>
+      <w:pPr>
+        <w:pStyle w:val="16"/>
+        <w:rPr>
+          <w:rFonts w:hint="eastAsia" w:ascii="微软雅黑" w:hAnsi="微软雅黑" w:eastAsia="微软雅黑" w:cs="微软雅黑"/>
+          <w:color w:val="auto"/>
+          <w:sz w:val="24"/>
+          <w:szCs w:val="24"/>
+        </w:rPr>
+      </w:pPr>
+      <w:r>
+        <w:rPr>
+          <w:rFonts w:hint="eastAsia" w:ascii="微软雅黑" w:hAnsi="微软雅黑" w:eastAsia="微软雅黑" w:cs="微软雅黑"/>
+          <w:color w:val="auto"/>
+          <w:sz w:val="24"/>
+          <w:szCs w:val="24"/>
+        </w:rPr>
+        <w:t>用户注册被禁止；</w:t>
+      </w:r>
+    </w:p>
+    <w:p>
+      <w:pPr>
+        <w:pStyle w:val="16"/>
+        <w:rPr>
+          <w:rFonts w:hint="eastAsia" w:ascii="微软雅黑" w:hAnsi="微软雅黑" w:eastAsia="微软雅黑" w:cs="微软雅黑"/>
+          <w:color w:val="auto"/>
+          <w:sz w:val="24"/>
+          <w:szCs w:val="24"/>
+        </w:rPr>
+      </w:pPr>
+      <w:r>
+        <w:rPr>
+          <w:rFonts w:hint="eastAsia" w:ascii="微软雅黑" w:hAnsi="微软雅黑" w:eastAsia="微软雅黑" w:cs="微软雅黑"/>
+          <w:color w:val="auto"/>
+          <w:sz w:val="24"/>
+          <w:szCs w:val="24"/>
+        </w:rPr>
+        <w:t>健康数据上传、更新和加载不被阻断；</w:t>
+      </w:r>
+    </w:p>
+    <w:p>
+      <w:pPr>
+        <w:pStyle w:val="16"/>
+        <w:rPr>
+          <w:rFonts w:hint="eastAsia" w:ascii="微软雅黑" w:hAnsi="微软雅黑" w:eastAsia="微软雅黑" w:cs="微软雅黑"/>
+          <w:color w:val="auto"/>
+          <w:sz w:val="24"/>
+          <w:szCs w:val="24"/>
+        </w:rPr>
+      </w:pPr>
+      <w:r>
+        <w:rPr>
+          <w:rFonts w:hint="eastAsia" w:ascii="微软雅黑" w:hAnsi="微软雅黑" w:eastAsia="微软雅黑" w:cs="微软雅黑"/>
+          <w:color w:val="auto"/>
+          <w:sz w:val="24"/>
+          <w:szCs w:val="24"/>
+        </w:rPr>
+        <w:t>验真状态返回 `service_unavailable`；</w:t>
+      </w:r>
+    </w:p>
+    <w:p>
+      <w:pPr>
+        <w:pStyle w:val="16"/>
+        <w:rPr>
+          <w:rFonts w:hint="eastAsia" w:ascii="微软雅黑" w:hAnsi="微软雅黑" w:eastAsia="微软雅黑" w:cs="微软雅黑"/>
+          <w:color w:val="auto"/>
+          <w:sz w:val="24"/>
+          <w:szCs w:val="24"/>
+        </w:rPr>
+      </w:pPr>
+      <w:r>
+        <w:rPr>
+          <w:rFonts w:hint="eastAsia" w:ascii="微软雅黑" w:hAnsi="微软雅黑" w:eastAsia="微软雅黑" w:cs="微软雅黑"/>
+          <w:color w:val="auto"/>
+          <w:sz w:val="24"/>
+          <w:szCs w:val="24"/>
+        </w:rPr>
+        <w:t>写入接口返回 `onchain_warning`。</w:t>
+      </w:r>
+    </w:p>
+    <w:p>
+      <w:pPr>
+        <w:rPr>
+          <w:rFonts w:hint="eastAsia" w:ascii="微软雅黑" w:hAnsi="微软雅黑" w:eastAsia="微软雅黑" w:cs="微软雅黑"/>
+          <w:color w:val="auto"/>
+          <w:sz w:val="24"/>
+          <w:szCs w:val="24"/>
+        </w:rPr>
+      </w:pPr>
+    </w:p>
+    <w:p>
+      <w:pPr>
+        <w:pStyle w:val="5"/>
+        <w:rPr>
+          <w:rFonts w:hint="eastAsia" w:ascii="微软雅黑" w:hAnsi="微软雅黑" w:eastAsia="微软雅黑" w:cs="微软雅黑"/>
+          <w:color w:val="auto"/>
+          <w:sz w:val="24"/>
+          <w:szCs w:val="24"/>
+        </w:rPr>
+      </w:pPr>
+      <w:r>
+        <w:rPr>
+          <w:rFonts w:hint="eastAsia" w:ascii="微软雅黑" w:hAnsi="微软雅黑" w:eastAsia="微软雅黑" w:cs="微软雅黑"/>
+          <w:color w:val="auto"/>
+          <w:sz w:val="24"/>
+          <w:szCs w:val="24"/>
+        </w:rPr>
+        <w:t>9.2 Ganache 中途启动</w:t>
+      </w:r>
+    </w:p>
+    <w:p>
+      <w:pPr>
+        <w:rPr>
+          <w:rFonts w:hint="eastAsia" w:ascii="微软雅黑" w:hAnsi="微软雅黑" w:eastAsia="微软雅黑" w:cs="微软雅黑"/>
+          <w:color w:val="auto"/>
+          <w:sz w:val="24"/>
+          <w:szCs w:val="24"/>
+        </w:rPr>
+      </w:pPr>
+      <w:r>
+        <w:rPr>
+          <w:rFonts w:hint="eastAsia" w:ascii="微软雅黑" w:hAnsi="微软雅黑" w:eastAsia="微软雅黑" w:cs="微软雅黑"/>
+          <w:color w:val="auto"/>
+          <w:sz w:val="24"/>
+          <w:szCs w:val="24"/>
+        </w:rPr>
+        <w:t>系统行为：</w:t>
+      </w:r>
+    </w:p>
+    <w:p>
+      <w:pPr>
+        <w:pStyle w:val="16"/>
+        <w:rPr>
+          <w:rFonts w:hint="eastAsia" w:ascii="微软雅黑" w:hAnsi="微软雅黑" w:eastAsia="微软雅黑" w:cs="微软雅黑"/>
+          <w:color w:val="auto"/>
+          <w:sz w:val="24"/>
+          <w:szCs w:val="24"/>
+        </w:rPr>
+      </w:pPr>
+      <w:r>
+        <w:rPr>
+          <w:rFonts w:hint="eastAsia" w:ascii="微软雅黑" w:hAnsi="微软雅黑" w:eastAsia="微软雅黑" w:cs="微软雅黑"/>
+          <w:color w:val="auto"/>
+          <w:sz w:val="24"/>
+          <w:szCs w:val="24"/>
+        </w:rPr>
+        <w:t>后端链服务会动态检测 RPC 状态；</w:t>
+      </w:r>
+    </w:p>
+    <w:p>
+      <w:pPr>
+        <w:pStyle w:val="16"/>
+        <w:rPr>
+          <w:rFonts w:hint="eastAsia" w:ascii="微软雅黑" w:hAnsi="微软雅黑" w:eastAsia="微软雅黑" w:cs="微软雅黑"/>
+          <w:color w:val="auto"/>
+          <w:sz w:val="24"/>
+          <w:szCs w:val="24"/>
+        </w:rPr>
+      </w:pPr>
+      <w:r>
+        <w:rPr>
+          <w:rFonts w:hint="eastAsia" w:ascii="微软雅黑" w:hAnsi="微软雅黑" w:eastAsia="微软雅黑" w:cs="微软雅黑"/>
+          <w:color w:val="auto"/>
+          <w:sz w:val="24"/>
+          <w:szCs w:val="24"/>
+        </w:rPr>
+        <w:t>用户刷新记录列表或详情时，会重新尝试绑定合约并执行验真；</w:t>
+      </w:r>
+    </w:p>
+    <w:p>
+      <w:pPr>
+        <w:pStyle w:val="16"/>
+        <w:rPr>
+          <w:rFonts w:hint="eastAsia" w:ascii="微软雅黑" w:hAnsi="微软雅黑" w:eastAsia="微软雅黑" w:cs="微软雅黑"/>
+          <w:color w:val="auto"/>
+          <w:sz w:val="24"/>
+          <w:szCs w:val="24"/>
+        </w:rPr>
+      </w:pPr>
+      <w:r>
+        <w:rPr>
+          <w:rFonts w:hint="eastAsia" w:ascii="微软雅黑" w:hAnsi="微软雅黑" w:eastAsia="微软雅黑" w:cs="微软雅黑"/>
+          <w:color w:val="auto"/>
+          <w:sz w:val="24"/>
+          <w:szCs w:val="24"/>
+        </w:rPr>
+        <w:t>无需重启后端服务。</w:t>
+      </w:r>
+    </w:p>
+    <w:p>
+      <w:pPr>
+        <w:rPr>
+          <w:rFonts w:hint="eastAsia" w:ascii="微软雅黑" w:hAnsi="微软雅黑" w:eastAsia="微软雅黑" w:cs="微软雅黑"/>
+          <w:color w:val="auto"/>
+          <w:sz w:val="24"/>
+          <w:szCs w:val="24"/>
+        </w:rPr>
+      </w:pPr>
+    </w:p>
+    <w:p>
+      <w:pPr>
+        <w:pStyle w:val="5"/>
+        <w:rPr>
+          <w:rFonts w:hint="eastAsia" w:ascii="微软雅黑" w:hAnsi="微软雅黑" w:eastAsia="微软雅黑" w:cs="微软雅黑"/>
+          <w:color w:val="auto"/>
+          <w:sz w:val="24"/>
+          <w:szCs w:val="24"/>
+        </w:rPr>
+      </w:pPr>
+      <w:r>
+        <w:rPr>
+          <w:rFonts w:hint="eastAsia" w:ascii="微软雅黑" w:hAnsi="微软雅黑" w:eastAsia="微软雅黑" w:cs="微软雅黑"/>
+          <w:color w:val="auto"/>
+          <w:sz w:val="24"/>
+          <w:szCs w:val="24"/>
+        </w:rPr>
+        <w:t>9.3 Ganache 重置或合约重新部署</w:t>
+      </w:r>
+    </w:p>
+    <w:p>
+      <w:pPr>
+        <w:rPr>
+          <w:rFonts w:hint="eastAsia" w:ascii="微软雅黑" w:hAnsi="微软雅黑" w:eastAsia="微软雅黑" w:cs="微软雅黑"/>
+          <w:color w:val="auto"/>
+          <w:sz w:val="24"/>
+          <w:szCs w:val="24"/>
+        </w:rPr>
+      </w:pPr>
+      <w:r>
+        <w:rPr>
+          <w:rFonts w:hint="eastAsia" w:ascii="微软雅黑" w:hAnsi="微软雅黑" w:eastAsia="微软雅黑" w:cs="微软雅黑"/>
+          <w:color w:val="auto"/>
+          <w:sz w:val="24"/>
+          <w:szCs w:val="24"/>
+        </w:rPr>
+        <w:t>可能影响：</w:t>
+      </w:r>
+    </w:p>
+    <w:p>
+      <w:pPr>
+        <w:pStyle w:val="16"/>
+        <w:rPr>
+          <w:rFonts w:hint="eastAsia" w:ascii="微软雅黑" w:hAnsi="微软雅黑" w:eastAsia="微软雅黑" w:cs="微软雅黑"/>
+          <w:color w:val="auto"/>
+          <w:sz w:val="24"/>
+          <w:szCs w:val="24"/>
+        </w:rPr>
+      </w:pPr>
+      <w:r>
+        <w:rPr>
+          <w:rFonts w:hint="eastAsia" w:ascii="微软雅黑" w:hAnsi="微软雅黑" w:eastAsia="微软雅黑" w:cs="微软雅黑"/>
+          <w:color w:val="auto"/>
+          <w:sz w:val="24"/>
+          <w:szCs w:val="24"/>
+        </w:rPr>
+        <w:t>旧 `onchain_data_id` 对应的链上记录可能不存在；</w:t>
+      </w:r>
+    </w:p>
+    <w:p>
+      <w:pPr>
+        <w:pStyle w:val="16"/>
+        <w:rPr>
+          <w:rFonts w:hint="eastAsia" w:ascii="微软雅黑" w:hAnsi="微软雅黑" w:eastAsia="微软雅黑" w:cs="微软雅黑"/>
+          <w:color w:val="auto"/>
+          <w:sz w:val="24"/>
+          <w:szCs w:val="24"/>
+        </w:rPr>
+      </w:pPr>
+      <w:r>
+        <w:rPr>
+          <w:rFonts w:hint="eastAsia" w:ascii="微软雅黑" w:hAnsi="微软雅黑" w:eastAsia="微软雅黑" w:cs="微软雅黑"/>
+          <w:color w:val="auto"/>
+          <w:sz w:val="24"/>
+          <w:szCs w:val="24"/>
+        </w:rPr>
+        <w:t>验真状态可能变为 `record_missing`；</w:t>
+      </w:r>
+    </w:p>
+    <w:p>
+      <w:pPr>
+        <w:pStyle w:val="16"/>
+        <w:rPr>
+          <w:rFonts w:hint="eastAsia" w:ascii="微软雅黑" w:hAnsi="微软雅黑" w:eastAsia="微软雅黑" w:cs="微软雅黑"/>
+          <w:color w:val="auto"/>
+          <w:sz w:val="24"/>
+          <w:szCs w:val="24"/>
+        </w:rPr>
+      </w:pPr>
+      <w:r>
+        <w:rPr>
+          <w:rFonts w:hint="eastAsia" w:ascii="微软雅黑" w:hAnsi="微软雅黑" w:eastAsia="微软雅黑" w:cs="微软雅黑"/>
+          <w:color w:val="auto"/>
+          <w:sz w:val="24"/>
+          <w:szCs w:val="24"/>
+        </w:rPr>
+        <w:t>需要重新部署合约并更新后端配置中的合约地址与 ABI。</w:t>
+      </w:r>
+    </w:p>
+    <w:p>
+      <w:pPr>
+        <w:rPr>
+          <w:rFonts w:hint="eastAsia" w:ascii="微软雅黑" w:hAnsi="微软雅黑" w:eastAsia="微软雅黑" w:cs="微软雅黑"/>
+          <w:color w:val="auto"/>
+          <w:sz w:val="24"/>
+          <w:szCs w:val="24"/>
+        </w:rPr>
+      </w:pPr>
+    </w:p>
+    <w:p>
+      <w:pPr>
+        <w:rPr>
+          <w:rFonts w:hint="eastAsia" w:ascii="微软雅黑" w:hAnsi="微软雅黑" w:eastAsia="微软雅黑" w:cs="微软雅黑"/>
+          <w:color w:val="auto"/>
+          <w:sz w:val="24"/>
+          <w:szCs w:val="24"/>
+        </w:rPr>
+      </w:pPr>
+      <w:r>
+        <w:rPr>
+          <w:rFonts w:hint="eastAsia" w:ascii="微软雅黑" w:hAnsi="微软雅黑" w:eastAsia="微软雅黑" w:cs="微软雅黑"/>
+          <w:color w:val="auto"/>
+          <w:sz w:val="24"/>
+          <w:szCs w:val="24"/>
+        </w:rPr>
+        <w:t>----------------------------------------</w:t>
+      </w:r>
+    </w:p>
+    <w:p>
+      <w:pPr>
+        <w:rPr>
+          <w:rFonts w:hint="eastAsia" w:ascii="微软雅黑" w:hAnsi="微软雅黑" w:eastAsia="微软雅黑" w:cs="微软雅黑"/>
+          <w:color w:val="auto"/>
+          <w:sz w:val="24"/>
+          <w:szCs w:val="24"/>
+        </w:rPr>
+      </w:pPr>
+    </w:p>
+    <w:p>
+      <w:pPr>
+        <w:pStyle w:val="4"/>
+        <w:rPr>
+          <w:rFonts w:hint="eastAsia" w:ascii="微软雅黑" w:hAnsi="微软雅黑" w:eastAsia="微软雅黑" w:cs="微软雅黑"/>
+          <w:color w:val="auto"/>
+          <w:sz w:val="24"/>
+          <w:szCs w:val="24"/>
+        </w:rPr>
+      </w:pPr>
+      <w:r>
+        <w:rPr>
+          <w:rFonts w:hint="eastAsia" w:ascii="微软雅黑" w:hAnsi="微软雅黑" w:eastAsia="微软雅黑" w:cs="微软雅黑"/>
+          <w:color w:val="auto"/>
+          <w:sz w:val="24"/>
+          <w:szCs w:val="24"/>
+        </w:rPr>
+        <w:t>10. 开发与联调注意事项</w:t>
+      </w:r>
+    </w:p>
+    <w:p>
+      <w:pPr>
+        <w:rPr>
+          <w:rFonts w:hint="eastAsia" w:ascii="微软雅黑" w:hAnsi="微软雅黑" w:eastAsia="微软雅黑" w:cs="微软雅黑"/>
+          <w:color w:val="auto"/>
+          <w:sz w:val="24"/>
+          <w:szCs w:val="24"/>
+        </w:rPr>
+      </w:pPr>
+    </w:p>
+    <w:p>
+      <w:pPr>
+        <w:pStyle w:val="5"/>
+        <w:rPr>
+          <w:rFonts w:hint="eastAsia" w:ascii="微软雅黑" w:hAnsi="微软雅黑" w:eastAsia="微软雅黑" w:cs="微软雅黑"/>
+          <w:color w:val="auto"/>
+          <w:sz w:val="24"/>
+          <w:szCs w:val="24"/>
+        </w:rPr>
+      </w:pPr>
+      <w:r>
+        <w:rPr>
+          <w:rFonts w:hint="eastAsia" w:ascii="微软雅黑" w:hAnsi="微软雅黑" w:eastAsia="微软雅黑" w:cs="微软雅黑"/>
+          <w:color w:val="auto"/>
+          <w:sz w:val="24"/>
+          <w:szCs w:val="24"/>
+        </w:rPr>
+        <w:t>10.1 bytes32 参数要求</w:t>
+      </w:r>
+    </w:p>
+    <w:p>
+      <w:pPr>
+        <w:rPr>
+          <w:rFonts w:hint="eastAsia" w:ascii="微软雅黑" w:hAnsi="微软雅黑" w:eastAsia="微软雅黑" w:cs="微软雅黑"/>
+          <w:color w:val="auto"/>
+          <w:sz w:val="24"/>
+          <w:szCs w:val="24"/>
+        </w:rPr>
+      </w:pPr>
+      <w:r>
+        <w:rPr>
+          <w:rFonts w:hint="eastAsia" w:ascii="微软雅黑" w:hAnsi="微软雅黑" w:eastAsia="微软雅黑" w:cs="微软雅黑"/>
+          <w:color w:val="auto"/>
+          <w:sz w:val="24"/>
+          <w:szCs w:val="24"/>
+        </w:rPr>
+        <w:t>合约中的 `dataHash`、`encryptedData` 和 `dataId` 均为 `bytes32`。后端在调用前必须保证十六进制字符串解码后长度为 32 字节。</w:t>
+      </w:r>
+    </w:p>
+    <w:p>
+      <w:pPr>
+        <w:rPr>
+          <w:rFonts w:hint="eastAsia" w:ascii="微软雅黑" w:hAnsi="微软雅黑" w:eastAsia="微软雅黑" w:cs="微软雅黑"/>
+          <w:color w:val="auto"/>
+          <w:sz w:val="24"/>
+          <w:szCs w:val="24"/>
+        </w:rPr>
+      </w:pPr>
+    </w:p>
+    <w:p>
+      <w:pPr>
+        <w:pStyle w:val="5"/>
+        <w:rPr>
+          <w:rFonts w:hint="eastAsia" w:ascii="微软雅黑" w:hAnsi="微软雅黑" w:eastAsia="微软雅黑" w:cs="微软雅黑"/>
+          <w:color w:val="auto"/>
+          <w:sz w:val="24"/>
+          <w:szCs w:val="24"/>
+        </w:rPr>
+      </w:pPr>
+      <w:r>
+        <w:rPr>
+          <w:rFonts w:hint="eastAsia" w:ascii="微软雅黑" w:hAnsi="微软雅黑" w:eastAsia="微软雅黑" w:cs="微软雅黑"/>
+          <w:color w:val="auto"/>
+          <w:sz w:val="24"/>
+          <w:szCs w:val="24"/>
+        </w:rPr>
+        <w:t>10.2 交易发送要求</w:t>
+      </w:r>
+    </w:p>
+    <w:p>
+      <w:pPr>
+        <w:rPr>
+          <w:rFonts w:hint="eastAsia" w:ascii="微软雅黑" w:hAnsi="微软雅黑" w:eastAsia="微软雅黑" w:cs="微软雅黑"/>
+          <w:color w:val="auto"/>
+          <w:sz w:val="24"/>
+          <w:szCs w:val="24"/>
+        </w:rPr>
+      </w:pPr>
+      <w:r>
+        <w:rPr>
+          <w:rFonts w:hint="eastAsia" w:ascii="微软雅黑" w:hAnsi="微软雅黑" w:eastAsia="微软雅黑" w:cs="微软雅黑"/>
+          <w:color w:val="auto"/>
+          <w:sz w:val="24"/>
+          <w:szCs w:val="24"/>
+        </w:rPr>
+        <w:t>交易发送需要：</w:t>
+      </w:r>
+    </w:p>
+    <w:p>
+      <w:pPr>
+        <w:pStyle w:val="16"/>
+        <w:rPr>
+          <w:rFonts w:hint="eastAsia" w:ascii="微软雅黑" w:hAnsi="微软雅黑" w:eastAsia="微软雅黑" w:cs="微软雅黑"/>
+          <w:color w:val="auto"/>
+          <w:sz w:val="24"/>
+          <w:szCs w:val="24"/>
+        </w:rPr>
+      </w:pPr>
+      <w:r>
+        <w:rPr>
+          <w:rFonts w:hint="eastAsia" w:ascii="微软雅黑" w:hAnsi="微软雅黑" w:eastAsia="微软雅黑" w:cs="微软雅黑"/>
+          <w:color w:val="auto"/>
+          <w:sz w:val="24"/>
+          <w:szCs w:val="24"/>
+        </w:rPr>
+        <w:t>可用的 RPC 节点；</w:t>
+      </w:r>
+    </w:p>
+    <w:p>
+      <w:pPr>
+        <w:pStyle w:val="16"/>
+        <w:rPr>
+          <w:rFonts w:hint="eastAsia" w:ascii="微软雅黑" w:hAnsi="微软雅黑" w:eastAsia="微软雅黑" w:cs="微软雅黑"/>
+          <w:color w:val="auto"/>
+          <w:sz w:val="24"/>
+          <w:szCs w:val="24"/>
+        </w:rPr>
+      </w:pPr>
+      <w:r>
+        <w:rPr>
+          <w:rFonts w:hint="eastAsia" w:ascii="微软雅黑" w:hAnsi="微软雅黑" w:eastAsia="微软雅黑" w:cs="微软雅黑"/>
+          <w:color w:val="auto"/>
+          <w:sz w:val="24"/>
+          <w:szCs w:val="24"/>
+        </w:rPr>
+        <w:t>可用合约地址；</w:t>
+      </w:r>
+    </w:p>
+    <w:p>
+      <w:pPr>
+        <w:pStyle w:val="16"/>
+        <w:rPr>
+          <w:rFonts w:hint="eastAsia" w:ascii="微软雅黑" w:hAnsi="微软雅黑" w:eastAsia="微软雅黑" w:cs="微软雅黑"/>
+          <w:color w:val="auto"/>
+          <w:sz w:val="24"/>
+          <w:szCs w:val="24"/>
+        </w:rPr>
+      </w:pPr>
+      <w:r>
+        <w:rPr>
+          <w:rFonts w:hint="eastAsia" w:ascii="微软雅黑" w:hAnsi="微软雅黑" w:eastAsia="微软雅黑" w:cs="微软雅黑"/>
+          <w:color w:val="auto"/>
+          <w:sz w:val="24"/>
+          <w:szCs w:val="24"/>
+        </w:rPr>
+        <w:t>调用方私钥；</w:t>
+      </w:r>
+    </w:p>
+    <w:p>
+      <w:pPr>
+        <w:pStyle w:val="16"/>
+        <w:rPr>
+          <w:rFonts w:hint="eastAsia" w:ascii="微软雅黑" w:hAnsi="微软雅黑" w:eastAsia="微软雅黑" w:cs="微软雅黑"/>
+          <w:color w:val="auto"/>
+          <w:sz w:val="24"/>
+          <w:szCs w:val="24"/>
+        </w:rPr>
+      </w:pPr>
+      <w:r>
+        <w:rPr>
+          <w:rFonts w:hint="eastAsia" w:ascii="微软雅黑" w:hAnsi="微软雅黑" w:eastAsia="微软雅黑" w:cs="微软雅黑"/>
+          <w:color w:val="auto"/>
+          <w:sz w:val="24"/>
+          <w:szCs w:val="24"/>
+        </w:rPr>
+        <w:t>调用方账户有足够测试 ETH；</w:t>
+      </w:r>
+    </w:p>
+    <w:p>
+      <w:pPr>
+        <w:pStyle w:val="16"/>
+        <w:rPr>
+          <w:rFonts w:hint="eastAsia" w:ascii="微软雅黑" w:hAnsi="微软雅黑" w:eastAsia="微软雅黑" w:cs="微软雅黑"/>
+          <w:color w:val="auto"/>
+          <w:sz w:val="24"/>
+          <w:szCs w:val="24"/>
+        </w:rPr>
+      </w:pPr>
+      <w:r>
+        <w:rPr>
+          <w:rFonts w:hint="eastAsia" w:ascii="微软雅黑" w:hAnsi="微软雅黑" w:eastAsia="微软雅黑" w:cs="微软雅黑"/>
+          <w:color w:val="auto"/>
+          <w:sz w:val="24"/>
+          <w:szCs w:val="24"/>
+        </w:rPr>
+        <w:t>正确的 `chainId`、`gas` 与 `gasPrice`。</w:t>
+      </w:r>
+    </w:p>
+    <w:p>
+      <w:pPr>
+        <w:rPr>
+          <w:rFonts w:hint="eastAsia" w:ascii="微软雅黑" w:hAnsi="微软雅黑" w:eastAsia="微软雅黑" w:cs="微软雅黑"/>
+          <w:color w:val="auto"/>
+          <w:sz w:val="24"/>
+          <w:szCs w:val="24"/>
+        </w:rPr>
+      </w:pPr>
+    </w:p>
+    <w:p>
+      <w:pPr>
+        <w:pStyle w:val="5"/>
+        <w:rPr>
+          <w:rFonts w:hint="eastAsia" w:ascii="微软雅黑" w:hAnsi="微软雅黑" w:eastAsia="微软雅黑" w:cs="微软雅黑"/>
+          <w:color w:val="auto"/>
+          <w:sz w:val="24"/>
+          <w:szCs w:val="24"/>
+        </w:rPr>
+      </w:pPr>
+      <w:r>
+        <w:rPr>
+          <w:rFonts w:hint="eastAsia" w:ascii="微软雅黑" w:hAnsi="微软雅黑" w:eastAsia="微软雅黑" w:cs="微软雅黑"/>
+          <w:color w:val="auto"/>
+          <w:sz w:val="24"/>
+          <w:szCs w:val="24"/>
+        </w:rPr>
+        <w:t>10.3 前端展示建议</w:t>
+      </w:r>
+    </w:p>
+    <w:p>
+      <w:pPr>
+        <w:rPr>
+          <w:rFonts w:hint="eastAsia" w:ascii="微软雅黑" w:hAnsi="微软雅黑" w:eastAsia="微软雅黑" w:cs="微软雅黑"/>
+          <w:color w:val="auto"/>
+          <w:sz w:val="24"/>
+          <w:szCs w:val="24"/>
+        </w:rPr>
+      </w:pPr>
+      <w:r>
+        <w:rPr>
+          <w:rFonts w:hint="eastAsia" w:ascii="微软雅黑" w:hAnsi="微软雅黑" w:eastAsia="微软雅黑" w:cs="微软雅黑"/>
+          <w:color w:val="auto"/>
+          <w:sz w:val="24"/>
+          <w:szCs w:val="24"/>
+        </w:rPr>
+        <w:t>前端不应只依赖 `onchain_verified` 布尔值，应同时展示：</w:t>
+      </w:r>
+    </w:p>
+    <w:p>
+      <w:pPr>
+        <w:pStyle w:val="16"/>
+        <w:rPr>
+          <w:rFonts w:hint="eastAsia" w:ascii="微软雅黑" w:hAnsi="微软雅黑" w:eastAsia="微软雅黑" w:cs="微软雅黑"/>
+          <w:color w:val="auto"/>
+          <w:sz w:val="24"/>
+          <w:szCs w:val="24"/>
+        </w:rPr>
+      </w:pPr>
+      <w:r>
+        <w:rPr>
+          <w:rFonts w:hint="eastAsia" w:ascii="微软雅黑" w:hAnsi="微软雅黑" w:eastAsia="微软雅黑" w:cs="微软雅黑"/>
+          <w:color w:val="auto"/>
+          <w:sz w:val="24"/>
+          <w:szCs w:val="24"/>
+        </w:rPr>
+        <w:t>`onchain_verification_status`</w:t>
+      </w:r>
+    </w:p>
+    <w:p>
+      <w:pPr>
+        <w:pStyle w:val="16"/>
+        <w:rPr>
+          <w:rFonts w:hint="eastAsia" w:ascii="微软雅黑" w:hAnsi="微软雅黑" w:eastAsia="微软雅黑" w:cs="微软雅黑"/>
+          <w:color w:val="auto"/>
+          <w:sz w:val="24"/>
+          <w:szCs w:val="24"/>
+        </w:rPr>
+      </w:pPr>
+      <w:r>
+        <w:rPr>
+          <w:rFonts w:hint="eastAsia" w:ascii="微软雅黑" w:hAnsi="微软雅黑" w:eastAsia="微软雅黑" w:cs="微软雅黑"/>
+          <w:color w:val="auto"/>
+          <w:sz w:val="24"/>
+          <w:szCs w:val="24"/>
+        </w:rPr>
+        <w:t>`onchain_verification_message`</w:t>
+      </w:r>
+    </w:p>
+    <w:p>
+      <w:pPr>
+        <w:pStyle w:val="16"/>
+        <w:rPr>
+          <w:rFonts w:hint="eastAsia" w:ascii="微软雅黑" w:hAnsi="微软雅黑" w:eastAsia="微软雅黑" w:cs="微软雅黑"/>
+          <w:color w:val="auto"/>
+          <w:sz w:val="24"/>
+          <w:szCs w:val="24"/>
+        </w:rPr>
+      </w:pPr>
+      <w:r>
+        <w:rPr>
+          <w:rFonts w:hint="eastAsia" w:ascii="微软雅黑" w:hAnsi="微软雅黑" w:eastAsia="微软雅黑" w:cs="微软雅黑"/>
+          <w:color w:val="auto"/>
+          <w:sz w:val="24"/>
+          <w:szCs w:val="24"/>
+        </w:rPr>
+        <w:t>`onchain_tx_hash`</w:t>
+      </w:r>
+    </w:p>
+    <w:p>
+      <w:pPr>
+        <w:pStyle w:val="16"/>
+        <w:rPr>
+          <w:rFonts w:hint="eastAsia" w:ascii="微软雅黑" w:hAnsi="微软雅黑" w:eastAsia="微软雅黑" w:cs="微软雅黑"/>
+          <w:color w:val="auto"/>
+          <w:sz w:val="24"/>
+          <w:szCs w:val="24"/>
+        </w:rPr>
+      </w:pPr>
+      <w:r>
+        <w:rPr>
+          <w:rFonts w:hint="eastAsia" w:ascii="微软雅黑" w:hAnsi="微软雅黑" w:eastAsia="微软雅黑" w:cs="微软雅黑"/>
+          <w:color w:val="auto"/>
+          <w:sz w:val="24"/>
+          <w:szCs w:val="24"/>
+        </w:rPr>
+        <w:t>`onchain_data_id`</w:t>
+      </w:r>
+    </w:p>
+    <w:p>
+      <w:pPr>
+        <w:rPr>
+          <w:rFonts w:hint="eastAsia" w:ascii="微软雅黑" w:hAnsi="微软雅黑" w:eastAsia="微软雅黑" w:cs="微软雅黑"/>
+          <w:color w:val="auto"/>
+          <w:sz w:val="24"/>
+          <w:szCs w:val="24"/>
+        </w:rPr>
+      </w:pPr>
+    </w:p>
+    <w:p>
+      <w:pPr>
+        <w:rPr>
+          <w:rFonts w:hint="eastAsia" w:ascii="微软雅黑" w:hAnsi="微软雅黑" w:eastAsia="微软雅黑" w:cs="微软雅黑"/>
+          <w:color w:val="auto"/>
+          <w:sz w:val="24"/>
+          <w:szCs w:val="24"/>
+        </w:rPr>
+      </w:pPr>
+      <w:r>
+        <w:rPr>
+          <w:rFonts w:hint="eastAsia" w:ascii="微软雅黑" w:hAnsi="微软雅黑" w:eastAsia="微软雅黑" w:cs="微软雅黑"/>
+          <w:color w:val="auto"/>
+          <w:sz w:val="24"/>
+          <w:szCs w:val="24"/>
+        </w:rPr>
+        <w:t>这样用户能区分“验真失败”“链服务不可用”“未生成存证”等不同情况。</w:t>
+      </w:r>
+    </w:p>
+    <w:p>
+      <w:pPr>
+        <w:rPr>
+          <w:rFonts w:hint="eastAsia" w:ascii="微软雅黑" w:hAnsi="微软雅黑" w:eastAsia="微软雅黑" w:cs="微软雅黑"/>
+          <w:color w:val="auto"/>
+          <w:sz w:val="24"/>
+          <w:szCs w:val="24"/>
+        </w:rPr>
+      </w:pPr>
+    </w:p>
+    <w:p>
+      <w:pPr>
+        <w:rPr>
+          <w:rFonts w:hint="eastAsia" w:ascii="微软雅黑" w:hAnsi="微软雅黑" w:eastAsia="微软雅黑" w:cs="微软雅黑"/>
+          <w:color w:val="auto"/>
+          <w:sz w:val="24"/>
+          <w:szCs w:val="24"/>
+        </w:rPr>
+      </w:pPr>
       <w:bookmarkStart w:id="0" w:name="_GoBack"/>
       <w:bookmarkEnd w:id="0"/>
-    </w:p>
-    <w:p>
-      <w:pPr>
-        <w:rPr>
-          <w:rFonts w:hint="eastAsia" w:ascii="微软雅黑" w:hAnsi="微软雅黑" w:eastAsia="微软雅黑" w:cs="微软雅黑"/>
-          <w:color w:val="auto"/>
-          <w:sz w:val="24"/>
-          <w:szCs w:val="24"/>
-        </w:rPr>
-      </w:pPr>
-    </w:p>
-    <w:p>
-      <w:pPr>
-        <w:pStyle w:val="4"/>
-        <w:rPr>
-          <w:rFonts w:hint="eastAsia" w:ascii="微软雅黑" w:hAnsi="微软雅黑" w:eastAsia="微软雅黑" w:cs="微软雅黑"/>
-          <w:color w:val="auto"/>
-          <w:sz w:val="24"/>
-          <w:szCs w:val="24"/>
-        </w:rPr>
-      </w:pPr>
-      <w:r>
-        <w:rPr>
-          <w:rFonts w:hint="eastAsia" w:ascii="微软雅黑" w:hAnsi="微软雅黑" w:eastAsia="微软雅黑" w:cs="微软雅黑"/>
-          <w:color w:val="auto"/>
-          <w:sz w:val="24"/>
-          <w:szCs w:val="24"/>
-        </w:rPr>
-        <w:t>7. 业务接口映射</w:t>
-      </w:r>
-    </w:p>
-    <w:p>
-      <w:pPr>
-        <w:rPr>
-          <w:rFonts w:hint="eastAsia" w:ascii="微软雅黑" w:hAnsi="微软雅黑" w:eastAsia="微软雅黑" w:cs="微软雅黑"/>
-          <w:color w:val="auto"/>
-          <w:sz w:val="24"/>
-          <w:szCs w:val="24"/>
-        </w:rPr>
-      </w:pPr>
-    </w:p>
-    <w:p>
-      <w:pPr>
-        <w:pStyle w:val="5"/>
-        <w:rPr>
-          <w:rFonts w:hint="eastAsia" w:ascii="微软雅黑" w:hAnsi="微软雅黑" w:eastAsia="微软雅黑" w:cs="微软雅黑"/>
-          <w:color w:val="auto"/>
-          <w:sz w:val="24"/>
-          <w:szCs w:val="24"/>
-        </w:rPr>
-      </w:pPr>
-      <w:r>
-        <w:rPr>
-          <w:rFonts w:hint="eastAsia" w:ascii="微软雅黑" w:hAnsi="微软雅黑" w:eastAsia="微软雅黑" w:cs="微软雅黑"/>
-          <w:color w:val="auto"/>
-          <w:sz w:val="24"/>
-          <w:szCs w:val="24"/>
-        </w:rPr>
-        <w:t>7.1 创建健康记录</w:t>
-      </w:r>
-    </w:p>
-    <w:p>
-      <w:pPr>
-        <w:rPr>
-          <w:rFonts w:hint="eastAsia" w:ascii="微软雅黑" w:hAnsi="微软雅黑" w:eastAsia="微软雅黑" w:cs="微软雅黑"/>
-          <w:color w:val="auto"/>
-          <w:sz w:val="24"/>
-          <w:szCs w:val="24"/>
-        </w:rPr>
-      </w:pPr>
-      <w:r>
-        <w:rPr>
-          <w:rFonts w:hint="eastAsia" w:ascii="微软雅黑" w:hAnsi="微软雅黑" w:eastAsia="微软雅黑" w:cs="微软雅黑"/>
-          <w:color w:val="auto"/>
-          <w:sz w:val="24"/>
-          <w:szCs w:val="24"/>
-        </w:rPr>
-        <w:t>业务接口：</w:t>
-      </w:r>
-    </w:p>
-    <w:p>
-      <w:pPr>
-        <w:rPr>
-          <w:rFonts w:hint="eastAsia" w:ascii="微软雅黑" w:hAnsi="微软雅黑" w:eastAsia="微软雅黑" w:cs="微软雅黑"/>
-          <w:color w:val="auto"/>
-          <w:sz w:val="24"/>
-          <w:szCs w:val="24"/>
-        </w:rPr>
-      </w:pPr>
-    </w:p>
-    <w:p>
-      <w:pPr>
-        <w:rPr>
-          <w:rFonts w:hint="eastAsia" w:ascii="微软雅黑" w:hAnsi="微软雅黑" w:eastAsia="微软雅黑" w:cs="微软雅黑"/>
-          <w:color w:val="auto"/>
-          <w:sz w:val="24"/>
-          <w:szCs w:val="24"/>
-        </w:rPr>
-      </w:pPr>
-      <w:r>
-        <w:rPr>
-          <w:rFonts w:hint="eastAsia" w:ascii="微软雅黑" w:hAnsi="微软雅黑" w:eastAsia="微软雅黑" w:cs="微软雅黑"/>
-          <w:color w:val="auto"/>
-          <w:sz w:val="24"/>
-          <w:szCs w:val="24"/>
-        </w:rPr>
-        <w:t>`POST /api/health/records`</w:t>
-      </w:r>
-    </w:p>
-    <w:p>
-      <w:pPr>
-        <w:rPr>
-          <w:rFonts w:hint="eastAsia" w:ascii="微软雅黑" w:hAnsi="微软雅黑" w:eastAsia="微软雅黑" w:cs="微软雅黑"/>
-          <w:color w:val="auto"/>
-          <w:sz w:val="24"/>
-          <w:szCs w:val="24"/>
-        </w:rPr>
-      </w:pPr>
-    </w:p>
-    <w:p>
-      <w:pPr>
-        <w:rPr>
-          <w:rFonts w:hint="eastAsia" w:ascii="微软雅黑" w:hAnsi="微软雅黑" w:eastAsia="微软雅黑" w:cs="微软雅黑"/>
-          <w:color w:val="auto"/>
-          <w:sz w:val="24"/>
-          <w:szCs w:val="24"/>
-        </w:rPr>
-      </w:pPr>
-      <w:r>
-        <w:rPr>
-          <w:rFonts w:hint="eastAsia" w:ascii="微软雅黑" w:hAnsi="微软雅黑" w:eastAsia="微软雅黑" w:cs="微软雅黑"/>
-          <w:color w:val="auto"/>
-          <w:sz w:val="24"/>
-          <w:szCs w:val="24"/>
-        </w:rPr>
-        <w:t>链上动作：</w:t>
-      </w:r>
-    </w:p>
-    <w:p>
-      <w:pPr>
-        <w:pStyle w:val="16"/>
-        <w:rPr>
-          <w:rFonts w:hint="eastAsia" w:ascii="微软雅黑" w:hAnsi="微软雅黑" w:eastAsia="微软雅黑" w:cs="微软雅黑"/>
-          <w:color w:val="auto"/>
-          <w:sz w:val="24"/>
-          <w:szCs w:val="24"/>
-        </w:rPr>
-      </w:pPr>
-      <w:r>
-        <w:rPr>
-          <w:rFonts w:hint="eastAsia" w:ascii="微软雅黑" w:hAnsi="微软雅黑" w:eastAsia="微软雅黑" w:cs="微软雅黑"/>
-          <w:color w:val="auto"/>
-          <w:sz w:val="24"/>
-          <w:szCs w:val="24"/>
-        </w:rPr>
-        <w:t>计算当前记录摘要；</w:t>
-      </w:r>
-    </w:p>
-    <w:p>
-      <w:pPr>
-        <w:pStyle w:val="16"/>
-        <w:rPr>
-          <w:rFonts w:hint="eastAsia" w:ascii="微软雅黑" w:hAnsi="微软雅黑" w:eastAsia="微软雅黑" w:cs="微软雅黑"/>
-          <w:color w:val="auto"/>
-          <w:sz w:val="24"/>
-          <w:szCs w:val="24"/>
-        </w:rPr>
-      </w:pPr>
-      <w:r>
-        <w:rPr>
-          <w:rFonts w:hint="eastAsia" w:ascii="微软雅黑" w:hAnsi="微软雅黑" w:eastAsia="微软雅黑" w:cs="微软雅黑"/>
-          <w:color w:val="auto"/>
-          <w:sz w:val="24"/>
-          <w:szCs w:val="24"/>
-        </w:rPr>
-        <w:t>若区块链服务可用，则调用 `storeHealthData`；</w:t>
-      </w:r>
-    </w:p>
-    <w:p>
-      <w:pPr>
-        <w:pStyle w:val="16"/>
-        <w:rPr>
-          <w:rFonts w:hint="eastAsia" w:ascii="微软雅黑" w:hAnsi="微软雅黑" w:eastAsia="微软雅黑" w:cs="微软雅黑"/>
-          <w:color w:val="auto"/>
-          <w:sz w:val="24"/>
-          <w:szCs w:val="24"/>
-        </w:rPr>
-      </w:pPr>
-      <w:r>
-        <w:rPr>
-          <w:rFonts w:hint="eastAsia" w:ascii="微软雅黑" w:hAnsi="微软雅黑" w:eastAsia="微软雅黑" w:cs="微软雅黑"/>
-          <w:color w:val="auto"/>
-          <w:sz w:val="24"/>
-          <w:szCs w:val="24"/>
-        </w:rPr>
-        <w:t>若区块链服务不可用，则允许上传成功，并返回上链告警。</w:t>
-      </w:r>
-    </w:p>
-    <w:p>
-      <w:pPr>
-        <w:rPr>
-          <w:rFonts w:hint="eastAsia" w:ascii="微软雅黑" w:hAnsi="微软雅黑" w:eastAsia="微软雅黑" w:cs="微软雅黑"/>
-          <w:color w:val="auto"/>
-          <w:sz w:val="24"/>
-          <w:szCs w:val="24"/>
-        </w:rPr>
-      </w:pPr>
-    </w:p>
-    <w:p>
-      <w:pPr>
-        <w:rPr>
-          <w:rFonts w:hint="eastAsia" w:ascii="微软雅黑" w:hAnsi="微软雅黑" w:eastAsia="微软雅黑" w:cs="微软雅黑"/>
-          <w:color w:val="auto"/>
-          <w:sz w:val="24"/>
-          <w:szCs w:val="24"/>
-        </w:rPr>
-      </w:pPr>
-      <w:r>
-        <w:rPr>
-          <w:rFonts w:hint="eastAsia" w:ascii="微软雅黑" w:hAnsi="微软雅黑" w:eastAsia="微软雅黑" w:cs="微软雅黑"/>
-          <w:color w:val="auto"/>
-          <w:sz w:val="24"/>
-          <w:szCs w:val="24"/>
-        </w:rPr>
-        <w:t>关键返回字段：</w:t>
-      </w:r>
-    </w:p>
-    <w:p>
-      <w:pPr>
-        <w:pStyle w:val="16"/>
-        <w:rPr>
-          <w:rFonts w:hint="eastAsia" w:ascii="微软雅黑" w:hAnsi="微软雅黑" w:eastAsia="微软雅黑" w:cs="微软雅黑"/>
-          <w:color w:val="auto"/>
-          <w:sz w:val="24"/>
-          <w:szCs w:val="24"/>
-        </w:rPr>
-      </w:pPr>
-      <w:r>
-        <w:rPr>
-          <w:rFonts w:hint="eastAsia" w:ascii="微软雅黑" w:hAnsi="微软雅黑" w:eastAsia="微软雅黑" w:cs="微软雅黑"/>
-          <w:color w:val="auto"/>
-          <w:sz w:val="24"/>
-          <w:szCs w:val="24"/>
-        </w:rPr>
-        <w:t>`onchain_data_id`</w:t>
-      </w:r>
-    </w:p>
-    <w:p>
-      <w:pPr>
-        <w:pStyle w:val="16"/>
-        <w:rPr>
-          <w:rFonts w:hint="eastAsia" w:ascii="微软雅黑" w:hAnsi="微软雅黑" w:eastAsia="微软雅黑" w:cs="微软雅黑"/>
-          <w:color w:val="auto"/>
-          <w:sz w:val="24"/>
-          <w:szCs w:val="24"/>
-        </w:rPr>
-      </w:pPr>
-      <w:r>
-        <w:rPr>
-          <w:rFonts w:hint="eastAsia" w:ascii="微软雅黑" w:hAnsi="微软雅黑" w:eastAsia="微软雅黑" w:cs="微软雅黑"/>
-          <w:color w:val="auto"/>
-          <w:sz w:val="24"/>
-          <w:szCs w:val="24"/>
-        </w:rPr>
-        <w:t>`onchain_tx_hash`</w:t>
-      </w:r>
-    </w:p>
-    <w:p>
-      <w:pPr>
-        <w:pStyle w:val="16"/>
-        <w:rPr>
-          <w:rFonts w:hint="eastAsia" w:ascii="微软雅黑" w:hAnsi="微软雅黑" w:eastAsia="微软雅黑" w:cs="微软雅黑"/>
-          <w:color w:val="auto"/>
-          <w:sz w:val="24"/>
-          <w:szCs w:val="24"/>
-        </w:rPr>
-      </w:pPr>
-      <w:r>
-        <w:rPr>
-          <w:rFonts w:hint="eastAsia" w:ascii="微软雅黑" w:hAnsi="微软雅黑" w:eastAsia="微软雅黑" w:cs="微软雅黑"/>
-          <w:color w:val="auto"/>
-          <w:sz w:val="24"/>
-          <w:szCs w:val="24"/>
-        </w:rPr>
-        <w:t>`onchain_warning`</w:t>
-      </w:r>
-    </w:p>
-    <w:p>
-      <w:pPr>
-        <w:pStyle w:val="16"/>
-        <w:rPr>
-          <w:rFonts w:hint="eastAsia" w:ascii="微软雅黑" w:hAnsi="微软雅黑" w:eastAsia="微软雅黑" w:cs="微软雅黑"/>
-          <w:color w:val="auto"/>
-          <w:sz w:val="24"/>
-          <w:szCs w:val="24"/>
-        </w:rPr>
-      </w:pPr>
-      <w:r>
-        <w:rPr>
-          <w:rFonts w:hint="eastAsia" w:ascii="微软雅黑" w:hAnsi="微软雅黑" w:eastAsia="微软雅黑" w:cs="微软雅黑"/>
-          <w:color w:val="auto"/>
-          <w:sz w:val="24"/>
-          <w:szCs w:val="24"/>
-        </w:rPr>
-        <w:t>`onchain_verification_status`</w:t>
-      </w:r>
-    </w:p>
-    <w:p>
-      <w:pPr>
-        <w:pStyle w:val="16"/>
-        <w:rPr>
-          <w:rFonts w:hint="eastAsia" w:ascii="微软雅黑" w:hAnsi="微软雅黑" w:eastAsia="微软雅黑" w:cs="微软雅黑"/>
-          <w:color w:val="auto"/>
-          <w:sz w:val="24"/>
-          <w:szCs w:val="24"/>
-        </w:rPr>
-      </w:pPr>
-      <w:r>
-        <w:rPr>
-          <w:rFonts w:hint="eastAsia" w:ascii="微软雅黑" w:hAnsi="微软雅黑" w:eastAsia="微软雅黑" w:cs="微软雅黑"/>
-          <w:color w:val="auto"/>
-          <w:sz w:val="24"/>
-          <w:szCs w:val="24"/>
-        </w:rPr>
-        <w:t>`onchain_verification_message`</w:t>
-      </w:r>
-    </w:p>
-    <w:p>
-      <w:pPr>
-        <w:rPr>
-          <w:rFonts w:hint="eastAsia" w:ascii="微软雅黑" w:hAnsi="微软雅黑" w:eastAsia="微软雅黑" w:cs="微软雅黑"/>
-          <w:color w:val="auto"/>
-          <w:sz w:val="24"/>
-          <w:szCs w:val="24"/>
-        </w:rPr>
-      </w:pPr>
-    </w:p>
-    <w:p>
-      <w:pPr>
-        <w:pStyle w:val="5"/>
-        <w:rPr>
-          <w:rFonts w:hint="eastAsia" w:ascii="微软雅黑" w:hAnsi="微软雅黑" w:eastAsia="微软雅黑" w:cs="微软雅黑"/>
-          <w:color w:val="auto"/>
-          <w:sz w:val="24"/>
-          <w:szCs w:val="24"/>
-        </w:rPr>
-      </w:pPr>
-      <w:r>
-        <w:rPr>
-          <w:rFonts w:hint="eastAsia" w:ascii="微软雅黑" w:hAnsi="微软雅黑" w:eastAsia="微软雅黑" w:cs="微软雅黑"/>
-          <w:color w:val="auto"/>
-          <w:sz w:val="24"/>
-          <w:szCs w:val="24"/>
-        </w:rPr>
-        <w:t>7.2 更新健康记录</w:t>
-      </w:r>
-    </w:p>
-    <w:p>
-      <w:pPr>
-        <w:rPr>
-          <w:rFonts w:hint="eastAsia" w:ascii="微软雅黑" w:hAnsi="微软雅黑" w:eastAsia="微软雅黑" w:cs="微软雅黑"/>
-          <w:color w:val="auto"/>
-          <w:sz w:val="24"/>
-          <w:szCs w:val="24"/>
-        </w:rPr>
-      </w:pPr>
-      <w:r>
-        <w:rPr>
-          <w:rFonts w:hint="eastAsia" w:ascii="微软雅黑" w:hAnsi="微软雅黑" w:eastAsia="微软雅黑" w:cs="微软雅黑"/>
-          <w:color w:val="auto"/>
-          <w:sz w:val="24"/>
-          <w:szCs w:val="24"/>
-        </w:rPr>
-        <w:t>业务接口：</w:t>
-      </w:r>
-    </w:p>
-    <w:p>
-      <w:pPr>
-        <w:rPr>
-          <w:rFonts w:hint="eastAsia" w:ascii="微软雅黑" w:hAnsi="微软雅黑" w:eastAsia="微软雅黑" w:cs="微软雅黑"/>
-          <w:color w:val="auto"/>
-          <w:sz w:val="24"/>
-          <w:szCs w:val="24"/>
-        </w:rPr>
-      </w:pPr>
-    </w:p>
-    <w:p>
-      <w:pPr>
-        <w:rPr>
-          <w:rFonts w:hint="eastAsia" w:ascii="微软雅黑" w:hAnsi="微软雅黑" w:eastAsia="微软雅黑" w:cs="微软雅黑"/>
-          <w:color w:val="auto"/>
-          <w:sz w:val="24"/>
-          <w:szCs w:val="24"/>
-        </w:rPr>
-      </w:pPr>
-      <w:r>
-        <w:rPr>
-          <w:rFonts w:hint="eastAsia" w:ascii="微软雅黑" w:hAnsi="微软雅黑" w:eastAsia="微软雅黑" w:cs="微软雅黑"/>
-          <w:color w:val="auto"/>
-          <w:sz w:val="24"/>
-          <w:szCs w:val="24"/>
-        </w:rPr>
-        <w:t>`PUT /api/health/records/{record_id}`</w:t>
-      </w:r>
-    </w:p>
-    <w:p>
-      <w:pPr>
-        <w:rPr>
-          <w:rFonts w:hint="eastAsia" w:ascii="微软雅黑" w:hAnsi="微软雅黑" w:eastAsia="微软雅黑" w:cs="微软雅黑"/>
-          <w:color w:val="auto"/>
-          <w:sz w:val="24"/>
-          <w:szCs w:val="24"/>
-        </w:rPr>
-      </w:pPr>
-    </w:p>
-    <w:p>
-      <w:pPr>
-        <w:rPr>
-          <w:rFonts w:hint="eastAsia" w:ascii="微软雅黑" w:hAnsi="微软雅黑" w:eastAsia="微软雅黑" w:cs="微软雅黑"/>
-          <w:color w:val="auto"/>
-          <w:sz w:val="24"/>
-          <w:szCs w:val="24"/>
-        </w:rPr>
-      </w:pPr>
-      <w:r>
-        <w:rPr>
-          <w:rFonts w:hint="eastAsia" w:ascii="微软雅黑" w:hAnsi="微软雅黑" w:eastAsia="微软雅黑" w:cs="微软雅黑"/>
-          <w:color w:val="auto"/>
-          <w:sz w:val="24"/>
-          <w:szCs w:val="24"/>
-        </w:rPr>
-        <w:t>链上动作：</w:t>
-      </w:r>
-    </w:p>
-    <w:p>
-      <w:pPr>
-        <w:pStyle w:val="16"/>
-        <w:rPr>
-          <w:rFonts w:hint="eastAsia" w:ascii="微软雅黑" w:hAnsi="微软雅黑" w:eastAsia="微软雅黑" w:cs="微软雅黑"/>
-          <w:color w:val="auto"/>
-          <w:sz w:val="24"/>
-          <w:szCs w:val="24"/>
-        </w:rPr>
-      </w:pPr>
-      <w:r>
-        <w:rPr>
-          <w:rFonts w:hint="eastAsia" w:ascii="微软雅黑" w:hAnsi="微软雅黑" w:eastAsia="微软雅黑" w:cs="微软雅黑"/>
-          <w:color w:val="auto"/>
-          <w:sz w:val="24"/>
-          <w:szCs w:val="24"/>
-        </w:rPr>
-        <w:t>若已有 `onchain_data_id`，则调用 `updateHealthData`；</w:t>
-      </w:r>
-    </w:p>
-    <w:p>
-      <w:pPr>
-        <w:pStyle w:val="16"/>
-        <w:rPr>
-          <w:rFonts w:hint="eastAsia" w:ascii="微软雅黑" w:hAnsi="微软雅黑" w:eastAsia="微软雅黑" w:cs="微软雅黑"/>
-          <w:color w:val="auto"/>
-          <w:sz w:val="24"/>
-          <w:szCs w:val="24"/>
-        </w:rPr>
-      </w:pPr>
-      <w:r>
-        <w:rPr>
-          <w:rFonts w:hint="eastAsia" w:ascii="微软雅黑" w:hAnsi="微软雅黑" w:eastAsia="微软雅黑" w:cs="微软雅黑"/>
-          <w:color w:val="auto"/>
-          <w:sz w:val="24"/>
-          <w:szCs w:val="24"/>
-        </w:rPr>
-        <w:t>若没有 `onchain_data_id`，则在链服务可用时尝试新建存证；</w:t>
-      </w:r>
-    </w:p>
-    <w:p>
-      <w:pPr>
-        <w:pStyle w:val="16"/>
-        <w:rPr>
-          <w:rFonts w:hint="eastAsia" w:ascii="微软雅黑" w:hAnsi="微软雅黑" w:eastAsia="微软雅黑" w:cs="微软雅黑"/>
-          <w:color w:val="auto"/>
-          <w:sz w:val="24"/>
-          <w:szCs w:val="24"/>
-        </w:rPr>
-      </w:pPr>
-      <w:r>
-        <w:rPr>
-          <w:rFonts w:hint="eastAsia" w:ascii="微软雅黑" w:hAnsi="微软雅黑" w:eastAsia="微软雅黑" w:cs="微软雅黑"/>
-          <w:color w:val="auto"/>
-          <w:sz w:val="24"/>
-          <w:szCs w:val="24"/>
-        </w:rPr>
-        <w:t>链服务不可用时不阻断业务更新。</w:t>
-      </w:r>
-    </w:p>
-    <w:p>
-      <w:pPr>
-        <w:rPr>
-          <w:rFonts w:hint="eastAsia" w:ascii="微软雅黑" w:hAnsi="微软雅黑" w:eastAsia="微软雅黑" w:cs="微软雅黑"/>
-          <w:color w:val="auto"/>
-          <w:sz w:val="24"/>
-          <w:szCs w:val="24"/>
-        </w:rPr>
-      </w:pPr>
-    </w:p>
-    <w:p>
-      <w:pPr>
-        <w:pStyle w:val="5"/>
-        <w:rPr>
-          <w:rFonts w:hint="eastAsia" w:ascii="微软雅黑" w:hAnsi="微软雅黑" w:eastAsia="微软雅黑" w:cs="微软雅黑"/>
-          <w:color w:val="auto"/>
-          <w:sz w:val="24"/>
-          <w:szCs w:val="24"/>
-        </w:rPr>
-      </w:pPr>
-      <w:r>
-        <w:rPr>
-          <w:rFonts w:hint="eastAsia" w:ascii="微软雅黑" w:hAnsi="微软雅黑" w:eastAsia="微软雅黑" w:cs="微软雅黑"/>
-          <w:color w:val="auto"/>
-          <w:sz w:val="24"/>
-          <w:szCs w:val="24"/>
-        </w:rPr>
-        <w:t>7.3 查询与验真</w:t>
-      </w:r>
-    </w:p>
-    <w:p>
-      <w:pPr>
-        <w:rPr>
-          <w:rFonts w:hint="eastAsia" w:ascii="微软雅黑" w:hAnsi="微软雅黑" w:eastAsia="微软雅黑" w:cs="微软雅黑"/>
-          <w:color w:val="auto"/>
-          <w:sz w:val="24"/>
-          <w:szCs w:val="24"/>
-        </w:rPr>
-      </w:pPr>
-      <w:r>
-        <w:rPr>
-          <w:rFonts w:hint="eastAsia" w:ascii="微软雅黑" w:hAnsi="微软雅黑" w:eastAsia="微软雅黑" w:cs="微软雅黑"/>
-          <w:color w:val="auto"/>
-          <w:sz w:val="24"/>
-          <w:szCs w:val="24"/>
-        </w:rPr>
-        <w:t>业务接口：</w:t>
-      </w:r>
-    </w:p>
-    <w:p>
-      <w:pPr>
-        <w:rPr>
-          <w:rFonts w:hint="eastAsia" w:ascii="微软雅黑" w:hAnsi="微软雅黑" w:eastAsia="微软雅黑" w:cs="微软雅黑"/>
-          <w:color w:val="auto"/>
-          <w:sz w:val="24"/>
-          <w:szCs w:val="24"/>
-        </w:rPr>
-      </w:pPr>
-    </w:p>
-    <w:p>
-      <w:pPr>
-        <w:rPr>
-          <w:rFonts w:hint="eastAsia" w:ascii="微软雅黑" w:hAnsi="微软雅黑" w:eastAsia="微软雅黑" w:cs="微软雅黑"/>
-          <w:color w:val="auto"/>
-          <w:sz w:val="24"/>
-          <w:szCs w:val="24"/>
-        </w:rPr>
-      </w:pPr>
-      <w:r>
-        <w:rPr>
-          <w:rFonts w:hint="eastAsia" w:ascii="微软雅黑" w:hAnsi="微软雅黑" w:eastAsia="微软雅黑" w:cs="微软雅黑"/>
-          <w:color w:val="auto"/>
-          <w:sz w:val="24"/>
-          <w:szCs w:val="24"/>
-        </w:rPr>
-        <w:t>`GET /api/health/records`</w:t>
-      </w:r>
-    </w:p>
-    <w:p>
-      <w:pPr>
-        <w:rPr>
-          <w:rFonts w:hint="eastAsia" w:ascii="微软雅黑" w:hAnsi="微软雅黑" w:eastAsia="微软雅黑" w:cs="微软雅黑"/>
-          <w:color w:val="auto"/>
-          <w:sz w:val="24"/>
-          <w:szCs w:val="24"/>
-        </w:rPr>
-      </w:pPr>
-    </w:p>
-    <w:p>
-      <w:pPr>
-        <w:rPr>
-          <w:rFonts w:hint="eastAsia" w:ascii="微软雅黑" w:hAnsi="微软雅黑" w:eastAsia="微软雅黑" w:cs="微软雅黑"/>
-          <w:color w:val="auto"/>
-          <w:sz w:val="24"/>
-          <w:szCs w:val="24"/>
-        </w:rPr>
-      </w:pPr>
-      <w:r>
-        <w:rPr>
-          <w:rFonts w:hint="eastAsia" w:ascii="微软雅黑" w:hAnsi="微软雅黑" w:eastAsia="微软雅黑" w:cs="微软雅黑"/>
-          <w:color w:val="auto"/>
-          <w:sz w:val="24"/>
-          <w:szCs w:val="24"/>
-        </w:rPr>
-        <w:t>`GET /api/health/records/{record_id}`</w:t>
-      </w:r>
-    </w:p>
-    <w:p>
-      <w:pPr>
-        <w:rPr>
-          <w:rFonts w:hint="eastAsia" w:ascii="微软雅黑" w:hAnsi="微软雅黑" w:eastAsia="微软雅黑" w:cs="微软雅黑"/>
-          <w:color w:val="auto"/>
-          <w:sz w:val="24"/>
-          <w:szCs w:val="24"/>
-        </w:rPr>
-      </w:pPr>
-    </w:p>
-    <w:p>
-      <w:pPr>
-        <w:rPr>
-          <w:rFonts w:hint="eastAsia" w:ascii="微软雅黑" w:hAnsi="微软雅黑" w:eastAsia="微软雅黑" w:cs="微软雅黑"/>
-          <w:color w:val="auto"/>
-          <w:sz w:val="24"/>
-          <w:szCs w:val="24"/>
-        </w:rPr>
-      </w:pPr>
-      <w:r>
-        <w:rPr>
-          <w:rFonts w:hint="eastAsia" w:ascii="微软雅黑" w:hAnsi="微软雅黑" w:eastAsia="微软雅黑" w:cs="微软雅黑"/>
-          <w:color w:val="auto"/>
-          <w:sz w:val="24"/>
-          <w:szCs w:val="24"/>
-        </w:rPr>
-        <w:t>链上动作：</w:t>
-      </w:r>
-    </w:p>
-    <w:p>
-      <w:pPr>
-        <w:pStyle w:val="16"/>
-        <w:rPr>
-          <w:rFonts w:hint="eastAsia" w:ascii="微软雅黑" w:hAnsi="微软雅黑" w:eastAsia="微软雅黑" w:cs="微软雅黑"/>
-          <w:color w:val="auto"/>
-          <w:sz w:val="24"/>
-          <w:szCs w:val="24"/>
-        </w:rPr>
-      </w:pPr>
-      <w:r>
-        <w:rPr>
-          <w:rFonts w:hint="eastAsia" w:ascii="微软雅黑" w:hAnsi="微软雅黑" w:eastAsia="微软雅黑" w:cs="微软雅黑"/>
-          <w:color w:val="auto"/>
-          <w:sz w:val="24"/>
-          <w:szCs w:val="24"/>
-        </w:rPr>
-        <w:t>若链服务可用且记录存在 `onchain_data_id`，查询链上记录；</w:t>
-      </w:r>
-    </w:p>
-    <w:p>
-      <w:pPr>
-        <w:pStyle w:val="16"/>
-        <w:rPr>
-          <w:rFonts w:hint="eastAsia" w:ascii="微软雅黑" w:hAnsi="微软雅黑" w:eastAsia="微软雅黑" w:cs="微软雅黑"/>
-          <w:color w:val="auto"/>
-          <w:sz w:val="24"/>
-          <w:szCs w:val="24"/>
-        </w:rPr>
-      </w:pPr>
-      <w:r>
-        <w:rPr>
-          <w:rFonts w:hint="eastAsia" w:ascii="微软雅黑" w:hAnsi="微软雅黑" w:eastAsia="微软雅黑" w:cs="微软雅黑"/>
-          <w:color w:val="auto"/>
-          <w:sz w:val="24"/>
-          <w:szCs w:val="24"/>
-        </w:rPr>
-        <w:t>重新计算当前数据摘要；</w:t>
-      </w:r>
-    </w:p>
-    <w:p>
-      <w:pPr>
-        <w:pStyle w:val="16"/>
-        <w:rPr>
-          <w:rFonts w:hint="eastAsia" w:ascii="微软雅黑" w:hAnsi="微软雅黑" w:eastAsia="微软雅黑" w:cs="微软雅黑"/>
-          <w:color w:val="auto"/>
-          <w:sz w:val="24"/>
-          <w:szCs w:val="24"/>
-        </w:rPr>
-      </w:pPr>
-      <w:r>
-        <w:rPr>
-          <w:rFonts w:hint="eastAsia" w:ascii="微软雅黑" w:hAnsi="微软雅黑" w:eastAsia="微软雅黑" w:cs="微软雅黑"/>
-          <w:color w:val="auto"/>
-          <w:sz w:val="24"/>
-          <w:szCs w:val="24"/>
-        </w:rPr>
-        <w:t>对比链上哈希与当前摘要；</w:t>
-      </w:r>
-    </w:p>
-    <w:p>
-      <w:pPr>
-        <w:pStyle w:val="16"/>
-        <w:rPr>
-          <w:rFonts w:hint="eastAsia" w:ascii="微软雅黑" w:hAnsi="微软雅黑" w:eastAsia="微软雅黑" w:cs="微软雅黑"/>
-          <w:color w:val="auto"/>
-          <w:sz w:val="24"/>
-          <w:szCs w:val="24"/>
-        </w:rPr>
-      </w:pPr>
-      <w:r>
-        <w:rPr>
-          <w:rFonts w:hint="eastAsia" w:ascii="微软雅黑" w:hAnsi="微软雅黑" w:eastAsia="微软雅黑" w:cs="微软雅黑"/>
-          <w:color w:val="auto"/>
-          <w:sz w:val="24"/>
-          <w:szCs w:val="24"/>
-        </w:rPr>
-        <w:t>返回验真状态。</w:t>
-      </w:r>
-    </w:p>
-    <w:p>
-      <w:pPr>
-        <w:rPr>
-          <w:rFonts w:hint="eastAsia" w:ascii="微软雅黑" w:hAnsi="微软雅黑" w:eastAsia="微软雅黑" w:cs="微软雅黑"/>
-          <w:color w:val="auto"/>
-          <w:sz w:val="24"/>
-          <w:szCs w:val="24"/>
-        </w:rPr>
-      </w:pPr>
-    </w:p>
-    <w:p>
-      <w:pPr>
-        <w:rPr>
-          <w:rFonts w:hint="eastAsia" w:ascii="微软雅黑" w:hAnsi="微软雅黑" w:eastAsia="微软雅黑" w:cs="微软雅黑"/>
-          <w:color w:val="auto"/>
-          <w:sz w:val="24"/>
-          <w:szCs w:val="24"/>
-        </w:rPr>
-      </w:pPr>
-      <w:r>
-        <w:rPr>
-          <w:rFonts w:hint="eastAsia" w:ascii="微软雅黑" w:hAnsi="微软雅黑" w:eastAsia="微软雅黑" w:cs="微软雅黑"/>
-          <w:color w:val="auto"/>
-          <w:sz w:val="24"/>
-          <w:szCs w:val="24"/>
-        </w:rPr>
-        <w:t>----------------------------------------</w:t>
-      </w:r>
-    </w:p>
-    <w:p>
-      <w:pPr>
-        <w:rPr>
-          <w:rFonts w:hint="eastAsia" w:ascii="微软雅黑" w:hAnsi="微软雅黑" w:eastAsia="微软雅黑" w:cs="微软雅黑"/>
-          <w:color w:val="auto"/>
-          <w:sz w:val="24"/>
-          <w:szCs w:val="24"/>
-        </w:rPr>
-      </w:pPr>
-    </w:p>
-    <w:p>
-      <w:pPr>
-        <w:pStyle w:val="4"/>
-        <w:rPr>
-          <w:rFonts w:hint="eastAsia" w:ascii="微软雅黑" w:hAnsi="微软雅黑" w:eastAsia="微软雅黑" w:cs="微软雅黑"/>
-          <w:color w:val="auto"/>
-          <w:sz w:val="24"/>
-          <w:szCs w:val="24"/>
-        </w:rPr>
-      </w:pPr>
-      <w:r>
-        <w:rPr>
-          <w:rFonts w:hint="eastAsia" w:ascii="微软雅黑" w:hAnsi="微软雅黑" w:eastAsia="微软雅黑" w:cs="微软雅黑"/>
-          <w:color w:val="auto"/>
-          <w:sz w:val="24"/>
-          <w:szCs w:val="24"/>
-        </w:rPr>
-        <w:t>8. 验真状态说明</w:t>
-      </w:r>
-    </w:p>
-    <w:p>
-      <w:pPr>
-        <w:rPr>
-          <w:rFonts w:hint="eastAsia" w:ascii="微软雅黑" w:hAnsi="微软雅黑" w:eastAsia="微软雅黑" w:cs="微软雅黑"/>
-          <w:color w:val="auto"/>
-          <w:sz w:val="24"/>
-          <w:szCs w:val="24"/>
-        </w:rPr>
-      </w:pPr>
-    </w:p>
-    <w:p>
-      <w:pPr>
-        <w:pStyle w:val="5"/>
-        <w:rPr>
-          <w:rFonts w:hint="eastAsia" w:ascii="微软雅黑" w:hAnsi="微软雅黑" w:eastAsia="微软雅黑" w:cs="微软雅黑"/>
-          <w:color w:val="auto"/>
-          <w:sz w:val="24"/>
-          <w:szCs w:val="24"/>
-        </w:rPr>
-      </w:pPr>
-      <w:r>
-        <w:rPr>
-          <w:rFonts w:hint="eastAsia" w:ascii="微软雅黑" w:hAnsi="微软雅黑" w:eastAsia="微软雅黑" w:cs="微软雅黑"/>
-          <w:color w:val="auto"/>
-          <w:sz w:val="24"/>
-          <w:szCs w:val="24"/>
-        </w:rPr>
-        <w:t>8.1 verified</w:t>
-      </w:r>
-    </w:p>
-    <w:p>
-      <w:pPr>
-        <w:rPr>
-          <w:rFonts w:hint="eastAsia" w:ascii="微软雅黑" w:hAnsi="微软雅黑" w:eastAsia="微软雅黑" w:cs="微软雅黑"/>
-          <w:color w:val="auto"/>
-          <w:sz w:val="24"/>
-          <w:szCs w:val="24"/>
-        </w:rPr>
-      </w:pPr>
-      <w:r>
-        <w:rPr>
-          <w:rFonts w:hint="eastAsia" w:ascii="微软雅黑" w:hAnsi="微软雅黑" w:eastAsia="微软雅黑" w:cs="微软雅黑"/>
-          <w:color w:val="auto"/>
-          <w:sz w:val="24"/>
-          <w:szCs w:val="24"/>
-        </w:rPr>
-        <w:t>含义：</w:t>
-      </w:r>
-    </w:p>
-    <w:p>
-      <w:pPr>
-        <w:pStyle w:val="16"/>
-        <w:rPr>
-          <w:rFonts w:hint="eastAsia" w:ascii="微软雅黑" w:hAnsi="微软雅黑" w:eastAsia="微软雅黑" w:cs="微软雅黑"/>
-          <w:color w:val="auto"/>
-          <w:sz w:val="24"/>
-          <w:szCs w:val="24"/>
-        </w:rPr>
-      </w:pPr>
-      <w:r>
-        <w:rPr>
-          <w:rFonts w:hint="eastAsia" w:ascii="微软雅黑" w:hAnsi="微软雅黑" w:eastAsia="微软雅黑" w:cs="微软雅黑"/>
-          <w:color w:val="auto"/>
-          <w:sz w:val="24"/>
-          <w:szCs w:val="24"/>
-        </w:rPr>
-        <w:t>链上哈希与当前业务数据摘要一致；</w:t>
-      </w:r>
-    </w:p>
-    <w:p>
-      <w:pPr>
-        <w:pStyle w:val="16"/>
-        <w:rPr>
-          <w:rFonts w:hint="eastAsia" w:ascii="微软雅黑" w:hAnsi="微软雅黑" w:eastAsia="微软雅黑" w:cs="微软雅黑"/>
-          <w:color w:val="auto"/>
-          <w:sz w:val="24"/>
-          <w:szCs w:val="24"/>
-        </w:rPr>
-      </w:pPr>
-      <w:r>
-        <w:rPr>
-          <w:rFonts w:hint="eastAsia" w:ascii="微软雅黑" w:hAnsi="微软雅黑" w:eastAsia="微软雅黑" w:cs="微软雅黑"/>
-          <w:color w:val="auto"/>
-          <w:sz w:val="24"/>
-          <w:szCs w:val="24"/>
-        </w:rPr>
-        <w:t>说明当前记录与链上存证匹配。</w:t>
-      </w:r>
-    </w:p>
-    <w:p>
-      <w:pPr>
-        <w:rPr>
-          <w:rFonts w:hint="eastAsia" w:ascii="微软雅黑" w:hAnsi="微软雅黑" w:eastAsia="微软雅黑" w:cs="微软雅黑"/>
-          <w:color w:val="auto"/>
-          <w:sz w:val="24"/>
-          <w:szCs w:val="24"/>
-        </w:rPr>
-      </w:pPr>
-    </w:p>
-    <w:p>
-      <w:pPr>
-        <w:pStyle w:val="5"/>
-        <w:rPr>
-          <w:rFonts w:hint="eastAsia" w:ascii="微软雅黑" w:hAnsi="微软雅黑" w:eastAsia="微软雅黑" w:cs="微软雅黑"/>
-          <w:color w:val="auto"/>
-          <w:sz w:val="24"/>
-          <w:szCs w:val="24"/>
-        </w:rPr>
-      </w:pPr>
-      <w:r>
-        <w:rPr>
-          <w:rFonts w:hint="eastAsia" w:ascii="微软雅黑" w:hAnsi="微软雅黑" w:eastAsia="微软雅黑" w:cs="微软雅黑"/>
-          <w:color w:val="auto"/>
-          <w:sz w:val="24"/>
-          <w:szCs w:val="24"/>
-        </w:rPr>
-        <w:t>8.2 mismatch</w:t>
-      </w:r>
-    </w:p>
-    <w:p>
-      <w:pPr>
-        <w:rPr>
-          <w:rFonts w:hint="eastAsia" w:ascii="微软雅黑" w:hAnsi="微软雅黑" w:eastAsia="微软雅黑" w:cs="微软雅黑"/>
-          <w:color w:val="auto"/>
-          <w:sz w:val="24"/>
-          <w:szCs w:val="24"/>
-        </w:rPr>
-      </w:pPr>
-      <w:r>
-        <w:rPr>
-          <w:rFonts w:hint="eastAsia" w:ascii="微软雅黑" w:hAnsi="微软雅黑" w:eastAsia="微软雅黑" w:cs="微软雅黑"/>
-          <w:color w:val="auto"/>
-          <w:sz w:val="24"/>
-          <w:szCs w:val="24"/>
-        </w:rPr>
-        <w:t>含义：</w:t>
-      </w:r>
-    </w:p>
-    <w:p>
-      <w:pPr>
-        <w:pStyle w:val="16"/>
-        <w:rPr>
-          <w:rFonts w:hint="eastAsia" w:ascii="微软雅黑" w:hAnsi="微软雅黑" w:eastAsia="微软雅黑" w:cs="微软雅黑"/>
-          <w:color w:val="auto"/>
-          <w:sz w:val="24"/>
-          <w:szCs w:val="24"/>
-        </w:rPr>
-      </w:pPr>
-      <w:r>
-        <w:rPr>
-          <w:rFonts w:hint="eastAsia" w:ascii="微软雅黑" w:hAnsi="微软雅黑" w:eastAsia="微软雅黑" w:cs="微软雅黑"/>
-          <w:color w:val="auto"/>
-          <w:sz w:val="24"/>
-          <w:szCs w:val="24"/>
-        </w:rPr>
-        <w:t>链上哈希与当前业务数据摘要不一致；</w:t>
-      </w:r>
-    </w:p>
-    <w:p>
-      <w:pPr>
-        <w:pStyle w:val="16"/>
-        <w:rPr>
-          <w:rFonts w:hint="eastAsia" w:ascii="微软雅黑" w:hAnsi="微软雅黑" w:eastAsia="微软雅黑" w:cs="微软雅黑"/>
-          <w:color w:val="auto"/>
-          <w:sz w:val="24"/>
-          <w:szCs w:val="24"/>
-        </w:rPr>
-      </w:pPr>
-      <w:r>
-        <w:rPr>
-          <w:rFonts w:hint="eastAsia" w:ascii="微软雅黑" w:hAnsi="微软雅黑" w:eastAsia="微软雅黑" w:cs="微软雅黑"/>
-          <w:color w:val="auto"/>
-          <w:sz w:val="24"/>
-          <w:szCs w:val="24"/>
-        </w:rPr>
-        <w:t>可能是数据被修改、链上记录未同步或测试环境合约状态变化。</w:t>
-      </w:r>
-    </w:p>
-    <w:p>
-      <w:pPr>
-        <w:rPr>
-          <w:rFonts w:hint="eastAsia" w:ascii="微软雅黑" w:hAnsi="微软雅黑" w:eastAsia="微软雅黑" w:cs="微软雅黑"/>
-          <w:color w:val="auto"/>
-          <w:sz w:val="24"/>
-          <w:szCs w:val="24"/>
-        </w:rPr>
-      </w:pPr>
-    </w:p>
-    <w:p>
-      <w:pPr>
-        <w:pStyle w:val="5"/>
-        <w:rPr>
-          <w:rFonts w:hint="eastAsia" w:ascii="微软雅黑" w:hAnsi="微软雅黑" w:eastAsia="微软雅黑" w:cs="微软雅黑"/>
-          <w:color w:val="auto"/>
-          <w:sz w:val="24"/>
-          <w:szCs w:val="24"/>
-        </w:rPr>
-      </w:pPr>
-      <w:r>
-        <w:rPr>
-          <w:rFonts w:hint="eastAsia" w:ascii="微软雅黑" w:hAnsi="微软雅黑" w:eastAsia="微软雅黑" w:cs="微软雅黑"/>
-          <w:color w:val="auto"/>
-          <w:sz w:val="24"/>
-          <w:szCs w:val="24"/>
-        </w:rPr>
-        <w:t>8.3 no_proof</w:t>
-      </w:r>
-    </w:p>
-    <w:p>
-      <w:pPr>
-        <w:rPr>
-          <w:rFonts w:hint="eastAsia" w:ascii="微软雅黑" w:hAnsi="微软雅黑" w:eastAsia="微软雅黑" w:cs="微软雅黑"/>
-          <w:color w:val="auto"/>
-          <w:sz w:val="24"/>
-          <w:szCs w:val="24"/>
-        </w:rPr>
-      </w:pPr>
-      <w:r>
-        <w:rPr>
-          <w:rFonts w:hint="eastAsia" w:ascii="微软雅黑" w:hAnsi="微软雅黑" w:eastAsia="微软雅黑" w:cs="微软雅黑"/>
-          <w:color w:val="auto"/>
-          <w:sz w:val="24"/>
-          <w:szCs w:val="24"/>
-        </w:rPr>
-        <w:t>含义：</w:t>
-      </w:r>
-    </w:p>
-    <w:p>
-      <w:pPr>
-        <w:pStyle w:val="16"/>
-        <w:rPr>
-          <w:rFonts w:hint="eastAsia" w:ascii="微软雅黑" w:hAnsi="微软雅黑" w:eastAsia="微软雅黑" w:cs="微软雅黑"/>
-          <w:color w:val="auto"/>
-          <w:sz w:val="24"/>
-          <w:szCs w:val="24"/>
-        </w:rPr>
-      </w:pPr>
-      <w:r>
-        <w:rPr>
-          <w:rFonts w:hint="eastAsia" w:ascii="微软雅黑" w:hAnsi="微软雅黑" w:eastAsia="微软雅黑" w:cs="微软雅黑"/>
-          <w:color w:val="auto"/>
-          <w:sz w:val="24"/>
-          <w:szCs w:val="24"/>
-        </w:rPr>
-        <w:t>当前记录没有链上 `dataId`；</w:t>
-      </w:r>
-    </w:p>
-    <w:p>
-      <w:pPr>
-        <w:pStyle w:val="16"/>
-        <w:rPr>
-          <w:rFonts w:hint="eastAsia" w:ascii="微软雅黑" w:hAnsi="微软雅黑" w:eastAsia="微软雅黑" w:cs="微软雅黑"/>
-          <w:color w:val="auto"/>
-          <w:sz w:val="24"/>
-          <w:szCs w:val="24"/>
-        </w:rPr>
-      </w:pPr>
-      <w:r>
-        <w:rPr>
-          <w:rFonts w:hint="eastAsia" w:ascii="微软雅黑" w:hAnsi="微软雅黑" w:eastAsia="微软雅黑" w:cs="微软雅黑"/>
-          <w:color w:val="auto"/>
-          <w:sz w:val="24"/>
-          <w:szCs w:val="24"/>
-        </w:rPr>
-        <w:t>通常发生在链服务关闭时上传的记录，或上链未成功的记录。</w:t>
-      </w:r>
-    </w:p>
-    <w:p>
-      <w:pPr>
-        <w:rPr>
-          <w:rFonts w:hint="eastAsia" w:ascii="微软雅黑" w:hAnsi="微软雅黑" w:eastAsia="微软雅黑" w:cs="微软雅黑"/>
-          <w:color w:val="auto"/>
-          <w:sz w:val="24"/>
-          <w:szCs w:val="24"/>
-        </w:rPr>
-      </w:pPr>
-    </w:p>
-    <w:p>
-      <w:pPr>
-        <w:pStyle w:val="5"/>
-        <w:rPr>
-          <w:rFonts w:hint="eastAsia" w:ascii="微软雅黑" w:hAnsi="微软雅黑" w:eastAsia="微软雅黑" w:cs="微软雅黑"/>
-          <w:color w:val="auto"/>
-          <w:sz w:val="24"/>
-          <w:szCs w:val="24"/>
-        </w:rPr>
-      </w:pPr>
-      <w:r>
-        <w:rPr>
-          <w:rFonts w:hint="eastAsia" w:ascii="微软雅黑" w:hAnsi="微软雅黑" w:eastAsia="微软雅黑" w:cs="微软雅黑"/>
-          <w:color w:val="auto"/>
-          <w:sz w:val="24"/>
-          <w:szCs w:val="24"/>
-        </w:rPr>
-        <w:t>8.4 service_unavailable</w:t>
-      </w:r>
-    </w:p>
-    <w:p>
-      <w:pPr>
-        <w:rPr>
-          <w:rFonts w:hint="eastAsia" w:ascii="微软雅黑" w:hAnsi="微软雅黑" w:eastAsia="微软雅黑" w:cs="微软雅黑"/>
-          <w:color w:val="auto"/>
-          <w:sz w:val="24"/>
-          <w:szCs w:val="24"/>
-        </w:rPr>
-      </w:pPr>
-      <w:r>
-        <w:rPr>
-          <w:rFonts w:hint="eastAsia" w:ascii="微软雅黑" w:hAnsi="微软雅黑" w:eastAsia="微软雅黑" w:cs="微软雅黑"/>
-          <w:color w:val="auto"/>
-          <w:sz w:val="24"/>
-          <w:szCs w:val="24"/>
-        </w:rPr>
-        <w:t>含义：</w:t>
-      </w:r>
-    </w:p>
-    <w:p>
-      <w:pPr>
-        <w:pStyle w:val="16"/>
-        <w:rPr>
-          <w:rFonts w:hint="eastAsia" w:ascii="微软雅黑" w:hAnsi="微软雅黑" w:eastAsia="微软雅黑" w:cs="微软雅黑"/>
-          <w:color w:val="auto"/>
-          <w:sz w:val="24"/>
-          <w:szCs w:val="24"/>
-        </w:rPr>
-      </w:pPr>
-      <w:r>
-        <w:rPr>
-          <w:rFonts w:hint="eastAsia" w:ascii="微软雅黑" w:hAnsi="微软雅黑" w:eastAsia="微软雅黑" w:cs="微软雅黑"/>
-          <w:color w:val="auto"/>
-          <w:sz w:val="24"/>
-          <w:szCs w:val="24"/>
-        </w:rPr>
-        <w:t>区块链服务未启用或 Ganache 未连接；</w:t>
-      </w:r>
-    </w:p>
-    <w:p>
-      <w:pPr>
-        <w:pStyle w:val="16"/>
-        <w:rPr>
-          <w:rFonts w:hint="eastAsia" w:ascii="微软雅黑" w:hAnsi="微软雅黑" w:eastAsia="微软雅黑" w:cs="微软雅黑"/>
-          <w:color w:val="auto"/>
-          <w:sz w:val="24"/>
-          <w:szCs w:val="24"/>
-        </w:rPr>
-      </w:pPr>
-      <w:r>
-        <w:rPr>
-          <w:rFonts w:hint="eastAsia" w:ascii="微软雅黑" w:hAnsi="微软雅黑" w:eastAsia="微软雅黑" w:cs="微软雅黑"/>
-          <w:color w:val="auto"/>
-          <w:sz w:val="24"/>
-          <w:szCs w:val="24"/>
-        </w:rPr>
-        <w:t>当前记录未执行链上验真。</w:t>
-      </w:r>
-    </w:p>
-    <w:p>
-      <w:pPr>
-        <w:rPr>
-          <w:rFonts w:hint="eastAsia" w:ascii="微软雅黑" w:hAnsi="微软雅黑" w:eastAsia="微软雅黑" w:cs="微软雅黑"/>
-          <w:color w:val="auto"/>
-          <w:sz w:val="24"/>
-          <w:szCs w:val="24"/>
-        </w:rPr>
-      </w:pPr>
-    </w:p>
-    <w:p>
-      <w:pPr>
-        <w:pStyle w:val="5"/>
-        <w:rPr>
-          <w:rFonts w:hint="eastAsia" w:ascii="微软雅黑" w:hAnsi="微软雅黑" w:eastAsia="微软雅黑" w:cs="微软雅黑"/>
-          <w:color w:val="auto"/>
-          <w:sz w:val="24"/>
-          <w:szCs w:val="24"/>
-        </w:rPr>
-      </w:pPr>
-      <w:r>
-        <w:rPr>
-          <w:rFonts w:hint="eastAsia" w:ascii="微软雅黑" w:hAnsi="微软雅黑" w:eastAsia="微软雅黑" w:cs="微软雅黑"/>
-          <w:color w:val="auto"/>
-          <w:sz w:val="24"/>
-          <w:szCs w:val="24"/>
-        </w:rPr>
-        <w:t>8.5 record_missing</w:t>
-      </w:r>
-    </w:p>
-    <w:p>
-      <w:pPr>
-        <w:rPr>
-          <w:rFonts w:hint="eastAsia" w:ascii="微软雅黑" w:hAnsi="微软雅黑" w:eastAsia="微软雅黑" w:cs="微软雅黑"/>
-          <w:color w:val="auto"/>
-          <w:sz w:val="24"/>
-          <w:szCs w:val="24"/>
-        </w:rPr>
-      </w:pPr>
-      <w:r>
-        <w:rPr>
-          <w:rFonts w:hint="eastAsia" w:ascii="微软雅黑" w:hAnsi="微软雅黑" w:eastAsia="微软雅黑" w:cs="微软雅黑"/>
-          <w:color w:val="auto"/>
-          <w:sz w:val="24"/>
-          <w:szCs w:val="24"/>
-        </w:rPr>
-        <w:t>含义：</w:t>
-      </w:r>
-    </w:p>
-    <w:p>
-      <w:pPr>
-        <w:pStyle w:val="16"/>
-        <w:rPr>
-          <w:rFonts w:hint="eastAsia" w:ascii="微软雅黑" w:hAnsi="微软雅黑" w:eastAsia="微软雅黑" w:cs="微软雅黑"/>
-          <w:color w:val="auto"/>
-          <w:sz w:val="24"/>
-          <w:szCs w:val="24"/>
-        </w:rPr>
-      </w:pPr>
-      <w:r>
-        <w:rPr>
-          <w:rFonts w:hint="eastAsia" w:ascii="微软雅黑" w:hAnsi="微软雅黑" w:eastAsia="微软雅黑" w:cs="微软雅黑"/>
-          <w:color w:val="auto"/>
-          <w:sz w:val="24"/>
-          <w:szCs w:val="24"/>
-        </w:rPr>
-        <w:t>业务库保存了 `onchain_data_id`，但链上找不到对应记录；</w:t>
-      </w:r>
-    </w:p>
-    <w:p>
-      <w:pPr>
-        <w:pStyle w:val="16"/>
-        <w:rPr>
-          <w:rFonts w:hint="eastAsia" w:ascii="微软雅黑" w:hAnsi="微软雅黑" w:eastAsia="微软雅黑" w:cs="微软雅黑"/>
-          <w:color w:val="auto"/>
-          <w:sz w:val="24"/>
-          <w:szCs w:val="24"/>
-        </w:rPr>
-      </w:pPr>
-      <w:r>
-        <w:rPr>
-          <w:rFonts w:hint="eastAsia" w:ascii="微软雅黑" w:hAnsi="微软雅黑" w:eastAsia="微软雅黑" w:cs="微软雅黑"/>
-          <w:color w:val="auto"/>
-          <w:sz w:val="24"/>
-          <w:szCs w:val="24"/>
-        </w:rPr>
-        <w:t>可能是 Ganache 重置、合约重新部署或链数据丢失。</w:t>
-      </w:r>
-    </w:p>
-    <w:p>
-      <w:pPr>
-        <w:rPr>
-          <w:rFonts w:hint="eastAsia" w:ascii="微软雅黑" w:hAnsi="微软雅黑" w:eastAsia="微软雅黑" w:cs="微软雅黑"/>
-          <w:color w:val="auto"/>
-          <w:sz w:val="24"/>
-          <w:szCs w:val="24"/>
-        </w:rPr>
-      </w:pPr>
-    </w:p>
-    <w:p>
-      <w:pPr>
-        <w:pStyle w:val="5"/>
-        <w:rPr>
-          <w:rFonts w:hint="eastAsia" w:ascii="微软雅黑" w:hAnsi="微软雅黑" w:eastAsia="微软雅黑" w:cs="微软雅黑"/>
-          <w:color w:val="auto"/>
-          <w:sz w:val="24"/>
-          <w:szCs w:val="24"/>
-        </w:rPr>
-      </w:pPr>
-      <w:r>
-        <w:rPr>
-          <w:rFonts w:hint="eastAsia" w:ascii="微软雅黑" w:hAnsi="微软雅黑" w:eastAsia="微软雅黑" w:cs="微软雅黑"/>
-          <w:color w:val="auto"/>
-          <w:sz w:val="24"/>
-          <w:szCs w:val="24"/>
-        </w:rPr>
-        <w:t>8.6 locked</w:t>
-      </w:r>
-    </w:p>
-    <w:p>
-      <w:pPr>
-        <w:rPr>
-          <w:rFonts w:hint="eastAsia" w:ascii="微软雅黑" w:hAnsi="微软雅黑" w:eastAsia="微软雅黑" w:cs="微软雅黑"/>
-          <w:color w:val="auto"/>
-          <w:sz w:val="24"/>
-          <w:szCs w:val="24"/>
-        </w:rPr>
-      </w:pPr>
-      <w:r>
-        <w:rPr>
-          <w:rFonts w:hint="eastAsia" w:ascii="微软雅黑" w:hAnsi="微软雅黑" w:eastAsia="微软雅黑" w:cs="微软雅黑"/>
-          <w:color w:val="auto"/>
-          <w:sz w:val="24"/>
-          <w:szCs w:val="24"/>
-        </w:rPr>
-        <w:t>含义：</w:t>
-      </w:r>
-    </w:p>
-    <w:p>
-      <w:pPr>
-        <w:pStyle w:val="16"/>
-        <w:rPr>
-          <w:rFonts w:hint="eastAsia" w:ascii="微软雅黑" w:hAnsi="微软雅黑" w:eastAsia="微软雅黑" w:cs="微软雅黑"/>
-          <w:color w:val="auto"/>
-          <w:sz w:val="24"/>
-          <w:szCs w:val="24"/>
-        </w:rPr>
-      </w:pPr>
-      <w:r>
-        <w:rPr>
-          <w:rFonts w:hint="eastAsia" w:ascii="微软雅黑" w:hAnsi="微软雅黑" w:eastAsia="微软雅黑" w:cs="微软雅黑"/>
-          <w:color w:val="auto"/>
-          <w:sz w:val="24"/>
-          <w:szCs w:val="24"/>
-        </w:rPr>
-        <w:t>私密数据未解锁；</w:t>
-      </w:r>
-    </w:p>
-    <w:p>
-      <w:pPr>
-        <w:pStyle w:val="16"/>
-        <w:rPr>
-          <w:rFonts w:hint="eastAsia" w:ascii="微软雅黑" w:hAnsi="微软雅黑" w:eastAsia="微软雅黑" w:cs="微软雅黑"/>
-          <w:color w:val="auto"/>
-          <w:sz w:val="24"/>
-          <w:szCs w:val="24"/>
-        </w:rPr>
-      </w:pPr>
-      <w:r>
-        <w:rPr>
-          <w:rFonts w:hint="eastAsia" w:ascii="微软雅黑" w:hAnsi="微软雅黑" w:eastAsia="微软雅黑" w:cs="微软雅黑"/>
-          <w:color w:val="auto"/>
-          <w:sz w:val="24"/>
-          <w:szCs w:val="24"/>
-        </w:rPr>
-        <w:t>后端无法得到原文或文件内容，因此无法计算可比对摘要。</w:t>
-      </w:r>
-    </w:p>
-    <w:p>
-      <w:pPr>
-        <w:rPr>
-          <w:rFonts w:hint="eastAsia" w:ascii="微软雅黑" w:hAnsi="微软雅黑" w:eastAsia="微软雅黑" w:cs="微软雅黑"/>
-          <w:color w:val="auto"/>
-          <w:sz w:val="24"/>
-          <w:szCs w:val="24"/>
-        </w:rPr>
-      </w:pPr>
-    </w:p>
-    <w:p>
-      <w:pPr>
-        <w:rPr>
-          <w:rFonts w:hint="eastAsia" w:ascii="微软雅黑" w:hAnsi="微软雅黑" w:eastAsia="微软雅黑" w:cs="微软雅黑"/>
-          <w:color w:val="auto"/>
-          <w:sz w:val="24"/>
-          <w:szCs w:val="24"/>
-        </w:rPr>
-      </w:pPr>
-      <w:r>
-        <w:rPr>
-          <w:rFonts w:hint="eastAsia" w:ascii="微软雅黑" w:hAnsi="微软雅黑" w:eastAsia="微软雅黑" w:cs="微软雅黑"/>
-          <w:color w:val="auto"/>
-          <w:sz w:val="24"/>
-          <w:szCs w:val="24"/>
-        </w:rPr>
-        <w:t>----------------------------------------</w:t>
-      </w:r>
-    </w:p>
-    <w:p>
-      <w:pPr>
-        <w:rPr>
-          <w:rFonts w:hint="eastAsia" w:ascii="微软雅黑" w:hAnsi="微软雅黑" w:eastAsia="微软雅黑" w:cs="微软雅黑"/>
-          <w:color w:val="auto"/>
-          <w:sz w:val="24"/>
-          <w:szCs w:val="24"/>
-        </w:rPr>
-      </w:pPr>
-    </w:p>
-    <w:p>
-      <w:pPr>
-        <w:pStyle w:val="4"/>
-        <w:rPr>
-          <w:rFonts w:hint="eastAsia" w:ascii="微软雅黑" w:hAnsi="微软雅黑" w:eastAsia="微软雅黑" w:cs="微软雅黑"/>
-          <w:color w:val="auto"/>
-          <w:sz w:val="24"/>
-          <w:szCs w:val="24"/>
-        </w:rPr>
-      </w:pPr>
-      <w:r>
-        <w:rPr>
-          <w:rFonts w:hint="eastAsia" w:ascii="微软雅黑" w:hAnsi="微软雅黑" w:eastAsia="微软雅黑" w:cs="微软雅黑"/>
-          <w:color w:val="auto"/>
-          <w:sz w:val="24"/>
-          <w:szCs w:val="24"/>
-        </w:rPr>
-        <w:t>9. Ganache 启停与降级策略</w:t>
-      </w:r>
-    </w:p>
-    <w:p>
-      <w:pPr>
-        <w:rPr>
-          <w:rFonts w:hint="eastAsia" w:ascii="微软雅黑" w:hAnsi="微软雅黑" w:eastAsia="微软雅黑" w:cs="微软雅黑"/>
-          <w:color w:val="auto"/>
-          <w:sz w:val="24"/>
-          <w:szCs w:val="24"/>
-        </w:rPr>
-      </w:pPr>
-    </w:p>
-    <w:p>
-      <w:pPr>
-        <w:pStyle w:val="5"/>
-        <w:rPr>
-          <w:rFonts w:hint="eastAsia" w:ascii="微软雅黑" w:hAnsi="微软雅黑" w:eastAsia="微软雅黑" w:cs="微软雅黑"/>
-          <w:color w:val="auto"/>
-          <w:sz w:val="24"/>
-          <w:szCs w:val="24"/>
-        </w:rPr>
-      </w:pPr>
-      <w:r>
-        <w:rPr>
-          <w:rFonts w:hint="eastAsia" w:ascii="微软雅黑" w:hAnsi="微软雅黑" w:eastAsia="微软雅黑" w:cs="微软雅黑"/>
-          <w:color w:val="auto"/>
-          <w:sz w:val="24"/>
-          <w:szCs w:val="24"/>
-        </w:rPr>
-        <w:t>9.1 Ganache 未启动</w:t>
-      </w:r>
-    </w:p>
-    <w:p>
-      <w:pPr>
-        <w:rPr>
-          <w:rFonts w:hint="eastAsia" w:ascii="微软雅黑" w:hAnsi="微软雅黑" w:eastAsia="微软雅黑" w:cs="微软雅黑"/>
-          <w:color w:val="auto"/>
-          <w:sz w:val="24"/>
-          <w:szCs w:val="24"/>
-        </w:rPr>
-      </w:pPr>
-      <w:r>
-        <w:rPr>
-          <w:rFonts w:hint="eastAsia" w:ascii="微软雅黑" w:hAnsi="微软雅黑" w:eastAsia="微软雅黑" w:cs="微软雅黑"/>
-          <w:color w:val="auto"/>
-          <w:sz w:val="24"/>
-          <w:szCs w:val="24"/>
-        </w:rPr>
-        <w:t>系统行为：</w:t>
-      </w:r>
-    </w:p>
-    <w:p>
-      <w:pPr>
-        <w:pStyle w:val="16"/>
-        <w:rPr>
-          <w:rFonts w:hint="eastAsia" w:ascii="微软雅黑" w:hAnsi="微软雅黑" w:eastAsia="微软雅黑" w:cs="微软雅黑"/>
-          <w:color w:val="auto"/>
-          <w:sz w:val="24"/>
-          <w:szCs w:val="24"/>
-        </w:rPr>
-      </w:pPr>
-      <w:r>
-        <w:rPr>
-          <w:rFonts w:hint="eastAsia" w:ascii="微软雅黑" w:hAnsi="微软雅黑" w:eastAsia="微软雅黑" w:cs="微软雅黑"/>
-          <w:color w:val="auto"/>
-          <w:sz w:val="24"/>
-          <w:szCs w:val="24"/>
-        </w:rPr>
-        <w:t>用户注册被禁止；</w:t>
-      </w:r>
-    </w:p>
-    <w:p>
-      <w:pPr>
-        <w:pStyle w:val="16"/>
-        <w:rPr>
-          <w:rFonts w:hint="eastAsia" w:ascii="微软雅黑" w:hAnsi="微软雅黑" w:eastAsia="微软雅黑" w:cs="微软雅黑"/>
-          <w:color w:val="auto"/>
-          <w:sz w:val="24"/>
-          <w:szCs w:val="24"/>
-        </w:rPr>
-      </w:pPr>
-      <w:r>
-        <w:rPr>
-          <w:rFonts w:hint="eastAsia" w:ascii="微软雅黑" w:hAnsi="微软雅黑" w:eastAsia="微软雅黑" w:cs="微软雅黑"/>
-          <w:color w:val="auto"/>
-          <w:sz w:val="24"/>
-          <w:szCs w:val="24"/>
-        </w:rPr>
-        <w:t>健康数据上传、更新和加载不被阻断；</w:t>
-      </w:r>
-    </w:p>
-    <w:p>
-      <w:pPr>
-        <w:pStyle w:val="16"/>
-        <w:rPr>
-          <w:rFonts w:hint="eastAsia" w:ascii="微软雅黑" w:hAnsi="微软雅黑" w:eastAsia="微软雅黑" w:cs="微软雅黑"/>
-          <w:color w:val="auto"/>
-          <w:sz w:val="24"/>
-          <w:szCs w:val="24"/>
-        </w:rPr>
-      </w:pPr>
-      <w:r>
-        <w:rPr>
-          <w:rFonts w:hint="eastAsia" w:ascii="微软雅黑" w:hAnsi="微软雅黑" w:eastAsia="微软雅黑" w:cs="微软雅黑"/>
-          <w:color w:val="auto"/>
-          <w:sz w:val="24"/>
-          <w:szCs w:val="24"/>
-        </w:rPr>
-        <w:t>验真状态返回 `service_unavailable`；</w:t>
-      </w:r>
-    </w:p>
-    <w:p>
-      <w:pPr>
-        <w:pStyle w:val="16"/>
-        <w:rPr>
-          <w:rFonts w:hint="eastAsia" w:ascii="微软雅黑" w:hAnsi="微软雅黑" w:eastAsia="微软雅黑" w:cs="微软雅黑"/>
-          <w:color w:val="auto"/>
-          <w:sz w:val="24"/>
-          <w:szCs w:val="24"/>
-        </w:rPr>
-      </w:pPr>
-      <w:r>
-        <w:rPr>
-          <w:rFonts w:hint="eastAsia" w:ascii="微软雅黑" w:hAnsi="微软雅黑" w:eastAsia="微软雅黑" w:cs="微软雅黑"/>
-          <w:color w:val="auto"/>
-          <w:sz w:val="24"/>
-          <w:szCs w:val="24"/>
-        </w:rPr>
-        <w:t>写入接口返回 `onchain_warning`。</w:t>
-      </w:r>
-    </w:p>
-    <w:p>
-      <w:pPr>
-        <w:rPr>
-          <w:rFonts w:hint="eastAsia" w:ascii="微软雅黑" w:hAnsi="微软雅黑" w:eastAsia="微软雅黑" w:cs="微软雅黑"/>
-          <w:color w:val="auto"/>
-          <w:sz w:val="24"/>
-          <w:szCs w:val="24"/>
-        </w:rPr>
-      </w:pPr>
-    </w:p>
-    <w:p>
-      <w:pPr>
-        <w:pStyle w:val="5"/>
-        <w:rPr>
-          <w:rFonts w:hint="eastAsia" w:ascii="微软雅黑" w:hAnsi="微软雅黑" w:eastAsia="微软雅黑" w:cs="微软雅黑"/>
-          <w:color w:val="auto"/>
-          <w:sz w:val="24"/>
-          <w:szCs w:val="24"/>
-        </w:rPr>
-      </w:pPr>
-      <w:r>
-        <w:rPr>
-          <w:rFonts w:hint="eastAsia" w:ascii="微软雅黑" w:hAnsi="微软雅黑" w:eastAsia="微软雅黑" w:cs="微软雅黑"/>
-          <w:color w:val="auto"/>
-          <w:sz w:val="24"/>
-          <w:szCs w:val="24"/>
-        </w:rPr>
-        <w:t>9.2 Ganache 中途启动</w:t>
-      </w:r>
-    </w:p>
-    <w:p>
-      <w:pPr>
-        <w:rPr>
-          <w:rFonts w:hint="eastAsia" w:ascii="微软雅黑" w:hAnsi="微软雅黑" w:eastAsia="微软雅黑" w:cs="微软雅黑"/>
-          <w:color w:val="auto"/>
-          <w:sz w:val="24"/>
-          <w:szCs w:val="24"/>
-        </w:rPr>
-      </w:pPr>
-      <w:r>
-        <w:rPr>
-          <w:rFonts w:hint="eastAsia" w:ascii="微软雅黑" w:hAnsi="微软雅黑" w:eastAsia="微软雅黑" w:cs="微软雅黑"/>
-          <w:color w:val="auto"/>
-          <w:sz w:val="24"/>
-          <w:szCs w:val="24"/>
-        </w:rPr>
-        <w:t>系统行为：</w:t>
-      </w:r>
-    </w:p>
-    <w:p>
-      <w:pPr>
-        <w:pStyle w:val="16"/>
-        <w:rPr>
-          <w:rFonts w:hint="eastAsia" w:ascii="微软雅黑" w:hAnsi="微软雅黑" w:eastAsia="微软雅黑" w:cs="微软雅黑"/>
-          <w:color w:val="auto"/>
-          <w:sz w:val="24"/>
-          <w:szCs w:val="24"/>
-        </w:rPr>
-      </w:pPr>
-      <w:r>
-        <w:rPr>
-          <w:rFonts w:hint="eastAsia" w:ascii="微软雅黑" w:hAnsi="微软雅黑" w:eastAsia="微软雅黑" w:cs="微软雅黑"/>
-          <w:color w:val="auto"/>
-          <w:sz w:val="24"/>
-          <w:szCs w:val="24"/>
-        </w:rPr>
-        <w:t>后端链服务会动态检测 RPC 状态；</w:t>
-      </w:r>
-    </w:p>
-    <w:p>
-      <w:pPr>
-        <w:pStyle w:val="16"/>
-        <w:rPr>
-          <w:rFonts w:hint="eastAsia" w:ascii="微软雅黑" w:hAnsi="微软雅黑" w:eastAsia="微软雅黑" w:cs="微软雅黑"/>
-          <w:color w:val="auto"/>
-          <w:sz w:val="24"/>
-          <w:szCs w:val="24"/>
-        </w:rPr>
-      </w:pPr>
-      <w:r>
-        <w:rPr>
-          <w:rFonts w:hint="eastAsia" w:ascii="微软雅黑" w:hAnsi="微软雅黑" w:eastAsia="微软雅黑" w:cs="微软雅黑"/>
-          <w:color w:val="auto"/>
-          <w:sz w:val="24"/>
-          <w:szCs w:val="24"/>
-        </w:rPr>
-        <w:t>用户刷新记录列表或详情时，会重新尝试绑定合约并执行验真；</w:t>
-      </w:r>
-    </w:p>
-    <w:p>
-      <w:pPr>
-        <w:pStyle w:val="16"/>
-        <w:rPr>
-          <w:rFonts w:hint="eastAsia" w:ascii="微软雅黑" w:hAnsi="微软雅黑" w:eastAsia="微软雅黑" w:cs="微软雅黑"/>
-          <w:color w:val="auto"/>
-          <w:sz w:val="24"/>
-          <w:szCs w:val="24"/>
-        </w:rPr>
-      </w:pPr>
-      <w:r>
-        <w:rPr>
-          <w:rFonts w:hint="eastAsia" w:ascii="微软雅黑" w:hAnsi="微软雅黑" w:eastAsia="微软雅黑" w:cs="微软雅黑"/>
-          <w:color w:val="auto"/>
-          <w:sz w:val="24"/>
-          <w:szCs w:val="24"/>
-        </w:rPr>
-        <w:t>无需重启后端服务。</w:t>
-      </w:r>
-    </w:p>
-    <w:p>
-      <w:pPr>
-        <w:rPr>
-          <w:rFonts w:hint="eastAsia" w:ascii="微软雅黑" w:hAnsi="微软雅黑" w:eastAsia="微软雅黑" w:cs="微软雅黑"/>
-          <w:color w:val="auto"/>
-          <w:sz w:val="24"/>
-          <w:szCs w:val="24"/>
-        </w:rPr>
-      </w:pPr>
-    </w:p>
-    <w:p>
-      <w:pPr>
-        <w:pStyle w:val="5"/>
-        <w:rPr>
-          <w:rFonts w:hint="eastAsia" w:ascii="微软雅黑" w:hAnsi="微软雅黑" w:eastAsia="微软雅黑" w:cs="微软雅黑"/>
-          <w:color w:val="auto"/>
-          <w:sz w:val="24"/>
-          <w:szCs w:val="24"/>
-        </w:rPr>
-      </w:pPr>
-      <w:r>
-        <w:rPr>
-          <w:rFonts w:hint="eastAsia" w:ascii="微软雅黑" w:hAnsi="微软雅黑" w:eastAsia="微软雅黑" w:cs="微软雅黑"/>
-          <w:color w:val="auto"/>
-          <w:sz w:val="24"/>
-          <w:szCs w:val="24"/>
-        </w:rPr>
-        <w:t>9.3 Ganache 重置或合约重新部署</w:t>
-      </w:r>
-    </w:p>
-    <w:p>
-      <w:pPr>
-        <w:rPr>
-          <w:rFonts w:hint="eastAsia" w:ascii="微软雅黑" w:hAnsi="微软雅黑" w:eastAsia="微软雅黑" w:cs="微软雅黑"/>
-          <w:color w:val="auto"/>
-          <w:sz w:val="24"/>
-          <w:szCs w:val="24"/>
-        </w:rPr>
-      </w:pPr>
-      <w:r>
-        <w:rPr>
-          <w:rFonts w:hint="eastAsia" w:ascii="微软雅黑" w:hAnsi="微软雅黑" w:eastAsia="微软雅黑" w:cs="微软雅黑"/>
-          <w:color w:val="auto"/>
-          <w:sz w:val="24"/>
-          <w:szCs w:val="24"/>
-        </w:rPr>
-        <w:t>可能影响：</w:t>
-      </w:r>
-    </w:p>
-    <w:p>
-      <w:pPr>
-        <w:pStyle w:val="16"/>
-        <w:rPr>
-          <w:rFonts w:hint="eastAsia" w:ascii="微软雅黑" w:hAnsi="微软雅黑" w:eastAsia="微软雅黑" w:cs="微软雅黑"/>
-          <w:color w:val="auto"/>
-          <w:sz w:val="24"/>
-          <w:szCs w:val="24"/>
-        </w:rPr>
-      </w:pPr>
-      <w:r>
-        <w:rPr>
-          <w:rFonts w:hint="eastAsia" w:ascii="微软雅黑" w:hAnsi="微软雅黑" w:eastAsia="微软雅黑" w:cs="微软雅黑"/>
-          <w:color w:val="auto"/>
-          <w:sz w:val="24"/>
-          <w:szCs w:val="24"/>
-        </w:rPr>
-        <w:t>旧 `onchain_data_id` 对应的链上记录可能不存在；</w:t>
-      </w:r>
-    </w:p>
-    <w:p>
-      <w:pPr>
-        <w:pStyle w:val="16"/>
-        <w:rPr>
-          <w:rFonts w:hint="eastAsia" w:ascii="微软雅黑" w:hAnsi="微软雅黑" w:eastAsia="微软雅黑" w:cs="微软雅黑"/>
-          <w:color w:val="auto"/>
-          <w:sz w:val="24"/>
-          <w:szCs w:val="24"/>
-        </w:rPr>
-      </w:pPr>
-      <w:r>
-        <w:rPr>
-          <w:rFonts w:hint="eastAsia" w:ascii="微软雅黑" w:hAnsi="微软雅黑" w:eastAsia="微软雅黑" w:cs="微软雅黑"/>
-          <w:color w:val="auto"/>
-          <w:sz w:val="24"/>
-          <w:szCs w:val="24"/>
-        </w:rPr>
-        <w:t>验真状态可能变为 `record_missing`；</w:t>
-      </w:r>
-    </w:p>
-    <w:p>
-      <w:pPr>
-        <w:pStyle w:val="16"/>
-        <w:rPr>
-          <w:rFonts w:hint="eastAsia" w:ascii="微软雅黑" w:hAnsi="微软雅黑" w:eastAsia="微软雅黑" w:cs="微软雅黑"/>
-          <w:color w:val="auto"/>
-          <w:sz w:val="24"/>
-          <w:szCs w:val="24"/>
-        </w:rPr>
-      </w:pPr>
-      <w:r>
-        <w:rPr>
-          <w:rFonts w:hint="eastAsia" w:ascii="微软雅黑" w:hAnsi="微软雅黑" w:eastAsia="微软雅黑" w:cs="微软雅黑"/>
-          <w:color w:val="auto"/>
-          <w:sz w:val="24"/>
-          <w:szCs w:val="24"/>
-        </w:rPr>
-        <w:t>需要重新部署合约并更新后端配置中的合约地址与 ABI。</w:t>
-      </w:r>
-    </w:p>
-    <w:p>
-      <w:pPr>
-        <w:rPr>
-          <w:rFonts w:hint="eastAsia" w:ascii="微软雅黑" w:hAnsi="微软雅黑" w:eastAsia="微软雅黑" w:cs="微软雅黑"/>
-          <w:color w:val="auto"/>
-          <w:sz w:val="24"/>
-          <w:szCs w:val="24"/>
-        </w:rPr>
-      </w:pPr>
-    </w:p>
-    <w:p>
-      <w:pPr>
-        <w:rPr>
-          <w:rFonts w:hint="eastAsia" w:ascii="微软雅黑" w:hAnsi="微软雅黑" w:eastAsia="微软雅黑" w:cs="微软雅黑"/>
-          <w:color w:val="auto"/>
-          <w:sz w:val="24"/>
-          <w:szCs w:val="24"/>
-        </w:rPr>
-      </w:pPr>
-      <w:r>
-        <w:rPr>
-          <w:rFonts w:hint="eastAsia" w:ascii="微软雅黑" w:hAnsi="微软雅黑" w:eastAsia="微软雅黑" w:cs="微软雅黑"/>
-          <w:color w:val="auto"/>
-          <w:sz w:val="24"/>
-          <w:szCs w:val="24"/>
-        </w:rPr>
-        <w:t>----------------------------------------</w:t>
-      </w:r>
-    </w:p>
-    <w:p>
-      <w:pPr>
-        <w:rPr>
-          <w:rFonts w:hint="eastAsia" w:ascii="微软雅黑" w:hAnsi="微软雅黑" w:eastAsia="微软雅黑" w:cs="微软雅黑"/>
-          <w:color w:val="auto"/>
-          <w:sz w:val="24"/>
-          <w:szCs w:val="24"/>
-        </w:rPr>
-      </w:pPr>
-    </w:p>
-    <w:p>
-      <w:pPr>
-        <w:pStyle w:val="4"/>
-        <w:rPr>
-          <w:rFonts w:hint="eastAsia" w:ascii="微软雅黑" w:hAnsi="微软雅黑" w:eastAsia="微软雅黑" w:cs="微软雅黑"/>
-          <w:color w:val="auto"/>
-          <w:sz w:val="24"/>
-          <w:szCs w:val="24"/>
-        </w:rPr>
-      </w:pPr>
-      <w:r>
-        <w:rPr>
-          <w:rFonts w:hint="eastAsia" w:ascii="微软雅黑" w:hAnsi="微软雅黑" w:eastAsia="微软雅黑" w:cs="微软雅黑"/>
-          <w:color w:val="auto"/>
-          <w:sz w:val="24"/>
-          <w:szCs w:val="24"/>
-        </w:rPr>
-        <w:t>10. 开发与联调注意事项</w:t>
-      </w:r>
-    </w:p>
-    <w:p>
-      <w:pPr>
-        <w:rPr>
-          <w:rFonts w:hint="eastAsia" w:ascii="微软雅黑" w:hAnsi="微软雅黑" w:eastAsia="微软雅黑" w:cs="微软雅黑"/>
-          <w:color w:val="auto"/>
-          <w:sz w:val="24"/>
-          <w:szCs w:val="24"/>
-        </w:rPr>
-      </w:pPr>
-    </w:p>
-    <w:p>
-      <w:pPr>
-        <w:pStyle w:val="5"/>
-        <w:rPr>
-          <w:rFonts w:hint="eastAsia" w:ascii="微软雅黑" w:hAnsi="微软雅黑" w:eastAsia="微软雅黑" w:cs="微软雅黑"/>
-          <w:color w:val="auto"/>
-          <w:sz w:val="24"/>
-          <w:szCs w:val="24"/>
-        </w:rPr>
-      </w:pPr>
-      <w:r>
-        <w:rPr>
-          <w:rFonts w:hint="eastAsia" w:ascii="微软雅黑" w:hAnsi="微软雅黑" w:eastAsia="微软雅黑" w:cs="微软雅黑"/>
-          <w:color w:val="auto"/>
-          <w:sz w:val="24"/>
-          <w:szCs w:val="24"/>
-        </w:rPr>
-        <w:t>10.1 bytes32 参数要求</w:t>
-      </w:r>
-    </w:p>
-    <w:p>
-      <w:pPr>
-        <w:rPr>
-          <w:rFonts w:hint="eastAsia" w:ascii="微软雅黑" w:hAnsi="微软雅黑" w:eastAsia="微软雅黑" w:cs="微软雅黑"/>
-          <w:color w:val="auto"/>
-          <w:sz w:val="24"/>
-          <w:szCs w:val="24"/>
-        </w:rPr>
-      </w:pPr>
-      <w:r>
-        <w:rPr>
-          <w:rFonts w:hint="eastAsia" w:ascii="微软雅黑" w:hAnsi="微软雅黑" w:eastAsia="微软雅黑" w:cs="微软雅黑"/>
-          <w:color w:val="auto"/>
-          <w:sz w:val="24"/>
-          <w:szCs w:val="24"/>
-        </w:rPr>
-        <w:t>合约中的 `dataHash`、`encryptedData` 和 `dataId` 均为 `bytes32`。后端在调用前必须保证十六进制字符串解码后长度为 32 字节。</w:t>
-      </w:r>
-    </w:p>
-    <w:p>
-      <w:pPr>
-        <w:rPr>
-          <w:rFonts w:hint="eastAsia" w:ascii="微软雅黑" w:hAnsi="微软雅黑" w:eastAsia="微软雅黑" w:cs="微软雅黑"/>
-          <w:color w:val="auto"/>
-          <w:sz w:val="24"/>
-          <w:szCs w:val="24"/>
-        </w:rPr>
-      </w:pPr>
-    </w:p>
-    <w:p>
-      <w:pPr>
-        <w:pStyle w:val="5"/>
-        <w:rPr>
-          <w:rFonts w:hint="eastAsia" w:ascii="微软雅黑" w:hAnsi="微软雅黑" w:eastAsia="微软雅黑" w:cs="微软雅黑"/>
-          <w:color w:val="auto"/>
-          <w:sz w:val="24"/>
-          <w:szCs w:val="24"/>
-        </w:rPr>
-      </w:pPr>
-      <w:r>
-        <w:rPr>
-          <w:rFonts w:hint="eastAsia" w:ascii="微软雅黑" w:hAnsi="微软雅黑" w:eastAsia="微软雅黑" w:cs="微软雅黑"/>
-          <w:color w:val="auto"/>
-          <w:sz w:val="24"/>
-          <w:szCs w:val="24"/>
-        </w:rPr>
-        <w:t>10.2 交易发送要求</w:t>
-      </w:r>
-    </w:p>
-    <w:p>
-      <w:pPr>
-        <w:rPr>
-          <w:rFonts w:hint="eastAsia" w:ascii="微软雅黑" w:hAnsi="微软雅黑" w:eastAsia="微软雅黑" w:cs="微软雅黑"/>
-          <w:color w:val="auto"/>
-          <w:sz w:val="24"/>
-          <w:szCs w:val="24"/>
-        </w:rPr>
-      </w:pPr>
-      <w:r>
-        <w:rPr>
-          <w:rFonts w:hint="eastAsia" w:ascii="微软雅黑" w:hAnsi="微软雅黑" w:eastAsia="微软雅黑" w:cs="微软雅黑"/>
-          <w:color w:val="auto"/>
-          <w:sz w:val="24"/>
-          <w:szCs w:val="24"/>
-        </w:rPr>
-        <w:t>交易发送需要：</w:t>
-      </w:r>
-    </w:p>
-    <w:p>
-      <w:pPr>
-        <w:pStyle w:val="16"/>
-        <w:rPr>
-          <w:rFonts w:hint="eastAsia" w:ascii="微软雅黑" w:hAnsi="微软雅黑" w:eastAsia="微软雅黑" w:cs="微软雅黑"/>
-          <w:color w:val="auto"/>
-          <w:sz w:val="24"/>
-          <w:szCs w:val="24"/>
-        </w:rPr>
-      </w:pPr>
-      <w:r>
-        <w:rPr>
-          <w:rFonts w:hint="eastAsia" w:ascii="微软雅黑" w:hAnsi="微软雅黑" w:eastAsia="微软雅黑" w:cs="微软雅黑"/>
-          <w:color w:val="auto"/>
-          <w:sz w:val="24"/>
-          <w:szCs w:val="24"/>
-        </w:rPr>
-        <w:t>可用的 RPC 节点；</w:t>
-      </w:r>
-    </w:p>
-    <w:p>
-      <w:pPr>
-        <w:pStyle w:val="16"/>
-        <w:rPr>
-          <w:rFonts w:hint="eastAsia" w:ascii="微软雅黑" w:hAnsi="微软雅黑" w:eastAsia="微软雅黑" w:cs="微软雅黑"/>
-          <w:color w:val="auto"/>
-          <w:sz w:val="24"/>
-          <w:szCs w:val="24"/>
-        </w:rPr>
-      </w:pPr>
-      <w:r>
-        <w:rPr>
-          <w:rFonts w:hint="eastAsia" w:ascii="微软雅黑" w:hAnsi="微软雅黑" w:eastAsia="微软雅黑" w:cs="微软雅黑"/>
-          <w:color w:val="auto"/>
-          <w:sz w:val="24"/>
-          <w:szCs w:val="24"/>
-        </w:rPr>
-        <w:t>可用合约地址；</w:t>
-      </w:r>
-    </w:p>
-    <w:p>
-      <w:pPr>
-        <w:pStyle w:val="16"/>
-        <w:rPr>
-          <w:rFonts w:hint="eastAsia" w:ascii="微软雅黑" w:hAnsi="微软雅黑" w:eastAsia="微软雅黑" w:cs="微软雅黑"/>
-          <w:color w:val="auto"/>
-          <w:sz w:val="24"/>
-          <w:szCs w:val="24"/>
-        </w:rPr>
-      </w:pPr>
-      <w:r>
-        <w:rPr>
-          <w:rFonts w:hint="eastAsia" w:ascii="微软雅黑" w:hAnsi="微软雅黑" w:eastAsia="微软雅黑" w:cs="微软雅黑"/>
-          <w:color w:val="auto"/>
-          <w:sz w:val="24"/>
-          <w:szCs w:val="24"/>
-        </w:rPr>
-        <w:t>调用方私钥；</w:t>
-      </w:r>
-    </w:p>
-    <w:p>
-      <w:pPr>
-        <w:pStyle w:val="16"/>
-        <w:rPr>
-          <w:rFonts w:hint="eastAsia" w:ascii="微软雅黑" w:hAnsi="微软雅黑" w:eastAsia="微软雅黑" w:cs="微软雅黑"/>
-          <w:color w:val="auto"/>
-          <w:sz w:val="24"/>
-          <w:szCs w:val="24"/>
-        </w:rPr>
-      </w:pPr>
-      <w:r>
-        <w:rPr>
-          <w:rFonts w:hint="eastAsia" w:ascii="微软雅黑" w:hAnsi="微软雅黑" w:eastAsia="微软雅黑" w:cs="微软雅黑"/>
-          <w:color w:val="auto"/>
-          <w:sz w:val="24"/>
-          <w:szCs w:val="24"/>
-        </w:rPr>
-        <w:t>调用方账户有足够测试 ETH；</w:t>
-      </w:r>
-    </w:p>
-    <w:p>
-      <w:pPr>
-        <w:pStyle w:val="16"/>
-        <w:rPr>
-          <w:rFonts w:hint="eastAsia" w:ascii="微软雅黑" w:hAnsi="微软雅黑" w:eastAsia="微软雅黑" w:cs="微软雅黑"/>
-          <w:color w:val="auto"/>
-          <w:sz w:val="24"/>
-          <w:szCs w:val="24"/>
-        </w:rPr>
-      </w:pPr>
-      <w:r>
-        <w:rPr>
-          <w:rFonts w:hint="eastAsia" w:ascii="微软雅黑" w:hAnsi="微软雅黑" w:eastAsia="微软雅黑" w:cs="微软雅黑"/>
-          <w:color w:val="auto"/>
-          <w:sz w:val="24"/>
-          <w:szCs w:val="24"/>
-        </w:rPr>
-        <w:t>正确的 `chainId`、`gas` 与 `gasPrice`。</w:t>
-      </w:r>
-    </w:p>
-    <w:p>
-      <w:pPr>
-        <w:rPr>
-          <w:rFonts w:hint="eastAsia" w:ascii="微软雅黑" w:hAnsi="微软雅黑" w:eastAsia="微软雅黑" w:cs="微软雅黑"/>
-          <w:color w:val="auto"/>
-          <w:sz w:val="24"/>
-          <w:szCs w:val="24"/>
-        </w:rPr>
-      </w:pPr>
-    </w:p>
-    <w:p>
-      <w:pPr>
-        <w:pStyle w:val="5"/>
-        <w:rPr>
-          <w:rFonts w:hint="eastAsia" w:ascii="微软雅黑" w:hAnsi="微软雅黑" w:eastAsia="微软雅黑" w:cs="微软雅黑"/>
-          <w:color w:val="auto"/>
-          <w:sz w:val="24"/>
-          <w:szCs w:val="24"/>
-        </w:rPr>
-      </w:pPr>
-      <w:r>
-        <w:rPr>
-          <w:rFonts w:hint="eastAsia" w:ascii="微软雅黑" w:hAnsi="微软雅黑" w:eastAsia="微软雅黑" w:cs="微软雅黑"/>
-          <w:color w:val="auto"/>
-          <w:sz w:val="24"/>
-          <w:szCs w:val="24"/>
-        </w:rPr>
-        <w:t>10.3 前端展示建议</w:t>
-      </w:r>
-    </w:p>
-    <w:p>
-      <w:pPr>
-        <w:rPr>
-          <w:rFonts w:hint="eastAsia" w:ascii="微软雅黑" w:hAnsi="微软雅黑" w:eastAsia="微软雅黑" w:cs="微软雅黑"/>
-          <w:color w:val="auto"/>
-          <w:sz w:val="24"/>
-          <w:szCs w:val="24"/>
-        </w:rPr>
-      </w:pPr>
-      <w:r>
-        <w:rPr>
-          <w:rFonts w:hint="eastAsia" w:ascii="微软雅黑" w:hAnsi="微软雅黑" w:eastAsia="微软雅黑" w:cs="微软雅黑"/>
-          <w:color w:val="auto"/>
-          <w:sz w:val="24"/>
-          <w:szCs w:val="24"/>
-        </w:rPr>
-        <w:t>前端不应只依赖 `onchain_verified` 布尔值，应同时展示：</w:t>
-      </w:r>
-    </w:p>
-    <w:p>
-      <w:pPr>
-        <w:pStyle w:val="16"/>
-        <w:rPr>
-          <w:rFonts w:hint="eastAsia" w:ascii="微软雅黑" w:hAnsi="微软雅黑" w:eastAsia="微软雅黑" w:cs="微软雅黑"/>
-          <w:color w:val="auto"/>
-          <w:sz w:val="24"/>
-          <w:szCs w:val="24"/>
-        </w:rPr>
-      </w:pPr>
-      <w:r>
-        <w:rPr>
-          <w:rFonts w:hint="eastAsia" w:ascii="微软雅黑" w:hAnsi="微软雅黑" w:eastAsia="微软雅黑" w:cs="微软雅黑"/>
-          <w:color w:val="auto"/>
-          <w:sz w:val="24"/>
-          <w:szCs w:val="24"/>
-        </w:rPr>
-        <w:t>`onchain_verification_status`</w:t>
-      </w:r>
-    </w:p>
-    <w:p>
-      <w:pPr>
-        <w:pStyle w:val="16"/>
-        <w:rPr>
-          <w:rFonts w:hint="eastAsia" w:ascii="微软雅黑" w:hAnsi="微软雅黑" w:eastAsia="微软雅黑" w:cs="微软雅黑"/>
-          <w:color w:val="auto"/>
-          <w:sz w:val="24"/>
-          <w:szCs w:val="24"/>
-        </w:rPr>
-      </w:pPr>
-      <w:r>
-        <w:rPr>
-          <w:rFonts w:hint="eastAsia" w:ascii="微软雅黑" w:hAnsi="微软雅黑" w:eastAsia="微软雅黑" w:cs="微软雅黑"/>
-          <w:color w:val="auto"/>
-          <w:sz w:val="24"/>
-          <w:szCs w:val="24"/>
-        </w:rPr>
-        <w:t>`onchain_verification_message`</w:t>
-      </w:r>
-    </w:p>
-    <w:p>
-      <w:pPr>
-        <w:pStyle w:val="16"/>
-        <w:rPr>
-          <w:rFonts w:hint="eastAsia" w:ascii="微软雅黑" w:hAnsi="微软雅黑" w:eastAsia="微软雅黑" w:cs="微软雅黑"/>
-          <w:color w:val="auto"/>
-          <w:sz w:val="24"/>
-          <w:szCs w:val="24"/>
-        </w:rPr>
-      </w:pPr>
-      <w:r>
-        <w:rPr>
-          <w:rFonts w:hint="eastAsia" w:ascii="微软雅黑" w:hAnsi="微软雅黑" w:eastAsia="微软雅黑" w:cs="微软雅黑"/>
-          <w:color w:val="auto"/>
-          <w:sz w:val="24"/>
-          <w:szCs w:val="24"/>
-        </w:rPr>
-        <w:t>`onchain_tx_hash`</w:t>
-      </w:r>
-    </w:p>
-    <w:p>
-      <w:pPr>
-        <w:pStyle w:val="16"/>
-        <w:rPr>
-          <w:rFonts w:hint="eastAsia" w:ascii="微软雅黑" w:hAnsi="微软雅黑" w:eastAsia="微软雅黑" w:cs="微软雅黑"/>
-          <w:color w:val="auto"/>
-          <w:sz w:val="24"/>
-          <w:szCs w:val="24"/>
-        </w:rPr>
-      </w:pPr>
-      <w:r>
-        <w:rPr>
-          <w:rFonts w:hint="eastAsia" w:ascii="微软雅黑" w:hAnsi="微软雅黑" w:eastAsia="微软雅黑" w:cs="微软雅黑"/>
-          <w:color w:val="auto"/>
-          <w:sz w:val="24"/>
-          <w:szCs w:val="24"/>
-        </w:rPr>
-        <w:t>`onchain_data_id`</w:t>
-      </w:r>
-    </w:p>
-    <w:p>
-      <w:pPr>
-        <w:rPr>
-          <w:rFonts w:hint="eastAsia" w:ascii="微软雅黑" w:hAnsi="微软雅黑" w:eastAsia="微软雅黑" w:cs="微软雅黑"/>
-          <w:color w:val="auto"/>
-          <w:sz w:val="24"/>
-          <w:szCs w:val="24"/>
-        </w:rPr>
-      </w:pPr>
-    </w:p>
-    <w:p>
-      <w:pPr>
-        <w:rPr>
-          <w:rFonts w:hint="eastAsia" w:ascii="微软雅黑" w:hAnsi="微软雅黑" w:eastAsia="微软雅黑" w:cs="微软雅黑"/>
-          <w:color w:val="auto"/>
-          <w:sz w:val="24"/>
-          <w:szCs w:val="24"/>
-        </w:rPr>
-      </w:pPr>
-      <w:r>
-        <w:rPr>
-          <w:rFonts w:hint="eastAsia" w:ascii="微软雅黑" w:hAnsi="微软雅黑" w:eastAsia="微软雅黑" w:cs="微软雅黑"/>
-          <w:color w:val="auto"/>
-          <w:sz w:val="24"/>
-          <w:szCs w:val="24"/>
-        </w:rPr>
-        <w:t>这样用户能区分“验真失败”“链服务不可用”“未生成存证”等不同情况。</w:t>
-      </w:r>
-    </w:p>
-    <w:p>
-      <w:pPr>
-        <w:rPr>
-          <w:rFonts w:hint="eastAsia" w:ascii="微软雅黑" w:hAnsi="微软雅黑" w:eastAsia="微软雅黑" w:cs="微软雅黑"/>
-          <w:color w:val="auto"/>
-          <w:sz w:val="24"/>
-          <w:szCs w:val="24"/>
-        </w:rPr>
-      </w:pPr>
-    </w:p>
-    <w:p>
-      <w:pPr>
-        <w:rPr>
-          <w:rFonts w:hint="eastAsia" w:ascii="微软雅黑" w:hAnsi="微软雅黑" w:eastAsia="微软雅黑" w:cs="微软雅黑"/>
-          <w:color w:val="auto"/>
-          <w:sz w:val="24"/>
-          <w:szCs w:val="24"/>
-        </w:rPr>
-      </w:pPr>
-      <w:r>
-        <w:rPr>
-          <w:rFonts w:hint="eastAsia" w:ascii="微软雅黑" w:hAnsi="微软雅黑" w:eastAsia="微软雅黑" w:cs="微软雅黑"/>
-          <w:color w:val="auto"/>
-          <w:sz w:val="24"/>
-          <w:szCs w:val="24"/>
-        </w:rPr>
-        <w:t>----------------------------------------</w:t>
-      </w:r>
-    </w:p>
-    <w:p>
-      <w:pPr>
-        <w:rPr>
-          <w:rFonts w:hint="eastAsia" w:ascii="微软雅黑" w:hAnsi="微软雅黑" w:eastAsia="微软雅黑" w:cs="微软雅黑"/>
-          <w:color w:val="auto"/>
-          <w:sz w:val="24"/>
-          <w:szCs w:val="24"/>
-        </w:rPr>
-      </w:pPr>
-    </w:p>
-    <w:p>
-      <w:pPr>
-        <w:pStyle w:val="4"/>
-        <w:rPr>
-          <w:rFonts w:hint="eastAsia" w:ascii="微软雅黑" w:hAnsi="微软雅黑" w:eastAsia="微软雅黑" w:cs="微软雅黑"/>
-          <w:color w:val="auto"/>
-          <w:sz w:val="24"/>
-          <w:szCs w:val="24"/>
-        </w:rPr>
-      </w:pPr>
-      <w:r>
-        <w:rPr>
-          <w:rFonts w:hint="eastAsia" w:ascii="微软雅黑" w:hAnsi="微软雅黑" w:eastAsia="微软雅黑" w:cs="微软雅黑"/>
-          <w:color w:val="auto"/>
-          <w:sz w:val="24"/>
-          <w:szCs w:val="24"/>
-        </w:rPr>
-        <w:t>11. 版本记录</w:t>
-      </w:r>
-    </w:p>
-    <w:p>
-      <w:pPr>
-        <w:rPr>
-          <w:rFonts w:hint="eastAsia" w:ascii="微软雅黑" w:hAnsi="微软雅黑" w:eastAsia="微软雅黑" w:cs="微软雅黑"/>
-          <w:color w:val="auto"/>
-          <w:sz w:val="24"/>
-          <w:szCs w:val="24"/>
-        </w:rPr>
-      </w:pPr>
-    </w:p>
-    <w:p>
-      <w:pPr>
-        <w:pStyle w:val="16"/>
-        <w:rPr>
-          <w:rFonts w:hint="eastAsia" w:ascii="微软雅黑" w:hAnsi="微软雅黑" w:eastAsia="微软雅黑" w:cs="微软雅黑"/>
-          <w:color w:val="auto"/>
-          <w:sz w:val="24"/>
-          <w:szCs w:val="24"/>
-        </w:rPr>
-      </w:pPr>
-      <w:r>
-        <w:rPr>
-          <w:rFonts w:hint="eastAsia" w:ascii="微软雅黑" w:hAnsi="微软雅黑" w:eastAsia="微软雅黑" w:cs="微软雅黑"/>
-          <w:color w:val="auto"/>
-          <w:sz w:val="24"/>
-          <w:szCs w:val="24"/>
-        </w:rPr>
-        <w:t>v1.0（2026-05-08）：依据当前合约源码与后端适配实现整理。</w:t>
-      </w:r>
-    </w:p>
-    <w:p>
-      <w:pPr>
-        <w:rPr>
-          <w:rFonts w:hint="eastAsia" w:ascii="微软雅黑" w:hAnsi="微软雅黑" w:eastAsia="微软雅黑" w:cs="微软雅黑"/>
-          <w:color w:val="auto"/>
-          <w:sz w:val="24"/>
-          <w:szCs w:val="24"/>
-        </w:rPr>
-      </w:pPr>
     </w:p>
     <w:sectPr>
       <w:pgSz w:w="12240" w:h="15840"/>
@@ -7422,15 +7343,15 @@
     <w:lsdException w:uiPriority="99" w:name="table of authorities"/>
     <w:lsdException w:uiPriority="99" w:semiHidden="0" w:name="macro"/>
     <w:lsdException w:uiPriority="99" w:name="toa heading"/>
-    <w:lsdException w:uiPriority="99" w:semiHidden="0" w:name="List"/>
-    <w:lsdException w:uiPriority="99" w:semiHidden="0" w:name="List Bullet"/>
-    <w:lsdException w:uiPriority="99" w:semiHidden="0" w:name="List Number"/>
-    <w:lsdException w:uiPriority="99" w:semiHidden="0" w:name="List 2"/>
-    <w:lsdException w:uiPriority="99" w:semiHidden="0" w:name="List 3"/>
+    <w:lsdException w:qFormat="1" w:uiPriority="99" w:semiHidden="0" w:name="List"/>
+    <w:lsdException w:qFormat="1" w:uiPriority="99" w:semiHidden="0" w:name="List Bullet"/>
+    <w:lsdException w:qFormat="1" w:uiPriority="99" w:semiHidden="0" w:name="List Number"/>
+    <w:lsdException w:qFormat="1" w:uiPriority="99" w:semiHidden="0" w:name="List 2"/>
+    <w:lsdException w:qFormat="1" w:uiPriority="99" w:semiHidden="0" w:name="List 3"/>
     <w:lsdException w:uiPriority="99" w:name="List 4"/>
     <w:lsdException w:uiPriority="99" w:name="List 5"/>
-    <w:lsdException w:uiPriority="99" w:semiHidden="0" w:name="List Bullet 2"/>
-    <w:lsdException w:uiPriority="99" w:semiHidden="0" w:name="List Bullet 3"/>
+    <w:lsdException w:qFormat="1" w:uiPriority="99" w:semiHidden="0" w:name="List Bullet 2"/>
+    <w:lsdException w:qFormat="1" w:uiPriority="99" w:semiHidden="0" w:name="List Bullet 3"/>
     <w:lsdException w:uiPriority="99" w:name="List Bullet 4"/>
     <w:lsdException w:uiPriority="99" w:name="List Bullet 5"/>
     <w:lsdException w:uiPriority="99" w:semiHidden="0" w:name="List Number 2"/>
@@ -7440,12 +7361,12 @@
     <w:lsdException w:qFormat="1" w:unhideWhenUsed="0" w:uiPriority="10" w:semiHidden="0" w:name="Title"/>
     <w:lsdException w:uiPriority="99" w:name="Closing"/>
     <w:lsdException w:uiPriority="99" w:name="Signature"/>
-    <w:lsdException w:uiPriority="1" w:name="Default Paragraph Font"/>
+    <w:lsdException w:qFormat="1" w:uiPriority="1" w:name="Default Paragraph Font"/>
     <w:lsdException w:uiPriority="99" w:semiHidden="0" w:name="Body Text"/>
     <w:lsdException w:uiPriority="99" w:name="Body Text Indent"/>
-    <w:lsdException w:uiPriority="99" w:semiHidden="0" w:name="List Continue"/>
+    <w:lsdException w:qFormat="1" w:uiPriority="99" w:semiHidden="0" w:name="List Continue"/>
     <w:lsdException w:uiPriority="99" w:semiHidden="0" w:name="List Continue 2"/>
-    <w:lsdException w:uiPriority="99" w:semiHidden="0" w:name="List Continue 3"/>
+    <w:lsdException w:qFormat="1" w:uiPriority="99" w:semiHidden="0" w:name="List Continue 3"/>
     <w:lsdException w:uiPriority="99" w:name="List Continue 4"/>
     <w:lsdException w:uiPriority="99" w:name="List Continue 5"/>
     <w:lsdException w:uiPriority="99" w:name="Message Header"/>
@@ -7455,8 +7376,8 @@
     <w:lsdException w:uiPriority="99" w:name="Body Text First Indent"/>
     <w:lsdException w:uiPriority="99" w:name="Body Text First Indent 2"/>
     <w:lsdException w:uiPriority="99" w:name="Note Heading"/>
-    <w:lsdException w:uiPriority="99" w:semiHidden="0" w:name="Body Text 2"/>
-    <w:lsdException w:uiPriority="99" w:semiHidden="0" w:name="Body Text 3"/>
+    <w:lsdException w:qFormat="1" w:uiPriority="99" w:semiHidden="0" w:name="Body Text 2"/>
+    <w:lsdException w:qFormat="1" w:uiPriority="99" w:semiHidden="0" w:name="Body Text 3"/>
     <w:lsdException w:uiPriority="99" w:name="Body Text Indent 2"/>
     <w:lsdException w:uiPriority="99" w:name="Body Text Indent 3"/>
     <w:lsdException w:uiPriority="99" w:name="Block Text"/>
@@ -7478,7 +7399,7 @@
     <w:lsdException w:uiPriority="99" w:name="HTML Sample"/>
     <w:lsdException w:uiPriority="99" w:name="HTML Typewriter"/>
     <w:lsdException w:uiPriority="99" w:name="HTML Variable"/>
-    <w:lsdException w:uiPriority="99" w:name="Normal Table"/>
+    <w:lsdException w:qFormat="1" w:uiPriority="99" w:name="Normal Table"/>
     <w:lsdException w:uiPriority="99" w:name="annotation subject"/>
     <w:lsdException w:uiPriority="99" w:name="Table Simple 1"/>
     <w:lsdException w:uiPriority="99" w:name="Table Simple 2"/>
@@ -7531,14 +7452,14 @@
     <w:lsdException w:qFormat="1" w:unhideWhenUsed="0" w:uiPriority="62" w:semiHidden="0" w:name="Light Grid"/>
     <w:lsdException w:qFormat="1" w:unhideWhenUsed="0" w:uiPriority="63" w:semiHidden="0" w:name="Medium Shading 1"/>
     <w:lsdException w:qFormat="1" w:unhideWhenUsed="0" w:uiPriority="64" w:semiHidden="0" w:name="Medium Shading 2"/>
-    <w:lsdException w:unhideWhenUsed="0" w:uiPriority="65" w:semiHidden="0" w:name="Medium List 1"/>
+    <w:lsdException w:qFormat="1" w:unhideWhenUsed="0" w:uiPriority="65" w:semiHidden="0" w:name="Medium List 1"/>
     <w:lsdException w:qFormat="1" w:unhideWhenUsed="0" w:uiPriority="66" w:semiHidden="0" w:name="Medium List 2"/>
     <w:lsdException w:qFormat="1" w:unhideWhenUsed="0" w:uiPriority="67" w:semiHidden="0" w:name="Medium Grid 1"/>
-    <w:lsdException w:unhideWhenUsed="0" w:uiPriority="68" w:semiHidden="0" w:name="Medium Grid 2"/>
+    <w:lsdException w:qFormat="1" w:unhideWhenUsed="0" w:uiPriority="68" w:semiHidden="0" w:name="Medium Grid 2"/>
     <w:lsdException w:unhideWhenUsed="0" w:uiPriority="69" w:semiHidden="0" w:name="Medium Grid 3"/>
-    <w:lsdException w:unhideWhenUsed="0" w:uiPriority="70" w:semiHidden="0" w:name="Dark List"/>
-    <w:lsdException w:unhideWhenUsed="0" w:uiPriority="71" w:semiHidden="0" w:name="Colorful Shading"/>
-    <w:lsdException w:unhideWhenUsed="0" w:uiPriority="72" w:semiHidden="0" w:name="Colorful List"/>
+    <w:lsdException w:qFormat="1" w:unhideWhenUsed="0" w:uiPriority="70" w:semiHidden="0" w:name="Dark List"/>
+    <w:lsdException w:qFormat="1" w:unhideWhenUsed="0" w:uiPriority="71" w:semiHidden="0" w:name="Colorful Shading"/>
+    <w:lsdException w:qFormat="1" w:unhideWhenUsed="0" w:uiPriority="72" w:semiHidden="0" w:name="Colorful List"/>
     <w:lsdException w:unhideWhenUsed="0" w:uiPriority="73" w:semiHidden="0" w:name="Colorful Grid"/>
     <w:lsdException w:qFormat="1" w:unhideWhenUsed="0" w:uiPriority="60" w:semiHidden="0" w:name="Light Shading Accent 1"/>
     <w:lsdException w:qFormat="1" w:unhideWhenUsed="0" w:uiPriority="61" w:semiHidden="0" w:name="Light List Accent 1"/>
@@ -7552,9 +7473,9 @@
     <w:lsdException w:qFormat="1" w:unhideWhenUsed="0" w:uiPriority="66" w:semiHidden="0" w:name="Medium List 2 Accent 1"/>
     <w:lsdException w:qFormat="1" w:unhideWhenUsed="0" w:uiPriority="67" w:semiHidden="0" w:name="Medium Grid 1 Accent 1"/>
     <w:lsdException w:qFormat="1" w:unhideWhenUsed="0" w:uiPriority="68" w:semiHidden="0" w:name="Medium Grid 2 Accent 1"/>
-    <w:lsdException w:unhideWhenUsed="0" w:uiPriority="69" w:semiHidden="0" w:name="Medium Grid 3 Accent 1"/>
-    <w:lsdException w:unhideWhenUsed="0" w:uiPriority="70" w:semiHidden="0" w:name="Dark List Accent 1"/>
-    <w:lsdException w:unhideWhenUsed="0" w:uiPriority="71" w:semiHidden="0" w:name="Colorful Shading Accent 1"/>
+    <w:lsdException w:qFormat="1" w:unhideWhenUsed="0" w:uiPriority="69" w:semiHidden="0" w:name="Medium Grid 3 Accent 1"/>
+    <w:lsdException w:qFormat="1" w:unhideWhenUsed="0" w:uiPriority="70" w:semiHidden="0" w:name="Dark List Accent 1"/>
+    <w:lsdException w:qFormat="1" w:unhideWhenUsed="0" w:uiPriority="71" w:semiHidden="0" w:name="Colorful Shading Accent 1"/>
     <w:lsdException w:unhideWhenUsed="0" w:uiPriority="72" w:semiHidden="0" w:name="Colorful List Accent 1"/>
     <w:lsdException w:unhideWhenUsed="0" w:uiPriority="73" w:semiHidden="0" w:name="Colorful Grid Accent 1"/>
     <w:lsdException w:qFormat="1" w:unhideWhenUsed="0" w:uiPriority="60" w:semiHidden="0" w:name="Light Shading Accent 2"/>
@@ -7566,11 +7487,11 @@
     <w:lsdException w:qFormat="1" w:unhideWhenUsed="0" w:uiPriority="66" w:semiHidden="0" w:name="Medium List 2 Accent 2"/>
     <w:lsdException w:qFormat="1" w:unhideWhenUsed="0" w:uiPriority="67" w:semiHidden="0" w:name="Medium Grid 1 Accent 2"/>
     <w:lsdException w:qFormat="1" w:unhideWhenUsed="0" w:uiPriority="68" w:semiHidden="0" w:name="Medium Grid 2 Accent 2"/>
-    <w:lsdException w:unhideWhenUsed="0" w:uiPriority="69" w:semiHidden="0" w:name="Medium Grid 3 Accent 2"/>
+    <w:lsdException w:qFormat="1" w:unhideWhenUsed="0" w:uiPriority="69" w:semiHidden="0" w:name="Medium Grid 3 Accent 2"/>
     <w:lsdException w:unhideWhenUsed="0" w:uiPriority="70" w:semiHidden="0" w:name="Dark List Accent 2"/>
     <w:lsdException w:unhideWhenUsed="0" w:uiPriority="71" w:semiHidden="0" w:name="Colorful Shading Accent 2"/>
     <w:lsdException w:unhideWhenUsed="0" w:uiPriority="72" w:semiHidden="0" w:name="Colorful List Accent 2"/>
-    <w:lsdException w:unhideWhenUsed="0" w:uiPriority="73" w:semiHidden="0" w:name="Colorful Grid Accent 2"/>
+    <w:lsdException w:qFormat="1" w:unhideWhenUsed="0" w:uiPriority="73" w:semiHidden="0" w:name="Colorful Grid Accent 2"/>
     <w:lsdException w:qFormat="1" w:unhideWhenUsed="0" w:uiPriority="60" w:semiHidden="0" w:name="Light Shading Accent 3"/>
     <w:lsdException w:unhideWhenUsed="0" w:uiPriority="61" w:semiHidden="0" w:name="Light List Accent 3"/>
     <w:lsdException w:qFormat="1" w:unhideWhenUsed="0" w:uiPriority="62" w:semiHidden="0" w:name="Light Grid Accent 3"/>
@@ -7579,12 +7500,12 @@
     <w:lsdException w:qFormat="1" w:unhideWhenUsed="0" w:uiPriority="65" w:semiHidden="0" w:name="Medium List 1 Accent 3"/>
     <w:lsdException w:qFormat="1" w:unhideWhenUsed="0" w:uiPriority="66" w:semiHidden="0" w:name="Medium List 2 Accent 3"/>
     <w:lsdException w:qFormat="1" w:unhideWhenUsed="0" w:uiPriority="67" w:semiHidden="0" w:name="Medium Grid 1 Accent 3"/>
-    <w:lsdException w:unhideWhenUsed="0" w:uiPriority="68" w:semiHidden="0" w:name="Medium Grid 2 Accent 3"/>
-    <w:lsdException w:unhideWhenUsed="0" w:uiPriority="69" w:semiHidden="0" w:name="Medium Grid 3 Accent 3"/>
+    <w:lsdException w:qFormat="1" w:unhideWhenUsed="0" w:uiPriority="68" w:semiHidden="0" w:name="Medium Grid 2 Accent 3"/>
+    <w:lsdException w:qFormat="1" w:unhideWhenUsed="0" w:uiPriority="69" w:semiHidden="0" w:name="Medium Grid 3 Accent 3"/>
     <w:lsdException w:unhideWhenUsed="0" w:uiPriority="70" w:semiHidden="0" w:name="Dark List Accent 3"/>
     <w:lsdException w:unhideWhenUsed="0" w:uiPriority="71" w:semiHidden="0" w:name="Colorful Shading Accent 3"/>
     <w:lsdException w:unhideWhenUsed="0" w:uiPriority="72" w:semiHidden="0" w:name="Colorful List Accent 3"/>
-    <w:lsdException w:unhideWhenUsed="0" w:uiPriority="73" w:semiHidden="0" w:name="Colorful Grid Accent 3"/>
+    <w:lsdException w:qFormat="1" w:unhideWhenUsed="0" w:uiPriority="73" w:semiHidden="0" w:name="Colorful Grid Accent 3"/>
     <w:lsdException w:qFormat="1" w:unhideWhenUsed="0" w:uiPriority="60" w:semiHidden="0" w:name="Light Shading Accent 4"/>
     <w:lsdException w:qFormat="1" w:unhideWhenUsed="0" w:uiPriority="61" w:semiHidden="0" w:name="Light List Accent 4"/>
     <w:lsdException w:qFormat="1" w:unhideWhenUsed="0" w:uiPriority="62" w:semiHidden="0" w:name="Light Grid Accent 4"/>
@@ -7594,10 +7515,10 @@
     <w:lsdException w:qFormat="1" w:unhideWhenUsed="0" w:uiPriority="66" w:semiHidden="0" w:name="Medium List 2 Accent 4"/>
     <w:lsdException w:qFormat="1" w:unhideWhenUsed="0" w:uiPriority="67" w:semiHidden="0" w:name="Medium Grid 1 Accent 4"/>
     <w:lsdException w:unhideWhenUsed="0" w:uiPriority="68" w:semiHidden="0" w:name="Medium Grid 2 Accent 4"/>
-    <w:lsdException w:unhideWhenUsed="0" w:uiPriority="69" w:semiHidden="0" w:name="Medium Grid 3 Accent 4"/>
-    <w:lsdException w:unhideWhenUsed="0" w:uiPriority="70" w:semiHidden="0" w:name="Dark List Accent 4"/>
-    <w:lsdException w:unhideWhenUsed="0" w:uiPriority="71" w:semiHidden="0" w:name="Colorful Shading Accent 4"/>
-    <w:lsdException w:unhideWhenUsed="0" w:uiPriority="72" w:semiHidden="0" w:name="Colorful List Accent 4"/>
+    <w:lsdException w:qFormat="1" w:unhideWhenUsed="0" w:uiPriority="69" w:semiHidden="0" w:name="Medium Grid 3 Accent 4"/>
+    <w:lsdException w:qFormat="1" w:unhideWhenUsed="0" w:uiPriority="70" w:semiHidden="0" w:name="Dark List Accent 4"/>
+    <w:lsdException w:qFormat="1" w:unhideWhenUsed="0" w:uiPriority="71" w:semiHidden="0" w:name="Colorful Shading Accent 4"/>
+    <w:lsdException w:qFormat="1" w:unhideWhenUsed="0" w:uiPriority="72" w:semiHidden="0" w:name="Colorful List Accent 4"/>
     <w:lsdException w:unhideWhenUsed="0" w:uiPriority="73" w:semiHidden="0" w:name="Colorful Grid Accent 4"/>
     <w:lsdException w:qFormat="1" w:unhideWhenUsed="0" w:uiPriority="60" w:semiHidden="0" w:name="Light Shading Accent 5"/>
     <w:lsdException w:qFormat="1" w:unhideWhenUsed="0" w:uiPriority="61" w:semiHidden="0" w:name="Light List Accent 5"/>
@@ -7608,11 +7529,11 @@
     <w:lsdException w:qFormat="1" w:unhideWhenUsed="0" w:uiPriority="66" w:semiHidden="0" w:name="Medium List 2 Accent 5"/>
     <w:lsdException w:unhideWhenUsed="0" w:uiPriority="67" w:semiHidden="0" w:name="Medium Grid 1 Accent 5"/>
     <w:lsdException w:qFormat="1" w:unhideWhenUsed="0" w:uiPriority="68" w:semiHidden="0" w:name="Medium Grid 2 Accent 5"/>
-    <w:lsdException w:unhideWhenUsed="0" w:uiPriority="69" w:semiHidden="0" w:name="Medium Grid 3 Accent 5"/>
+    <w:lsdException w:qFormat="1" w:unhideWhenUsed="0" w:uiPriority="69" w:semiHidden="0" w:name="Medium Grid 3 Accent 5"/>
     <w:lsdException w:unhideWhenUsed="0" w:uiPriority="70" w:semiHidden="0" w:name="Dark List Accent 5"/>
-    <w:lsdException w:unhideWhenUsed="0" w:uiPriority="71" w:semiHidden="0" w:name="Colorful Shading Accent 5"/>
-    <w:lsdException w:unhideWhenUsed="0" w:uiPriority="72" w:semiHidden="0" w:name="Colorful List Accent 5"/>
-    <w:lsdException w:unhideWhenUsed="0" w:uiPriority="73" w:semiHidden="0" w:name="Colorful Grid Accent 5"/>
+    <w:lsdException w:qFormat="1" w:unhideWhenUsed="0" w:uiPriority="71" w:semiHidden="0" w:name="Colorful Shading Accent 5"/>
+    <w:lsdException w:qFormat="1" w:unhideWhenUsed="0" w:uiPriority="72" w:semiHidden="0" w:name="Colorful List Accent 5"/>
+    <w:lsdException w:qFormat="1" w:unhideWhenUsed="0" w:uiPriority="73" w:semiHidden="0" w:name="Colorful Grid Accent 5"/>
     <w:lsdException w:qFormat="1" w:unhideWhenUsed="0" w:uiPriority="60" w:semiHidden="0" w:name="Light Shading Accent 6"/>
     <w:lsdException w:qFormat="1" w:unhideWhenUsed="0" w:uiPriority="61" w:semiHidden="0" w:name="Light List Accent 6"/>
     <w:lsdException w:qFormat="1" w:unhideWhenUsed="0" w:uiPriority="62" w:semiHidden="0" w:name="Light Grid Accent 6"/>
@@ -7624,8 +7545,8 @@
     <w:lsdException w:unhideWhenUsed="0" w:uiPriority="68" w:semiHidden="0" w:name="Medium Grid 2 Accent 6"/>
     <w:lsdException w:unhideWhenUsed="0" w:uiPriority="69" w:semiHidden="0" w:name="Medium Grid 3 Accent 6"/>
     <w:lsdException w:unhideWhenUsed="0" w:uiPriority="70" w:semiHidden="0" w:name="Dark List Accent 6"/>
-    <w:lsdException w:unhideWhenUsed="0" w:uiPriority="71" w:semiHidden="0" w:name="Colorful Shading Accent 6"/>
-    <w:lsdException w:unhideWhenUsed="0" w:uiPriority="72" w:semiHidden="0" w:name="Colorful List Accent 6"/>
+    <w:lsdException w:qFormat="1" w:unhideWhenUsed="0" w:uiPriority="71" w:semiHidden="0" w:name="Colorful Shading Accent 6"/>
+    <w:lsdException w:qFormat="1" w:unhideWhenUsed="0" w:uiPriority="72" w:semiHidden="0" w:name="Colorful List Accent 6"/>
     <w:lsdException w:unhideWhenUsed="0" w:uiPriority="73" w:semiHidden="0" w:name="Colorful Grid Accent 6"/>
   </w:latentStyles>
   <w:style w:type="paragraph" w:default="1" w:styleId="1">
@@ -7882,12 +7803,14 @@
     <w:name w:val="Default Paragraph Font"/>
     <w:semiHidden/>
     <w:unhideWhenUsed/>
+    <w:qFormat/>
     <w:uiPriority w:val="1"/>
   </w:style>
   <w:style w:type="table" w:default="1" w:styleId="32">
     <w:name w:val="Normal Table"/>
     <w:semiHidden/>
     <w:unhideWhenUsed/>
+    <w:qFormat/>
     <w:uiPriority w:val="99"/>
     <w:tblPr>
       <w:tblCellMar>
@@ -7926,6 +7849,7 @@
     <w:name w:val="List 3"/>
     <w:basedOn w:val="1"/>
     <w:unhideWhenUsed/>
+    <w:qFormat/>
     <w:uiPriority w:val="99"/>
     <w:pPr>
       <w:ind w:left="1080" w:hanging="360"/>
@@ -7949,6 +7873,7 @@
     <w:name w:val="List Number"/>
     <w:basedOn w:val="1"/>
     <w:unhideWhenUsed/>
+    <w:qFormat/>
     <w:uiPriority w:val="99"/>
     <w:pPr>
       <w:numPr>
@@ -7986,6 +7911,7 @@
     <w:name w:val="List Bullet"/>
     <w:basedOn w:val="1"/>
     <w:unhideWhenUsed/>
+    <w:qFormat/>
     <w:uiPriority w:val="99"/>
     <w:pPr>
       <w:numPr>
@@ -8000,6 +7926,7 @@
     <w:basedOn w:val="1"/>
     <w:link w:val="146"/>
     <w:unhideWhenUsed/>
+    <w:qFormat/>
     <w:uiPriority w:val="99"/>
     <w:pPr>
       <w:spacing w:after="120"/>
@@ -8013,6 +7940,7 @@
     <w:name w:val="List Bullet 3"/>
     <w:basedOn w:val="1"/>
     <w:unhideWhenUsed/>
+    <w:qFormat/>
     <w:uiPriority w:val="99"/>
     <w:pPr>
       <w:numPr>
@@ -8049,6 +7977,7 @@
     <w:name w:val="List 2"/>
     <w:basedOn w:val="1"/>
     <w:unhideWhenUsed/>
+    <w:qFormat/>
     <w:uiPriority w:val="99"/>
     <w:pPr>
       <w:ind w:left="720" w:hanging="360"/>
@@ -8059,6 +7988,7 @@
     <w:name w:val="List Continue"/>
     <w:basedOn w:val="1"/>
     <w:unhideWhenUsed/>
+    <w:qFormat/>
     <w:uiPriority w:val="99"/>
     <w:pPr>
       <w:spacing w:after="120"/>
@@ -8070,6 +8000,7 @@
     <w:name w:val="List Bullet 2"/>
     <w:basedOn w:val="1"/>
     <w:unhideWhenUsed/>
+    <w:qFormat/>
     <w:uiPriority w:val="99"/>
     <w:pPr>
       <w:numPr>
@@ -8135,6 +8066,7 @@
     <w:name w:val="List"/>
     <w:basedOn w:val="1"/>
     <w:unhideWhenUsed/>
+    <w:qFormat/>
     <w:uiPriority w:val="99"/>
     <w:pPr>
       <w:ind w:left="360" w:hanging="360"/>
@@ -8146,6 +8078,7 @@
     <w:basedOn w:val="1"/>
     <w:link w:val="145"/>
     <w:unhideWhenUsed/>
+    <w:qFormat/>
     <w:uiPriority w:val="99"/>
     <w:pPr>
       <w:spacing w:after="120" w:line="480" w:lineRule="auto"/>
@@ -8166,6 +8099,7 @@
     <w:name w:val="List Continue 3"/>
     <w:basedOn w:val="1"/>
     <w:unhideWhenUsed/>
+    <w:qFormat/>
     <w:uiPriority w:val="99"/>
     <w:pPr>
       <w:spacing w:after="120"/>
@@ -12387,6 +12321,7 @@
   <w:style w:type="table" w:styleId="69">
     <w:name w:val="Medium List 1"/>
     <w:basedOn w:val="32"/>
+    <w:qFormat/>
     <w:uiPriority w:val="65"/>
     <w:pPr>
       <w:spacing w:after="0" w:line="240" w:lineRule="auto"/>
@@ -14422,6 +14357,7 @@
   <w:style w:type="table" w:styleId="90">
     <w:name w:val="Medium Grid 2"/>
     <w:basedOn w:val="32"/>
+    <w:qFormat/>
     <w:uiPriority w:val="68"/>
     <w:pPr>
       <w:spacing w:after="0" w:line="240" w:lineRule="auto"/>
@@ -14862,6 +14798,7 @@
   <w:style w:type="table" w:styleId="93">
     <w:name w:val="Medium Grid 2 Accent 3"/>
     <w:basedOn w:val="32"/>
+    <w:qFormat/>
     <w:uiPriority w:val="68"/>
     <w:pPr>
       <w:spacing w:after="0" w:line="240" w:lineRule="auto"/>
@@ -15604,6 +15541,7 @@
   <w:style w:type="table" w:styleId="98">
     <w:name w:val="Medium Grid 3 Accent 1"/>
     <w:basedOn w:val="32"/>
+    <w:qFormat/>
     <w:uiPriority w:val="69"/>
     <w:pPr>
       <w:spacing w:after="0" w:line="240" w:lineRule="auto"/>
@@ -15761,6 +15699,7 @@
   <w:style w:type="table" w:styleId="99">
     <w:name w:val="Medium Grid 3 Accent 2"/>
     <w:basedOn w:val="32"/>
+    <w:qFormat/>
     <w:uiPriority w:val="69"/>
     <w:pPr>
       <w:spacing w:after="0" w:line="240" w:lineRule="auto"/>
@@ -15918,6 +15857,7 @@
   <w:style w:type="table" w:styleId="100">
     <w:name w:val="Medium Grid 3 Accent 3"/>
     <w:basedOn w:val="32"/>
+    <w:qFormat/>
     <w:uiPriority w:val="69"/>
     <w:pPr>
       <w:spacing w:after="0" w:line="240" w:lineRule="auto"/>
@@ -16075,6 +16015,7 @@
   <w:style w:type="table" w:styleId="101">
     <w:name w:val="Medium Grid 3 Accent 4"/>
     <w:basedOn w:val="32"/>
+    <w:qFormat/>
     <w:uiPriority w:val="69"/>
     <w:pPr>
       <w:spacing w:after="0" w:line="240" w:lineRule="auto"/>
@@ -16232,6 +16173,7 @@
   <w:style w:type="table" w:styleId="102">
     <w:name w:val="Medium Grid 3 Accent 5"/>
     <w:basedOn w:val="32"/>
+    <w:qFormat/>
     <w:uiPriority w:val="69"/>
     <w:pPr>
       <w:spacing w:after="0" w:line="240" w:lineRule="auto"/>
@@ -16546,6 +16488,7 @@
   <w:style w:type="table" w:styleId="104">
     <w:name w:val="Dark List"/>
     <w:basedOn w:val="32"/>
+    <w:qFormat/>
     <w:uiPriority w:val="70"/>
     <w:pPr>
       <w:spacing w:after="0" w:line="240" w:lineRule="auto"/>
@@ -16661,6 +16604,7 @@
   <w:style w:type="table" w:styleId="105">
     <w:name w:val="Dark List Accent 1"/>
     <w:basedOn w:val="32"/>
+    <w:qFormat/>
     <w:uiPriority w:val="70"/>
     <w:pPr>
       <w:spacing w:after="0" w:line="240" w:lineRule="auto"/>
@@ -17006,6 +16950,7 @@
   <w:style w:type="table" w:styleId="108">
     <w:name w:val="Dark List Accent 4"/>
     <w:basedOn w:val="32"/>
+    <w:qFormat/>
     <w:uiPriority w:val="70"/>
     <w:pPr>
       <w:spacing w:after="0" w:line="240" w:lineRule="auto"/>
@@ -17351,6 +17296,7 @@
   <w:style w:type="table" w:styleId="111">
     <w:name w:val="Colorful Shading"/>
     <w:basedOn w:val="32"/>
+    <w:qFormat/>
     <w:uiPriority w:val="71"/>
     <w:pPr>
       <w:spacing w:after="0" w:line="240" w:lineRule="auto"/>
@@ -17499,6 +17445,7 @@
   <w:style w:type="table" w:styleId="112">
     <w:name w:val="Colorful Shading Accent 1"/>
     <w:basedOn w:val="32"/>
+    <w:qFormat/>
     <w:uiPriority w:val="71"/>
     <w:pPr>
       <w:spacing w:after="0" w:line="240" w:lineRule="auto"/>
@@ -17923,6 +17870,7 @@
   <w:style w:type="table" w:styleId="115">
     <w:name w:val="Colorful Shading Accent 4"/>
     <w:basedOn w:val="32"/>
+    <w:qFormat/>
     <w:uiPriority w:val="71"/>
     <w:pPr>
       <w:spacing w:after="0" w:line="240" w:lineRule="auto"/>
@@ -18071,6 +18019,7 @@
   <w:style w:type="table" w:styleId="116">
     <w:name w:val="Colorful Shading Accent 5"/>
     <w:basedOn w:val="32"/>
+    <w:qFormat/>
     <w:uiPriority w:val="71"/>
     <w:pPr>
       <w:spacing w:after="0" w:line="240" w:lineRule="auto"/>
@@ -18219,6 +18168,7 @@
   <w:style w:type="table" w:styleId="117">
     <w:name w:val="Colorful Shading Accent 6"/>
     <w:basedOn w:val="32"/>
+    <w:qFormat/>
     <w:uiPriority w:val="71"/>
     <w:pPr>
       <w:spacing w:after="0" w:line="240" w:lineRule="auto"/>
@@ -18367,6 +18317,7 @@
   <w:style w:type="table" w:styleId="118">
     <w:name w:val="Colorful List"/>
     <w:basedOn w:val="32"/>
+    <w:qFormat/>
     <w:uiPriority w:val="72"/>
     <w:pPr>
       <w:spacing w:after="0" w:line="240" w:lineRule="auto"/>
@@ -18735,6 +18686,7 @@
   <w:style w:type="table" w:styleId="122">
     <w:name w:val="Colorful List Accent 4"/>
     <w:basedOn w:val="32"/>
+    <w:qFormat/>
     <w:uiPriority w:val="72"/>
     <w:pPr>
       <w:spacing w:after="0" w:line="240" w:lineRule="auto"/>
@@ -18827,6 +18779,7 @@
   <w:style w:type="table" w:styleId="123">
     <w:name w:val="Colorful List Accent 5"/>
     <w:basedOn w:val="32"/>
+    <w:qFormat/>
     <w:uiPriority w:val="72"/>
     <w:pPr>
       <w:spacing w:after="0" w:line="240" w:lineRule="auto"/>
@@ -18919,6 +18872,7 @@
   <w:style w:type="table" w:styleId="124">
     <w:name w:val="Colorful List Accent 6"/>
     <w:basedOn w:val="32"/>
+    <w:qFormat/>
     <w:uiPriority w:val="72"/>
     <w:pPr>
       <w:spacing w:after="0" w:line="240" w:lineRule="auto"/>
@@ -19203,6 +19157,7 @@
   <w:style w:type="table" w:styleId="127">
     <w:name w:val="Colorful Grid Accent 2"/>
     <w:basedOn w:val="32"/>
+    <w:qFormat/>
     <w:uiPriority w:val="73"/>
     <w:pPr>
       <w:spacing w:after="0" w:line="240" w:lineRule="auto"/>
@@ -19299,6 +19254,7 @@
   <w:style w:type="table" w:styleId="128">
     <w:name w:val="Colorful Grid Accent 3"/>
     <w:basedOn w:val="32"/>
+    <w:qFormat/>
     <w:uiPriority w:val="73"/>
     <w:pPr>
       <w:spacing w:after="0" w:line="240" w:lineRule="auto"/>
@@ -19491,6 +19447,7 @@
   <w:style w:type="table" w:styleId="130">
     <w:name w:val="Colorful Grid Accent 5"/>
     <w:basedOn w:val="32"/>
+    <w:qFormat/>
     <w:uiPriority w:val="73"/>
     <w:pPr>
       <w:spacing w:after="0" w:line="240" w:lineRule="auto"/>
@@ -19732,6 +19689,7 @@
     <w:name w:val="Heading 1 Char"/>
     <w:basedOn w:val="132"/>
     <w:link w:val="3"/>
+    <w:qFormat/>
     <w:uiPriority w:val="9"/>
     <w:rPr>
       <w:rFonts w:asciiTheme="majorHAnsi" w:hAnsiTheme="majorHAnsi" w:eastAsiaTheme="majorEastAsia" w:cstheme="majorBidi"/>
@@ -19746,6 +19704,7 @@
     <w:name w:val="Heading 2 Char"/>
     <w:basedOn w:val="132"/>
     <w:link w:val="4"/>
+    <w:qFormat/>
     <w:uiPriority w:val="9"/>
     <w:rPr>
       <w:rFonts w:asciiTheme="majorHAnsi" w:hAnsiTheme="majorHAnsi" w:eastAsiaTheme="majorEastAsia" w:cstheme="majorBidi"/>
@@ -19832,12 +19791,14 @@
     <w:name w:val="Body Text 2 Char"/>
     <w:basedOn w:val="132"/>
     <w:link w:val="28"/>
+    <w:qFormat/>
     <w:uiPriority w:val="99"/>
   </w:style>
   <w:style w:type="character" w:customStyle="1" w:styleId="146">
     <w:name w:val="Body Text 3 Char"/>
     <w:basedOn w:val="132"/>
     <w:link w:val="17"/>
+    <w:qFormat/>
     <w:uiPriority w:val="99"/>
     <w:rPr>
       <w:sz w:val="16"/>
@@ -19877,6 +19838,7 @@
     <w:name w:val="Quote Char"/>
     <w:basedOn w:val="132"/>
     <w:link w:val="148"/>
+    <w:qFormat/>
     <w:uiPriority w:val="29"/>
     <w:rPr>
       <w:i/>
@@ -19894,6 +19856,7 @@
     <w:basedOn w:val="132"/>
     <w:link w:val="6"/>
     <w:semiHidden/>
+    <w:qFormat/>
     <w:uiPriority w:val="9"/>
     <w:rPr>
       <w:rFonts w:asciiTheme="majorHAnsi" w:hAnsiTheme="majorHAnsi" w:eastAsiaTheme="majorEastAsia" w:cstheme="majorBidi"/>
@@ -19914,6 +19877,7 @@
     <w:basedOn w:val="132"/>
     <w:link w:val="7"/>
     <w:semiHidden/>
+    <w:qFormat/>
     <w:uiPriority w:val="9"/>
     <w:rPr>
       <w:rFonts w:asciiTheme="majorHAnsi" w:hAnsiTheme="majorHAnsi" w:eastAsiaTheme="majorEastAsia" w:cstheme="majorBidi"/>
@@ -19925,6 +19889,7 @@
     <w:basedOn w:val="132"/>
     <w:link w:val="8"/>
     <w:semiHidden/>
+    <w:qFormat/>
     <w:uiPriority w:val="9"/>
     <w:rPr>
       <w:rFonts w:asciiTheme="majorHAnsi" w:hAnsiTheme="majorHAnsi" w:eastAsiaTheme="majorEastAsia" w:cstheme="majorBidi"/>
@@ -19938,6 +19903,7 @@
     <w:basedOn w:val="132"/>
     <w:link w:val="9"/>
     <w:semiHidden/>
+    <w:qFormat/>
     <w:uiPriority w:val="9"/>
     <w:rPr>
       <w:rFonts w:asciiTheme="majorHAnsi" w:hAnsiTheme="majorHAnsi" w:eastAsiaTheme="majorEastAsia" w:cstheme="majorBidi"/>
@@ -19959,6 +19925,7 @@
     <w:basedOn w:val="132"/>
     <w:link w:val="10"/>
     <w:semiHidden/>
+    <w:qFormat/>
     <w:uiPriority w:val="9"/>
     <w:rPr>
       <w:rFonts w:asciiTheme="majorHAnsi" w:hAnsiTheme="majorHAnsi" w:eastAsiaTheme="majorEastAsia" w:cstheme="majorBidi"/>

</xml_diff>